<commit_message>
docs: complete report B aggregation flow and trustee validation evidence
</commit_message>
<xml_diff>
--- a/reports/成员B_同态汇总与受控解密模块_报告.docx
+++ b/reports/成员B_同态汇总与受控解密模块_报告.docx
@@ -187,7 +187,7 @@
         <w:tabs>
           <w:tab w:val="left" w:pos="6870"/>
         </w:tabs>
-        <w:ind w:firstLine="1078" w:firstLineChars="245"/>
+        <w:ind w:firstLine="0" w:left="1080"/>
         <w:rPr>
           <w:sz w:val="44"/>
           <w:szCs w:val="44"/>
@@ -196,14 +196,18 @@
       </w:pPr>
       <w:r>
         <w:rPr>
-          <w:rFonts w:hint="eastAsia" w:ascii="黑体" w:eastAsia="黑体"/>
+          <w:rFonts w:hint="eastAsia" w:ascii="黑体" w:eastAsia="黑体" w:hAnsi="黑体"/>
+          <w:b w:val="0"/>
+          <w:color w:val="000000"/>
           <w:sz w:val="44"/>
         </w:rPr>
         <w:t>题   目：基于同态加密的</w:t>
       </w:r>
       <w:r>
         <w:rPr>
-          <w:rFonts w:hint="eastAsia"/>
+          <w:rFonts w:hint="eastAsia" w:ascii="黑体" w:hAnsi="黑体" w:eastAsia="黑体"/>
+          <w:b w:val="0"/>
+          <w:color w:val="000000"/>
           <w:sz w:val="44"/>
           <w:szCs w:val="44"/>
           <w:u w:val="single"/>
@@ -211,6 +215,9 @@
       </w:r>
       <w:r>
         <w:rPr>
+          <w:rFonts w:ascii="黑体" w:hAnsi="黑体" w:eastAsia="黑体"/>
+          <w:b w:val="0"/>
+          <w:color w:val="000000"/>
           <w:sz w:val="44"/>
           <w:szCs w:val="44"/>
           <w:u w:val="single"/>
@@ -218,7 +225,9 @@
       </w:r>
       <w:r>
         <w:rPr>
-          <w:rFonts w:hint="eastAsia"/>
+          <w:rFonts w:hint="eastAsia" w:ascii="黑体" w:hAnsi="黑体" w:eastAsia="黑体"/>
+          <w:b w:val="0"/>
+          <w:color w:val="000000"/>
           <w:sz w:val="44"/>
           <w:szCs w:val="44"/>
           <w:u w:val="single"/>
@@ -230,7 +239,7 @@
         <w:tabs>
           <w:tab w:val="left" w:pos="6870"/>
         </w:tabs>
-        <w:ind w:firstLine="1078" w:firstLineChars="245"/>
+        <w:ind w:firstLine="0" w:left="3060"/>
         <w:rPr>
           <w:sz w:val="44"/>
           <w:szCs w:val="44"/>
@@ -239,7 +248,9 @@
       </w:pPr>
       <w:r>
         <w:rPr>
-          <w:rFonts w:hint="eastAsia"/>
+          <w:rFonts w:hint="eastAsia" w:ascii="黑体" w:hAnsi="黑体" w:eastAsia="黑体"/>
+          <w:b w:val="0"/>
+          <w:color w:val="000000"/>
           <w:sz w:val="44"/>
           <w:szCs w:val="44"/>
         </w:rPr>
@@ -247,7 +258,9 @@
       </w:r>
       <w:r>
         <w:rPr>
-          <w:rFonts w:hint="eastAsia"/>
+          <w:rFonts w:hint="eastAsia" w:ascii="黑体" w:hAnsi="黑体" w:eastAsia="黑体"/>
+          <w:b w:val="0"/>
+          <w:color w:val="000000"/>
           <w:sz w:val="44"/>
           <w:szCs w:val="44"/>
           <w:u w:val="single"/>
@@ -255,6 +268,9 @@
       </w:r>
       <w:r>
         <w:rPr>
+          <w:rFonts w:ascii="黑体" w:hAnsi="黑体" w:eastAsia="黑体"/>
+          <w:b w:val="0"/>
+          <w:color w:val="000000"/>
           <w:sz w:val="44"/>
           <w:szCs w:val="44"/>
           <w:u w:val="single"/>
@@ -262,7 +278,9 @@
       </w:r>
       <w:r>
         <w:rPr>
-          <w:rFonts w:hint="eastAsia"/>
+          <w:rFonts w:hint="eastAsia" w:ascii="黑体" w:hAnsi="黑体" w:eastAsia="黑体"/>
+          <w:b w:val="0"/>
+          <w:color w:val="000000"/>
           <w:sz w:val="44"/>
           <w:szCs w:val="44"/>
           <w:u w:val="single"/>
@@ -450,10 +468,10 @@
             </w:pPr>
             <w:r>
               <w:rPr>
-                <w:rFonts w:ascii="宋体" w:hAnsi="宋体" w:eastAsia="宋体"/>
+                <w:rFonts w:ascii="Times New Roman" w:hAnsi="Times New Roman" w:eastAsia="宋体"/>
                 <w:b w:val="0"/>
                 <w:color w:val="000000"/>
-                <w:sz w:val="24"/>
+                <w:sz w:val="30"/>
               </w:rPr>
               <w:t>成员B  姓名：________</w:t>
             </w:r>
@@ -522,10 +540,10 @@
             </w:pPr>
             <w:r>
               <w:rPr>
-                <w:rFonts w:ascii="宋体" w:hAnsi="宋体" w:eastAsia="宋体"/>
+                <w:rFonts w:ascii="Times New Roman" w:hAnsi="Times New Roman" w:eastAsia="宋体"/>
                 <w:b w:val="0"/>
                 <w:color w:val="000000"/>
-                <w:sz w:val="24"/>
+                <w:sz w:val="30"/>
               </w:rPr>
               <w:t>B230414  学号：________</w:t>
             </w:r>
@@ -738,67 +756,67 @@
             </w:pPr>
             <w:r>
               <w:rPr>
-                <w:rFonts w:ascii="宋体" w:hAnsi="宋体" w:cs="Times New Roman" w:eastAsia="宋体"/>
+                <w:rFonts w:ascii="Times New Roman" w:hAnsi="Times New Roman" w:cs="Times New Roman" w:eastAsia="宋体"/>
                 <w:b w:val="0"/>
                 <w:color w:val="000000"/>
-                <w:sz w:val="24"/>
+                <w:sz w:val="30"/>
                 <w:szCs w:val="30"/>
               </w:rPr>
               <w:t>2026.10.26—2026.11.06</w:t>
             </w:r>
             <w:r>
               <w:rPr>
-                <w:rFonts w:hint="eastAsia" w:ascii="宋体" w:hAnsi="宋体" w:cs="Times New Roman" w:eastAsia="宋体"/>
+                <w:rFonts w:hint="eastAsia" w:ascii="Times New Roman" w:hAnsi="Times New Roman" w:cs="Times New Roman" w:eastAsia="宋体"/>
                 <w:b w:val="0"/>
                 <w:color w:val="000000"/>
-                <w:sz w:val="24"/>
+                <w:sz w:val="30"/>
                 <w:szCs w:val="30"/>
                 <w:lang w:val="en-US" w:eastAsia="zh-CN"/>
               </w:rPr>
             </w:r>
             <w:r>
               <w:rPr>
-                <w:rFonts w:ascii="宋体" w:hAnsi="宋体" w:cs="Times New Roman" w:eastAsia="宋体"/>
+                <w:rFonts w:ascii="Times New Roman" w:hAnsi="Times New Roman" w:cs="Times New Roman" w:eastAsia="宋体"/>
                 <w:b w:val="0"/>
                 <w:color w:val="000000"/>
-                <w:sz w:val="24"/>
+                <w:sz w:val="30"/>
                 <w:szCs w:val="30"/>
               </w:rPr>
             </w:r>
             <w:r>
               <w:rPr>
-                <w:rFonts w:hint="eastAsia" w:ascii="宋体" w:hAnsi="宋体" w:cs="Times New Roman" w:eastAsia="宋体"/>
+                <w:rFonts w:hint="eastAsia" w:ascii="Times New Roman" w:hAnsi="Times New Roman" w:cs="Times New Roman" w:eastAsia="宋体"/>
                 <w:b w:val="0"/>
                 <w:color w:val="000000"/>
-                <w:sz w:val="24"/>
+                <w:sz w:val="30"/>
                 <w:szCs w:val="30"/>
                 <w:lang w:val="en-US" w:eastAsia="zh-CN"/>
               </w:rPr>
             </w:r>
             <w:r>
               <w:rPr>
-                <w:rFonts w:ascii="宋体" w:hAnsi="宋体" w:cs="Times New Roman" w:eastAsia="宋体"/>
+                <w:rFonts w:ascii="Times New Roman" w:hAnsi="Times New Roman" w:cs="Times New Roman" w:eastAsia="宋体"/>
                 <w:b w:val="0"/>
                 <w:color w:val="000000"/>
-                <w:sz w:val="24"/>
+                <w:sz w:val="30"/>
                 <w:szCs w:val="30"/>
               </w:rPr>
             </w:r>
             <w:r>
               <w:rPr>
-                <w:rFonts w:hint="eastAsia" w:ascii="宋体" w:hAnsi="宋体" w:cs="Times New Roman" w:eastAsia="宋体"/>
+                <w:rFonts w:hint="eastAsia" w:ascii="Times New Roman" w:hAnsi="Times New Roman" w:cs="Times New Roman" w:eastAsia="宋体"/>
                 <w:b w:val="0"/>
                 <w:color w:val="000000"/>
-                <w:sz w:val="24"/>
+                <w:sz w:val="30"/>
                 <w:szCs w:val="30"/>
               </w:rPr>
             </w:r>
             <w:r>
               <w:rPr>
-                <w:rFonts w:ascii="宋体" w:hAnsi="宋体" w:cs="Times New Roman" w:eastAsia="宋体"/>
+                <w:rFonts w:ascii="Times New Roman" w:hAnsi="Times New Roman" w:cs="Times New Roman" w:eastAsia="宋体"/>
                 <w:b w:val="0"/>
                 <w:color w:val="000000"/>
-                <w:sz w:val="24"/>
+                <w:sz w:val="30"/>
                 <w:szCs w:val="30"/>
               </w:rPr>
             </w:r>
@@ -808,27 +826,14 @@
     </w:tbl>
     <w:p>
       <w:pPr>
-        <w:tabs>
-          <w:tab w:val="left" w:pos="6870"/>
-        </w:tabs>
-        <w:rPr>
-          <w:rFonts w:ascii="黑体" w:eastAsia="黑体"/>
-          <w:sz w:val="21"/>
-          <w:szCs w:val="21"/>
-        </w:rPr>
-      </w:pPr>
-    </w:p>
-    <w:p>
-      <w:pPr>
-        <w:tabs>
-          <w:tab w:val="left" w:pos="6870"/>
-        </w:tabs>
-        <w:rPr>
-          <w:rFonts w:ascii="黑体" w:eastAsia="黑体"/>
-          <w:sz w:val="21"/>
-          <w:szCs w:val="21"/>
-        </w:rPr>
-      </w:pPr>
+        <w:pageBreakBefore/>
+        <w:spacing w:after="0" w:before="0" w:line="20" w:lineRule="exact"/>
+      </w:pPr>
+      <w:r>
+        <w:rPr>
+          <w:sz w:val="2"/>
+        </w:rPr>
+      </w:r>
     </w:p>
     <w:tbl>
       <w:tblPr>
@@ -2146,154 +2151,193 @@
     </w:tbl>
     <w:p>
       <w:pPr>
+        <w:pStyle w:val="ReportTitle"/>
+        <w:pageBreakBefore/>
+      </w:pPr>
+      <w:r>
+        <w:rPr>
+          <w:rFonts w:ascii="Times New Roman" w:hAnsi="Times New Roman" w:eastAsia="宋体"/>
+          <w:b/>
+          <w:color w:val="000000"/>
+          <w:sz w:val="32"/>
+        </w:rPr>
+        <w:t>基于同态加密的隐私保护投票系统</w:t>
+      </w:r>
+    </w:p>
+    <w:p>
+      <w:pPr>
+        <w:pStyle w:val="ReportH2"/>
+        <w:spacing w:after="120"/>
+      </w:pPr>
+      <w:r>
+        <w:rPr>
+          <w:rFonts w:ascii="Times New Roman" w:hAnsi="Times New Roman" w:eastAsia="宋体"/>
+          <w:b/>
+          <w:color w:val="000000"/>
+          <w:sz w:val="24"/>
+        </w:rPr>
+        <w:t>成员B分工报告  同态汇总与受控解密模块</w:t>
+      </w:r>
+    </w:p>
+    <w:p>
+      <w:pPr>
+        <w:pStyle w:val="ReportH1"/>
+      </w:pPr>
+      <w:r>
+        <w:rPr>
+          <w:rFonts w:ascii="Times New Roman" w:hAnsi="Times New Roman" w:eastAsia="宋体"/>
+          <w:b/>
+          <w:color w:val="000000"/>
+          <w:sz w:val="28"/>
+        </w:rPr>
+        <w:t>一、课题内容和要求</w:t>
+      </w:r>
+    </w:p>
+    <w:p>
+      <w:pPr>
+        <w:pStyle w:val="ReportH2"/>
+      </w:pPr>
+      <w:r>
+        <w:rPr>
+          <w:rFonts w:ascii="Times New Roman" w:hAnsi="Times New Roman" w:eastAsia="宋体"/>
+          <w:b/>
+          <w:color w:val="000000"/>
+          <w:sz w:val="24"/>
+        </w:rPr>
+        <w:t>1.1 课题内容</w:t>
+      </w:r>
+    </w:p>
+    <w:p>
+      <w:pPr>
+        <w:pStyle w:val="ReportBody"/>
+      </w:pPr>
+      <w:r>
+        <w:rPr>
+          <w:rFonts w:ascii="Times New Roman" w:hAnsi="Times New Roman" w:eastAsia="宋体"/>
+          <w:b w:val="0"/>
+          <w:color w:val="000000"/>
+          <w:sz w:val="24"/>
+        </w:rPr>
+        <w:t>系统使用Paillier加法同态加密实现本地可视化投票。投票端生成加密选票，计票端只访问公开数据并汇总密文，独立解密进程在投票关闭后返回各选项总票数。额外实现投票关闭与Ed25519签名清单审计，检测已接收选票的删除和修改。</w:t>
+      </w:r>
+    </w:p>
+    <w:p>
+      <w:pPr>
+        <w:pStyle w:val="ReportBody"/>
+      </w:pPr>
+      <w:r>
+        <w:rPr>
+          <w:rFonts w:ascii="Times New Roman" w:hAnsi="Times New Roman" w:eastAsia="宋体"/>
+          <w:b w:val="0"/>
+          <w:color w:val="000000"/>
+          <w:sz w:val="24"/>
+        </w:rPr>
+        <w:t>在不解密单票的前提下汇总各选项密文，通过独立解密进程返回最终票数，并核对该请求确实来自当前完整且关闭的投票。重点是准确性、角色边界和性能解释。</w:t>
+      </w:r>
+    </w:p>
+    <w:p>
+      <w:pPr>
+        <w:pStyle w:val="ReportH2"/>
+      </w:pPr>
+      <w:r>
+        <w:rPr>
+          <w:rFonts w:ascii="Times New Roman" w:hAnsi="Times New Roman" w:eastAsia="宋体"/>
+          <w:b/>
+          <w:color w:val="000000"/>
+          <w:sz w:val="24"/>
+        </w:rPr>
+        <w:t>1.2 课题要求与本分工责任</w:t>
+      </w:r>
+    </w:p>
+    <w:p>
+      <w:pPr>
+        <w:pStyle w:val="ReportBody"/>
+      </w:pPr>
+      <w:r>
+        <w:rPr>
+          <w:rFonts w:ascii="Times New Roman" w:hAnsi="Times New Roman" w:eastAsia="宋体"/>
+          <w:b w:val="0"/>
+          <w:color w:val="000000"/>
+          <w:sz w:val="24"/>
+        </w:rPr>
+        <w:t>计票端只读取public目录并且不需要保管口令。开放状态禁止汇总查询；关闭后才允许计算结果。解密端独立检查签名清单，重新计算完整汇总，并核对轮次、清单摘要、密文向量和接收票数。结果必须满足各项票数不超过总票数且总和等于已接收人数。</w:t>
+      </w:r>
+    </w:p>
+    <w:p>
+      <w:pPr>
+        <w:pStyle w:val="ReportBody"/>
+      </w:pPr>
+      <w:r>
+        <w:rPr>
+          <w:rFonts w:ascii="Times New Roman" w:hAnsi="Times New Roman" w:eastAsia="宋体"/>
+          <w:b w:val="0"/>
+          <w:color w:val="000000"/>
+          <w:sz w:val="24"/>
+        </w:rPr>
+        <w:t>本报告对应的代码范围：tally_service.py；app_ui.py中的trustee_process；experiments.py中的准确性、零票、解密边界与性能实验。</w:t>
+      </w:r>
+    </w:p>
+    <w:p>
+      <w:pPr>
+        <w:pStyle w:val="ReportH1"/>
+      </w:pPr>
+      <w:r>
+        <w:rPr>
+          <w:rFonts w:ascii="Times New Roman" w:hAnsi="Times New Roman" w:eastAsia="宋体"/>
+          <w:b/>
+          <w:color w:val="000000"/>
+          <w:sz w:val="28"/>
+        </w:rPr>
+        <w:t>二、需求分析和总体设计</w:t>
+      </w:r>
+    </w:p>
+    <w:p>
+      <w:pPr>
+        <w:pStyle w:val="ReportH2"/>
+      </w:pPr>
+      <w:r>
+        <w:t>2.1 本课题的主要功能</w:t>
+      </w:r>
+    </w:p>
+    <w:p>
+      <w:pPr>
+        <w:pStyle w:val="ReportBody"/>
+      </w:pPr>
+      <w:r>
+        <w:t>计票模块只需公开配置、密文选票和签名清单，输出每个选项的密文乘积。保管端核验当前关闭状态及完整汇总后，使用私钥返回总票数。两端通过JSON请求关联轮次、清单摘要、密文向量与接收票数，结果须满足非负、单项上界和总和约束。</w:t>
+      </w:r>
+    </w:p>
+    <w:p>
+      <w:pPr>
+        <w:pStyle w:val="ReportH2"/>
+      </w:pPr>
+      <w:r>
+        <w:t>2.2 本课题的设计过程</w:t>
+      </w:r>
+    </w:p>
+    <w:p>
+      <w:pPr>
+        <w:pStyle w:val="ReportBody"/>
+      </w:pPr>
+      <w:r>
+        <w:t>选择按选项列进行模乘，避免逐票解密。累积元取1，因此空集合解密为0。为避免解密端成为任意密文查询服务，在加载私钥前独立审计和复算；对不完整或过期请求明确拒绝。耗时由复算端自身测量，不能由调用方提供负数或伪造值。</w:t>
+      </w:r>
+    </w:p>
+    <w:p>
+      <w:pPr>
+        <w:pStyle w:val="ReportH2"/>
+      </w:pPr>
+      <w:r>
+        <w:t>2.3 模块接口与分工</w:t>
+      </w:r>
+    </w:p>
+    <w:p>
+      <w:pPr>
+        <w:pStyle w:val="ReportCaption"/>
         <w:keepNext/>
-        <w:pageBreakBefore/>
-        <w:spacing w:line="300" w:lineRule="auto" w:after="160"/>
-      </w:pPr>
-      <w:r>
-        <w:rPr>
-          <w:rFonts w:ascii="宋体" w:hAnsi="宋体" w:eastAsia="宋体"/>
-          <w:b/>
-          <w:color w:val="000000"/>
-          <w:sz w:val="28"/>
-        </w:rPr>
-        <w:t>基于同态加密的隐私保护投票系统</w:t>
-      </w:r>
-    </w:p>
-    <w:p>
-      <w:pPr>
-        <w:spacing w:line="300" w:lineRule="auto" w:after="160"/>
-      </w:pPr>
-      <w:r>
-        <w:rPr>
-          <w:rFonts w:ascii="宋体" w:hAnsi="宋体" w:eastAsia="宋体"/>
-          <w:b/>
-          <w:color w:val="000000"/>
-          <w:sz w:val="24"/>
-        </w:rPr>
-        <w:t>成员B分工报告  同态汇总与受控解密模块</w:t>
-      </w:r>
-    </w:p>
-    <w:p>
-      <w:pPr>
-        <w:keepNext/>
-        <w:pageBreakBefore w:val="0"/>
-        <w:spacing w:line="300" w:lineRule="auto" w:after="160"/>
-      </w:pPr>
-      <w:r>
-        <w:rPr>
-          <w:rFonts w:ascii="宋体" w:hAnsi="宋体" w:eastAsia="宋体"/>
-          <w:b/>
-          <w:color w:val="000000"/>
-          <w:sz w:val="28"/>
-        </w:rPr>
-        <w:t>一 课题内容和要求</w:t>
-      </w:r>
-    </w:p>
-    <w:p>
-      <w:pPr>
-        <w:keepNext/>
-        <w:spacing w:line="300" w:lineRule="auto" w:after="100"/>
-      </w:pPr>
-      <w:r>
-        <w:rPr>
-          <w:rFonts w:ascii="宋体" w:hAnsi="宋体" w:eastAsia="宋体"/>
-          <w:b/>
-          <w:color w:val="000000"/>
-          <w:sz w:val="24"/>
-        </w:rPr>
-        <w:t>1.1 课题内容</w:t>
-      </w:r>
-    </w:p>
-    <w:p>
-      <w:pPr>
-        <w:spacing w:line="300" w:lineRule="auto" w:after="100"/>
-        <w:ind w:firstLine="480"/>
-      </w:pPr>
-      <w:r>
-        <w:rPr>
-          <w:rFonts w:ascii="宋体" w:hAnsi="宋体" w:eastAsia="宋体"/>
-          <w:b w:val="0"/>
-          <w:color w:val="000000"/>
-          <w:sz w:val="24"/>
-        </w:rPr>
-        <w:t>系统使用Paillier加法同态加密实现本地可视化投票。投票端生成加密选票，计票端只访问公开数据并汇总密文，独立解密进程在投票关闭后返回各选项总票数。额外实现投票关闭与Ed25519签名清单审计，检测已接收选票的删除和修改。</w:t>
-      </w:r>
-    </w:p>
-    <w:p>
-      <w:pPr>
-        <w:spacing w:line="300" w:lineRule="auto" w:after="100"/>
-        <w:ind w:firstLine="480"/>
-      </w:pPr>
-      <w:r>
-        <w:rPr>
-          <w:rFonts w:ascii="宋体" w:hAnsi="宋体" w:eastAsia="宋体"/>
-          <w:b w:val="0"/>
-          <w:color w:val="000000"/>
-          <w:sz w:val="24"/>
-        </w:rPr>
-        <w:t>在不解密单票的前提下汇总各选项密文，通过独立解密进程返回最终票数，并核对该请求确实来自当前完整且关闭的投票。重点是准确性、角色边界和性能解释。</w:t>
-      </w:r>
-    </w:p>
-    <w:p>
-      <w:pPr>
-        <w:keepNext/>
-        <w:spacing w:line="300" w:lineRule="auto" w:after="100"/>
-      </w:pPr>
-      <w:r>
-        <w:rPr>
-          <w:rFonts w:ascii="宋体" w:hAnsi="宋体" w:eastAsia="宋体"/>
-          <w:b/>
-          <w:color w:val="000000"/>
-          <w:sz w:val="24"/>
-        </w:rPr>
-        <w:t>1.2 课题要求与本分工责任</w:t>
-      </w:r>
-    </w:p>
-    <w:p>
-      <w:pPr>
-        <w:spacing w:line="300" w:lineRule="auto" w:after="100"/>
-        <w:ind w:firstLine="480"/>
-      </w:pPr>
-      <w:r>
-        <w:rPr>
-          <w:rFonts w:ascii="宋体" w:hAnsi="宋体" w:eastAsia="宋体"/>
-          <w:b w:val="0"/>
-          <w:color w:val="000000"/>
-          <w:sz w:val="24"/>
-        </w:rPr>
-        <w:t>计票端只读取public目录并且不需要保管口令。开放状态禁止汇总查询；关闭后才允许计算结果。解密端独立检查签名清单，重新计算完整汇总，并核对轮次、清单摘要、密文向量和接收票数。结果必须满足各项票数不超过总票数且总和等于已接收人数。</w:t>
-      </w:r>
-    </w:p>
-    <w:p>
-      <w:pPr>
-        <w:spacing w:line="300" w:lineRule="auto" w:after="100"/>
-        <w:ind w:firstLine="480"/>
-      </w:pPr>
-      <w:r>
-        <w:rPr>
-          <w:rFonts w:ascii="宋体" w:hAnsi="宋体" w:eastAsia="宋体"/>
-          <w:b w:val="0"/>
-          <w:color w:val="000000"/>
-          <w:sz w:val="24"/>
-        </w:rPr>
-        <w:t>本报告对应的代码范围：tally_service.py；app_ui.py中的trustee_process；experiments.py中的准确性、零票、解密边界与性能实验。</w:t>
-      </w:r>
-    </w:p>
-    <w:p>
-      <w:pPr>
-        <w:keepNext/>
-        <w:pageBreakBefore w:val="0"/>
-        <w:spacing w:line="300" w:lineRule="auto" w:after="160"/>
-      </w:pPr>
-      <w:r>
-        <w:rPr>
-          <w:rFonts w:ascii="宋体" w:hAnsi="宋体" w:eastAsia="宋体"/>
-          <w:b/>
-          <w:color w:val="000000"/>
-          <w:sz w:val="28"/>
-        </w:rPr>
-        <w:t>二 需求分析和总体设计</w:t>
+      </w:pPr>
+      <w:r>
+        <w:t>表1 小组模块划分</w:t>
       </w:r>
     </w:p>
     <w:tbl>
@@ -2311,12 +2355,17 @@
       <w:tr>
         <w:trPr>
           <w:tblHeader/>
+          <w:tblHeader/>
         </w:trPr>
         <w:tc>
           <w:tcPr>
             <w:tcW w:type="dxa" w:w="794"/>
             <w:vAlign w:val="center"/>
             <w:tcBorders>
+              <w:top w:val="single" w:sz="4" w:color="D9D9D9"/>
+              <w:left w:val="single" w:sz="4" w:color="D9D9D9"/>
+              <w:bottom w:val="single" w:sz="4" w:color="D9D9D9"/>
+              <w:right w:val="single" w:sz="4" w:color="D9D9D9"/>
               <w:top w:val="single" w:sz="4" w:color="D9D9D9"/>
               <w:left w:val="single" w:sz="4" w:color="D9D9D9"/>
               <w:bottom w:val="single" w:sz="4" w:color="D9D9D9"/>
@@ -2332,11 +2381,12 @@
           </w:tcPr>
           <w:p>
             <w:pPr>
-              <w:spacing w:after="40" w:line="264" w:lineRule="auto"/>
-            </w:pPr>
-            <w:r>
-              <w:rPr>
-                <w:rFonts w:ascii="宋体" w:hAnsi="宋体" w:eastAsia="宋体"/>
+              <w:keepNext/>
+              <w:spacing w:after="40" w:line="288" w:lineRule="auto" w:before="40"/>
+            </w:pPr>
+            <w:r>
+              <w:rPr>
+                <w:rFonts w:ascii="Times New Roman" w:hAnsi="Times New Roman" w:eastAsia="宋体"/>
                 <w:b/>
                 <w:color w:val="000000"/>
                 <w:sz w:val="21"/>
@@ -2350,6 +2400,10 @@
             <w:tcW w:type="dxa" w:w="2665"/>
             <w:vAlign w:val="center"/>
             <w:tcBorders>
+              <w:top w:val="single" w:sz="4" w:color="D9D9D9"/>
+              <w:left w:val="single" w:sz="4" w:color="D9D9D9"/>
+              <w:bottom w:val="single" w:sz="4" w:color="D9D9D9"/>
+              <w:right w:val="single" w:sz="4" w:color="D9D9D9"/>
               <w:top w:val="single" w:sz="4" w:color="D9D9D9"/>
               <w:left w:val="single" w:sz="4" w:color="D9D9D9"/>
               <w:bottom w:val="single" w:sz="4" w:color="D9D9D9"/>
@@ -2365,11 +2419,12 @@
           </w:tcPr>
           <w:p>
             <w:pPr>
-              <w:spacing w:after="40" w:line="264" w:lineRule="auto"/>
-            </w:pPr>
-            <w:r>
-              <w:rPr>
-                <w:rFonts w:ascii="宋体" w:hAnsi="宋体" w:eastAsia="宋体"/>
+              <w:keepNext/>
+              <w:spacing w:after="40" w:line="288" w:lineRule="auto" w:before="40"/>
+            </w:pPr>
+            <w:r>
+              <w:rPr>
+                <w:rFonts w:ascii="Times New Roman" w:hAnsi="Times New Roman" w:eastAsia="宋体"/>
                 <w:b/>
                 <w:color w:val="000000"/>
                 <w:sz w:val="21"/>
@@ -2383,6 +2438,10 @@
             <w:tcW w:type="dxa" w:w="5726"/>
             <w:vAlign w:val="center"/>
             <w:tcBorders>
+              <w:top w:val="single" w:sz="4" w:color="D9D9D9"/>
+              <w:left w:val="single" w:sz="4" w:color="D9D9D9"/>
+              <w:bottom w:val="single" w:sz="4" w:color="D9D9D9"/>
+              <w:right w:val="single" w:sz="4" w:color="D9D9D9"/>
               <w:top w:val="single" w:sz="4" w:color="D9D9D9"/>
               <w:left w:val="single" w:sz="4" w:color="D9D9D9"/>
               <w:bottom w:val="single" w:sz="4" w:color="D9D9D9"/>
@@ -2398,11 +2457,12 @@
           </w:tcPr>
           <w:p>
             <w:pPr>
-              <w:spacing w:after="40" w:line="264" w:lineRule="auto"/>
-            </w:pPr>
-            <w:r>
-              <w:rPr>
-                <w:rFonts w:ascii="宋体" w:hAnsi="宋体" w:eastAsia="宋体"/>
+              <w:keepNext/>
+              <w:spacing w:after="40" w:line="288" w:lineRule="auto" w:before="40"/>
+            </w:pPr>
+            <w:r>
+              <w:rPr>
+                <w:rFonts w:ascii="Times New Roman" w:hAnsi="Times New Roman" w:eastAsia="宋体"/>
                 <w:b/>
                 <w:color w:val="000000"/>
                 <w:sz w:val="21"/>
@@ -2413,11 +2473,16 @@
         </w:tc>
       </w:tr>
       <w:tr>
+        <w:trPr/>
         <w:tc>
           <w:tcPr>
             <w:tcW w:type="dxa" w:w="794"/>
             <w:vAlign w:val="center"/>
             <w:tcBorders>
+              <w:top w:val="single" w:sz="4" w:color="D9D9D9"/>
+              <w:left w:val="single" w:sz="4" w:color="D9D9D9"/>
+              <w:bottom w:val="single" w:sz="4" w:color="D9D9D9"/>
+              <w:right w:val="single" w:sz="4" w:color="D9D9D9"/>
               <w:top w:val="single" w:sz="4" w:color="D9D9D9"/>
               <w:left w:val="single" w:sz="4" w:color="D9D9D9"/>
               <w:bottom w:val="single" w:sz="4" w:color="D9D9D9"/>
@@ -2432,11 +2497,12 @@
           </w:tcPr>
           <w:p>
             <w:pPr>
-              <w:spacing w:after="40" w:line="264" w:lineRule="auto"/>
-            </w:pPr>
-            <w:r>
-              <w:rPr>
-                <w:rFonts w:ascii="宋体" w:hAnsi="宋体" w:eastAsia="宋体"/>
+              <w:keepNext/>
+              <w:spacing w:after="40" w:line="288" w:lineRule="auto" w:before="40"/>
+            </w:pPr>
+            <w:r>
+              <w:rPr>
+                <w:rFonts w:ascii="Times New Roman" w:hAnsi="Times New Roman" w:eastAsia="宋体"/>
                 <w:b w:val="0"/>
                 <w:color w:val="000000"/>
                 <w:sz w:val="21"/>
@@ -2450,6 +2516,10 @@
             <w:tcW w:type="dxa" w:w="2665"/>
             <w:vAlign w:val="center"/>
             <w:tcBorders>
+              <w:top w:val="single" w:sz="4" w:color="D9D9D9"/>
+              <w:left w:val="single" w:sz="4" w:color="D9D9D9"/>
+              <w:bottom w:val="single" w:sz="4" w:color="D9D9D9"/>
+              <w:right w:val="single" w:sz="4" w:color="D9D9D9"/>
               <w:top w:val="single" w:sz="4" w:color="D9D9D9"/>
               <w:left w:val="single" w:sz="4" w:color="D9D9D9"/>
               <w:bottom w:val="single" w:sz="4" w:color="D9D9D9"/>
@@ -2464,11 +2534,12 @@
           </w:tcPr>
           <w:p>
             <w:pPr>
-              <w:spacing w:after="40" w:line="264" w:lineRule="auto"/>
-            </w:pPr>
-            <w:r>
-              <w:rPr>
-                <w:rFonts w:ascii="宋体" w:hAnsi="宋体" w:eastAsia="宋体"/>
+              <w:keepNext/>
+              <w:spacing w:after="40" w:line="288" w:lineRule="auto" w:before="40"/>
+            </w:pPr>
+            <w:r>
+              <w:rPr>
+                <w:rFonts w:ascii="Times New Roman" w:hAnsi="Times New Roman" w:eastAsia="宋体"/>
                 <w:b w:val="0"/>
                 <w:color w:val="000000"/>
                 <w:sz w:val="21"/>
@@ -2482,6 +2553,10 @@
             <w:tcW w:type="dxa" w:w="5726"/>
             <w:vAlign w:val="center"/>
             <w:tcBorders>
+              <w:top w:val="single" w:sz="4" w:color="D9D9D9"/>
+              <w:left w:val="single" w:sz="4" w:color="D9D9D9"/>
+              <w:bottom w:val="single" w:sz="4" w:color="D9D9D9"/>
+              <w:right w:val="single" w:sz="4" w:color="D9D9D9"/>
               <w:top w:val="single" w:sz="4" w:color="D9D9D9"/>
               <w:left w:val="single" w:sz="4" w:color="D9D9D9"/>
               <w:bottom w:val="single" w:sz="4" w:color="D9D9D9"/>
@@ -2496,11 +2571,12 @@
           </w:tcPr>
           <w:p>
             <w:pPr>
-              <w:spacing w:after="40" w:line="264" w:lineRule="auto"/>
-            </w:pPr>
-            <w:r>
-              <w:rPr>
-                <w:rFonts w:ascii="宋体" w:hAnsi="宋体" w:eastAsia="宋体"/>
+              <w:keepNext/>
+              <w:spacing w:after="40" w:line="288" w:lineRule="auto" w:before="40"/>
+            </w:pPr>
+            <w:r>
+              <w:rPr>
+                <w:rFonts w:ascii="Times New Roman" w:hAnsi="Times New Roman" w:eastAsia="宋体"/>
                 <w:b w:val="0"/>
                 <w:color w:val="000000"/>
                 <w:sz w:val="21"/>
@@ -2511,11 +2587,16 @@
         </w:tc>
       </w:tr>
       <w:tr>
+        <w:trPr/>
         <w:tc>
           <w:tcPr>
             <w:tcW w:type="dxa" w:w="794"/>
             <w:vAlign w:val="center"/>
             <w:tcBorders>
+              <w:top w:val="single" w:sz="4" w:color="D9D9D9"/>
+              <w:left w:val="single" w:sz="4" w:color="D9D9D9"/>
+              <w:bottom w:val="single" w:sz="4" w:color="D9D9D9"/>
+              <w:right w:val="single" w:sz="4" w:color="D9D9D9"/>
               <w:top w:val="single" w:sz="4" w:color="D9D9D9"/>
               <w:left w:val="single" w:sz="4" w:color="D9D9D9"/>
               <w:bottom w:val="single" w:sz="4" w:color="D9D9D9"/>
@@ -2530,11 +2611,12 @@
           </w:tcPr>
           <w:p>
             <w:pPr>
-              <w:spacing w:after="40" w:line="264" w:lineRule="auto"/>
-            </w:pPr>
-            <w:r>
-              <w:rPr>
-                <w:rFonts w:ascii="宋体" w:hAnsi="宋体" w:eastAsia="宋体"/>
+              <w:keepNext/>
+              <w:spacing w:after="40" w:line="288" w:lineRule="auto" w:before="40"/>
+            </w:pPr>
+            <w:r>
+              <w:rPr>
+                <w:rFonts w:ascii="Times New Roman" w:hAnsi="Times New Roman" w:eastAsia="宋体"/>
                 <w:b w:val="0"/>
                 <w:color w:val="000000"/>
                 <w:sz w:val="21"/>
@@ -2548,6 +2630,10 @@
             <w:tcW w:type="dxa" w:w="2665"/>
             <w:vAlign w:val="center"/>
             <w:tcBorders>
+              <w:top w:val="single" w:sz="4" w:color="D9D9D9"/>
+              <w:left w:val="single" w:sz="4" w:color="D9D9D9"/>
+              <w:bottom w:val="single" w:sz="4" w:color="D9D9D9"/>
+              <w:right w:val="single" w:sz="4" w:color="D9D9D9"/>
               <w:top w:val="single" w:sz="4" w:color="D9D9D9"/>
               <w:left w:val="single" w:sz="4" w:color="D9D9D9"/>
               <w:bottom w:val="single" w:sz="4" w:color="D9D9D9"/>
@@ -2562,11 +2648,12 @@
           </w:tcPr>
           <w:p>
             <w:pPr>
-              <w:spacing w:after="40" w:line="264" w:lineRule="auto"/>
-            </w:pPr>
-            <w:r>
-              <w:rPr>
-                <w:rFonts w:ascii="宋体" w:hAnsi="宋体" w:eastAsia="宋体"/>
+              <w:keepNext/>
+              <w:spacing w:after="40" w:line="288" w:lineRule="auto" w:before="40"/>
+            </w:pPr>
+            <w:r>
+              <w:rPr>
+                <w:rFonts w:ascii="Times New Roman" w:hAnsi="Times New Roman" w:eastAsia="宋体"/>
                 <w:b w:val="0"/>
                 <w:color w:val="000000"/>
                 <w:sz w:val="21"/>
@@ -2580,6 +2667,10 @@
             <w:tcW w:type="dxa" w:w="5726"/>
             <w:vAlign w:val="center"/>
             <w:tcBorders>
+              <w:top w:val="single" w:sz="4" w:color="D9D9D9"/>
+              <w:left w:val="single" w:sz="4" w:color="D9D9D9"/>
+              <w:bottom w:val="single" w:sz="4" w:color="D9D9D9"/>
+              <w:right w:val="single" w:sz="4" w:color="D9D9D9"/>
               <w:top w:val="single" w:sz="4" w:color="D9D9D9"/>
               <w:left w:val="single" w:sz="4" w:color="D9D9D9"/>
               <w:bottom w:val="single" w:sz="4" w:color="D9D9D9"/>
@@ -2594,11 +2685,12 @@
           </w:tcPr>
           <w:p>
             <w:pPr>
-              <w:spacing w:after="40" w:line="264" w:lineRule="auto"/>
-            </w:pPr>
-            <w:r>
-              <w:rPr>
-                <w:rFonts w:ascii="宋体" w:hAnsi="宋体" w:eastAsia="宋体"/>
+              <w:keepNext/>
+              <w:spacing w:after="40" w:line="288" w:lineRule="auto" w:before="40"/>
+            </w:pPr>
+            <w:r>
+              <w:rPr>
+                <w:rFonts w:ascii="Times New Roman" w:hAnsi="Times New Roman" w:eastAsia="宋体"/>
                 <w:b w:val="0"/>
                 <w:color w:val="000000"/>
                 <w:sz w:val="21"/>
@@ -2609,11 +2701,16 @@
         </w:tc>
       </w:tr>
       <w:tr>
+        <w:trPr/>
         <w:tc>
           <w:tcPr>
             <w:tcW w:type="dxa" w:w="794"/>
             <w:vAlign w:val="center"/>
             <w:tcBorders>
+              <w:top w:val="single" w:sz="4" w:color="D9D9D9"/>
+              <w:left w:val="single" w:sz="4" w:color="D9D9D9"/>
+              <w:bottom w:val="single" w:sz="4" w:color="D9D9D9"/>
+              <w:right w:val="single" w:sz="4" w:color="D9D9D9"/>
               <w:top w:val="single" w:sz="4" w:color="D9D9D9"/>
               <w:left w:val="single" w:sz="4" w:color="D9D9D9"/>
               <w:bottom w:val="single" w:sz="4" w:color="D9D9D9"/>
@@ -2628,11 +2725,12 @@
           </w:tcPr>
           <w:p>
             <w:pPr>
-              <w:spacing w:after="40" w:line="264" w:lineRule="auto"/>
-            </w:pPr>
-            <w:r>
-              <w:rPr>
-                <w:rFonts w:ascii="宋体" w:hAnsi="宋体" w:eastAsia="宋体"/>
+              <w:keepNext w:val="0"/>
+              <w:spacing w:after="40" w:line="288" w:lineRule="auto" w:before="40"/>
+            </w:pPr>
+            <w:r>
+              <w:rPr>
+                <w:rFonts w:ascii="Times New Roman" w:hAnsi="Times New Roman" w:eastAsia="宋体"/>
                 <w:b w:val="0"/>
                 <w:color w:val="000000"/>
                 <w:sz w:val="21"/>
@@ -2646,6 +2744,10 @@
             <w:tcW w:type="dxa" w:w="2665"/>
             <w:vAlign w:val="center"/>
             <w:tcBorders>
+              <w:top w:val="single" w:sz="4" w:color="D9D9D9"/>
+              <w:left w:val="single" w:sz="4" w:color="D9D9D9"/>
+              <w:bottom w:val="single" w:sz="4" w:color="D9D9D9"/>
+              <w:right w:val="single" w:sz="4" w:color="D9D9D9"/>
               <w:top w:val="single" w:sz="4" w:color="D9D9D9"/>
               <w:left w:val="single" w:sz="4" w:color="D9D9D9"/>
               <w:bottom w:val="single" w:sz="4" w:color="D9D9D9"/>
@@ -2660,11 +2762,12 @@
           </w:tcPr>
           <w:p>
             <w:pPr>
-              <w:spacing w:after="40" w:line="264" w:lineRule="auto"/>
-            </w:pPr>
-            <w:r>
-              <w:rPr>
-                <w:rFonts w:ascii="宋体" w:hAnsi="宋体" w:eastAsia="宋体"/>
+              <w:keepNext w:val="0"/>
+              <w:spacing w:after="40" w:line="288" w:lineRule="auto" w:before="40"/>
+            </w:pPr>
+            <w:r>
+              <w:rPr>
+                <w:rFonts w:ascii="Times New Roman" w:hAnsi="Times New Roman" w:eastAsia="宋体"/>
                 <w:b w:val="0"/>
                 <w:color w:val="000000"/>
                 <w:sz w:val="21"/>
@@ -2678,6 +2781,10 @@
             <w:tcW w:type="dxa" w:w="5726"/>
             <w:vAlign w:val="center"/>
             <w:tcBorders>
+              <w:top w:val="single" w:sz="4" w:color="D9D9D9"/>
+              <w:left w:val="single" w:sz="4" w:color="D9D9D9"/>
+              <w:bottom w:val="single" w:sz="4" w:color="D9D9D9"/>
+              <w:right w:val="single" w:sz="4" w:color="D9D9D9"/>
               <w:top w:val="single" w:sz="4" w:color="D9D9D9"/>
               <w:left w:val="single" w:sz="4" w:color="D9D9D9"/>
               <w:bottom w:val="single" w:sz="4" w:color="D9D9D9"/>
@@ -2692,11 +2799,12 @@
           </w:tcPr>
           <w:p>
             <w:pPr>
-              <w:spacing w:after="40" w:line="264" w:lineRule="auto"/>
-            </w:pPr>
-            <w:r>
-              <w:rPr>
-                <w:rFonts w:ascii="宋体" w:hAnsi="宋体" w:eastAsia="宋体"/>
+              <w:keepNext w:val="0"/>
+              <w:spacing w:after="40" w:line="288" w:lineRule="auto" w:before="40"/>
+            </w:pPr>
+            <w:r>
+              <w:rPr>
+                <w:rFonts w:ascii="Times New Roman" w:hAnsi="Times New Roman" w:eastAsia="宋体"/>
                 <w:b w:val="0"/>
                 <w:color w:val="000000"/>
                 <w:sz w:val="21"/>
@@ -2709,201 +2817,242 @@
     </w:tbl>
     <w:p>
       <w:pPr>
-        <w:spacing w:line="300" w:lineRule="auto" w:after="100"/>
-        <w:ind w:firstLine="480"/>
-      </w:pPr>
-      <w:r>
-        <w:rPr>
-          <w:rFonts w:ascii="宋体" w:hAnsi="宋体" w:eastAsia="宋体"/>
+        <w:pStyle w:val="ReportBody"/>
+      </w:pPr>
+      <w:r>
+        <w:t>公开选票由A交给C登记，C把签名清单与密文交给B汇总，B向保管端提交完整汇总请求。各角色报告分别讨论编码与密钥、汇总与解密、界面与审计；实际姓名、学号和完成记录由成员核对填写。</w:t>
+      </w:r>
+    </w:p>
+    <w:p>
+      <w:pPr>
+        <w:pStyle w:val="ReportH1"/>
+      </w:pPr>
+      <w:r>
+        <w:rPr>
+          <w:rFonts w:ascii="Times New Roman" w:hAnsi="Times New Roman" w:eastAsia="宋体"/>
+          <w:b/>
+          <w:color w:val="000000"/>
+          <w:sz w:val="28"/>
+        </w:rPr>
+        <w:t>三、相关功能模块详细设计</w:t>
+      </w:r>
+    </w:p>
+    <w:p>
+      <w:pPr>
+        <w:pStyle w:val="ReportH2"/>
+      </w:pPr>
+      <w:r>
+        <w:rPr>
+          <w:rFonts w:ascii="Times New Roman" w:hAnsi="Times New Roman" w:eastAsia="宋体"/>
+          <w:b/>
+          <w:color w:val="000000"/>
+          <w:sz w:val="24"/>
+        </w:rPr>
+        <w:t>3.1 密文乘法实现明文加法</w:t>
+      </w:r>
+    </w:p>
+    <w:p>
+      <w:pPr>
+        <w:pStyle w:val="ReportBody"/>
+      </w:pPr>
+      <w:r>
+        <w:t>上游先生成n=pq及g=n+1，把单选编码为独热向量；每项m以c=</w:t>
+      </w:r>
+      <w:r>
+        <w:t>g</w:t>
+      </w:r>
+      <w:r>
+        <w:rPr>
+          <w:vertAlign w:val="superscript"/>
+        </w:rPr>
+        <w:t>m</w:t>
+      </w:r>
+      <w:r>
+        <w:t xml:space="preserve"> </w:t>
+      </w:r>
+      <w:r>
+        <w:t>r</w:t>
+      </w:r>
+      <w:r>
+        <w:rPr>
+          <w:vertAlign w:val="superscript"/>
+        </w:rPr>
+        <w:t>n</w:t>
+      </w:r>
+      <w:r>
+        <w:t xml:space="preserve"> mod n²独立随机加密。私钥p、q由口令保管库保护。汇总端只读取n，保管端才加载p、q并调用raw_decrypt，这与原语接口的分工一致[2]。</w:t>
+      </w:r>
+    </w:p>
+    <w:p>
+      <w:pPr>
+        <w:pStyle w:val="ReportBody"/>
+      </w:pPr>
+      <w:r>
+        <w:rPr>
+          <w:rFonts w:ascii="Times New Roman" w:hAnsi="Times New Roman" w:eastAsia="宋体"/>
           <w:b w:val="0"/>
           <w:color w:val="000000"/>
-          <w:sz w:val="22"/>
-        </w:rPr>
-        <w:t>共同接口以JSON公开配置、加密选票和签名清单为中心。A不在选票文件保存明文选择；B不在计票目录放置私钥；C在每次关键操作前检查签名和状态。报告按责任模块划分，实际学生完成情况需在复现和现场修改后由本人确认。</w:t>
-      </w:r>
-    </w:p>
-    <w:p>
-      <w:pPr>
+          <w:sz w:val="24"/>
+        </w:rPr>
+        <w:t>Paillier满足E(a;r1)E(b;r2) mod n² = E((a+b) mod n;r1r2 mod n)。本实验人数不超过10000，远小于2048位n，因此不会发生票数模n回绕。每个选项初始化累积值1，再将该列所有密文相乘并对n²取模。程序使用原始非负整数编码，不涉及浮点指数。</w:t>
+      </w:r>
+    </w:p>
+    <w:p>
+      <w:pPr>
+        <w:pStyle w:val="ReportH2"/>
+      </w:pPr>
+      <w:r>
+        <w:rPr>
+          <w:rFonts w:ascii="Times New Roman" w:hAnsi="Times New Roman" w:eastAsia="宋体"/>
+          <w:b/>
+          <w:color w:val="000000"/>
+          <w:sz w:val="24"/>
+        </w:rPr>
+        <w:t>3.2 汇总请求与完整性绑定</w:t>
+      </w:r>
+    </w:p>
+    <w:p>
+      <w:pPr>
+        <w:pStyle w:val="ReportBody"/>
+      </w:pPr>
+      <w:r>
+        <w:rPr>
+          <w:rFonts w:ascii="Times New Roman" w:hAnsi="Times New Roman" w:eastAsia="宋体"/>
+          <w:b w:val="0"/>
+          <w:color w:val="000000"/>
+          <w:sz w:val="24"/>
+        </w:rPr>
+        <w:t>aggregate先调用audit，再检查closed状态，输出轮次、签名清单payload摘要、密文向量、票数和耗时。没有任何Paillier私钥输入。公开ZIP不包含private目录；把公开包放到独立目录中仍可进行汇总，测试已验证这一点。</w:t>
+      </w:r>
+    </w:p>
+    <w:p>
+      <w:pPr>
+        <w:pStyle w:val="ReportH2"/>
+      </w:pPr>
+      <w:r>
+        <w:rPr>
+          <w:rFonts w:ascii="Times New Roman" w:hAnsi="Times New Roman" w:eastAsia="宋体"/>
+          <w:b/>
+          <w:color w:val="000000"/>
+          <w:sz w:val="24"/>
+        </w:rPr>
+        <w:t>3.3 解密端拒绝任意密文查询</w:t>
+      </w:r>
+    </w:p>
+    <w:p>
+      <w:pPr>
+        <w:pStyle w:val="ReportBody"/>
+      </w:pPr>
+      <w:r>
+        <w:rPr>
+          <w:rFonts w:ascii="Times New Roman" w:hAnsi="Times New Roman" w:eastAsia="宋体"/>
+          <w:b w:val="0"/>
+          <w:color w:val="000000"/>
+          <w:sz w:val="24"/>
+        </w:rPr>
+        <w:t>trustee_process使用标准输入管道传递口令，命令行参数中不包含口令。子进程重新审计并重新汇总，只有请求与当前完整结果一致才加载私钥。它没有“解密选中单票”的界面或接口。此措施限制正常程序调用，不能阻止拥有私钥及本机控制权的人自行解密。</w:t>
+      </w:r>
+    </w:p>
+    <w:p>
+      <w:pPr>
+        <w:pStyle w:val="ReportH2"/>
+      </w:pPr>
+      <w:r>
+        <w:t>3.4 模块程序流程图设计</w:t>
+      </w:r>
+    </w:p>
+    <w:p>
+      <w:pPr>
+        <w:pStyle w:val="ReportCaption"/>
         <w:keepNext/>
-        <w:pageBreakBefore/>
-        <w:spacing w:line="300" w:lineRule="auto" w:after="160"/>
-      </w:pPr>
-      <w:r>
-        <w:rPr>
-          <w:rFonts w:ascii="宋体" w:hAnsi="宋体" w:eastAsia="宋体"/>
+      </w:pPr>
+      <w:r/>
+      <w:r>
+        <w:drawing>
+          <wp:inline xmlns:a="http://schemas.openxmlformats.org/drawingml/2006/main" xmlns:pic="http://schemas.openxmlformats.org/drawingml/2006/picture">
+            <wp:extent cx="5760000" cy="3456000"/>
+            <wp:docPr id="2" name="Picture 2"/>
+            <wp:cNvGraphicFramePr>
+              <a:graphicFrameLocks noChangeAspect="1"/>
+            </wp:cNvGraphicFramePr>
+            <a:graphic>
+              <a:graphicData uri="http://schemas.openxmlformats.org/drawingml/2006/picture">
+                <pic:pic>
+                  <pic:nvPicPr>
+                    <pic:cNvPr id="0" name="flow-B.png"/>
+                    <pic:cNvPicPr/>
+                  </pic:nvPicPr>
+                  <pic:blipFill>
+                    <a:blip r:embed="rId12"/>
+                    <a:stretch>
+                      <a:fillRect/>
+                    </a:stretch>
+                  </pic:blipFill>
+                  <pic:spPr>
+                    <a:xfrm>
+                      <a:off x="0" y="0"/>
+                      <a:ext cx="5760000" cy="3456000"/>
+                    </a:xfrm>
+                    <a:prstGeom prst="rect"/>
+                  </pic:spPr>
+                </pic:pic>
+              </a:graphicData>
+            </a:graphic>
+          </wp:inline>
+        </w:drawing>
+      </w:r>
+    </w:p>
+    <w:p>
+      <w:pPr>
+        <w:pStyle w:val="ReportCaption"/>
+      </w:pPr>
+      <w:r>
+        <w:t>图1 本模块处理流程与失败出口</w:t>
+      </w:r>
+    </w:p>
+    <w:p>
+      <w:pPr>
+        <w:pStyle w:val="ReportH2"/>
+      </w:pPr>
+      <w:r>
+        <w:rPr>
+          <w:rFonts w:ascii="Times New Roman" w:hAnsi="Times New Roman" w:eastAsia="宋体"/>
           <w:b/>
           <w:color w:val="000000"/>
-          <w:sz w:val="28"/>
-        </w:rPr>
-        <w:t>三 相关功能模块详细设计</w:t>
-      </w:r>
-    </w:p>
-    <w:p>
-      <w:pPr>
+          <w:sz w:val="24"/>
+        </w:rPr>
+        <w:t>3.5 威胁模型与安全边界</w:t>
+      </w:r>
+    </w:p>
+    <w:p>
+      <w:pPr>
+        <w:pStyle w:val="ReportBody"/>
+      </w:pPr>
+      <w:r>
+        <w:rPr>
+          <w:rFonts w:ascii="Times New Roman" w:hAnsi="Times New Roman" w:eastAsia="宋体"/>
+          <w:b w:val="0"/>
+          <w:color w:val="000000"/>
+          <w:sz w:val="24"/>
+        </w:rPr>
+        <w:t>假设攻击者能够读取或修改公开选票目录，但不能获得保管口令和签名私钥，最初的公钥配置已可信确认。保护目标是隐藏单票选择并发现相对于签名清单的文件变化。应用运行在一台电脑上，角色隔离是教学流程；创建与解锁阶段可短暂接触完整密钥材料，不构成互不信任机构之间的物理隔离。</w:t>
+      </w:r>
+    </w:p>
+    <w:p>
+      <w:pPr>
+        <w:pStyle w:val="ReportH2"/>
+      </w:pPr>
+      <w:r>
+        <w:t>3.6 模块界面与数据说明</w:t>
+      </w:r>
+    </w:p>
+    <w:p>
+      <w:pPr>
+        <w:pStyle w:val="ReportBody"/>
         <w:keepNext/>
-        <w:spacing w:line="300" w:lineRule="auto" w:after="100"/>
-      </w:pPr>
-      <w:r>
-        <w:rPr>
-          <w:rFonts w:ascii="宋体" w:hAnsi="宋体" w:eastAsia="宋体"/>
-          <w:b/>
-          <w:color w:val="000000"/>
-          <w:sz w:val="24"/>
-        </w:rPr>
-        <w:t>3.1 密文乘法实现明文加法</w:t>
-      </w:r>
-    </w:p>
-    <w:p>
-      <w:pPr>
-        <w:spacing w:line="300" w:lineRule="auto" w:after="100"/>
-        <w:ind w:firstLine="480"/>
-      </w:pPr>
-      <w:r>
-        <w:rPr>
-          <w:rFonts w:ascii="宋体" w:hAnsi="宋体" w:eastAsia="宋体"/>
-          <w:b w:val="0"/>
-          <w:color w:val="000000"/>
-          <w:sz w:val="24"/>
-        </w:rPr>
-        <w:t>Paillier满足E(a;r1)E(b;r2) mod n² = E((a+b) mod n;r1r2 mod n)。本实验人数不超过10000，远小于2048位n，因此不会发生票数模n回绕。每个选项初始化累积值1，再将该列所有密文相乘并对n²取模。程序使用原始非负整数编码，不涉及浮点指数。</w:t>
-      </w:r>
-    </w:p>
-    <w:p>
-      <w:pPr>
-        <w:keepNext/>
-        <w:spacing w:line="300" w:lineRule="auto" w:after="100"/>
-      </w:pPr>
-      <w:r>
-        <w:rPr>
-          <w:rFonts w:ascii="宋体" w:hAnsi="宋体" w:eastAsia="宋体"/>
-          <w:b/>
-          <w:color w:val="000000"/>
-          <w:sz w:val="24"/>
-        </w:rPr>
-        <w:t>3.2 汇总请求与完整性绑定</w:t>
-      </w:r>
-    </w:p>
-    <w:p>
-      <w:pPr>
-        <w:spacing w:line="300" w:lineRule="auto" w:after="100"/>
-        <w:ind w:firstLine="480"/>
-      </w:pPr>
-      <w:r>
-        <w:rPr>
-          <w:rFonts w:ascii="宋体" w:hAnsi="宋体" w:eastAsia="宋体"/>
-          <w:b w:val="0"/>
-          <w:color w:val="000000"/>
-          <w:sz w:val="24"/>
-        </w:rPr>
-        <w:t>aggregate先调用audit，再检查closed状态，输出轮次、签名清单payload摘要、密文向量、票数和耗时。没有任何Paillier私钥输入。公开ZIP不包含private目录；把公开包放到独立目录中仍可进行汇总，测试已验证这一点。</w:t>
-      </w:r>
-    </w:p>
-    <w:p>
-      <w:pPr>
-        <w:keepNext/>
-        <w:spacing w:line="300" w:lineRule="auto" w:after="100"/>
-      </w:pPr>
-      <w:r>
-        <w:rPr>
-          <w:rFonts w:ascii="宋体" w:hAnsi="宋体" w:eastAsia="宋体"/>
-          <w:b/>
-          <w:color w:val="000000"/>
-          <w:sz w:val="24"/>
-        </w:rPr>
-        <w:t>3.3 解密端拒绝任意密文查询</w:t>
-      </w:r>
-    </w:p>
-    <w:p>
-      <w:pPr>
-        <w:spacing w:line="300" w:lineRule="auto" w:after="100"/>
-        <w:ind w:firstLine="480"/>
-      </w:pPr>
-      <w:r>
-        <w:rPr>
-          <w:rFonts w:ascii="宋体" w:hAnsi="宋体" w:eastAsia="宋体"/>
-          <w:b w:val="0"/>
-          <w:color w:val="000000"/>
-          <w:sz w:val="24"/>
-        </w:rPr>
-        <w:t>trustee_process使用标准输入管道传递口令，命令行参数中不包含口令。子进程重新审计并重新汇总，只有请求与当前完整结果一致才加载私钥。它没有“解密选中单票”的界面或接口。此措施限制正常程序调用，不能阻止拥有私钥及本机控制权的人自行解密。</w:t>
-      </w:r>
-    </w:p>
-    <w:p>
-      <w:pPr>
-        <w:keepNext/>
-        <w:spacing w:line="300" w:lineRule="auto" w:after="100"/>
-      </w:pPr>
-      <w:r>
-        <w:rPr>
-          <w:rFonts w:ascii="宋体" w:hAnsi="宋体" w:eastAsia="宋体"/>
-          <w:b/>
-          <w:color w:val="000000"/>
-          <w:sz w:val="24"/>
-        </w:rPr>
-        <w:t>3.4 模块处理流程</w:t>
-      </w:r>
-    </w:p>
-    <w:p>
-      <w:pPr>
-        <w:spacing w:line="300" w:lineRule="auto" w:after="100"/>
-      </w:pPr>
-      <w:r>
-        <w:rPr>
-          <w:rFonts w:ascii="宋体" w:hAnsi="宋体" w:eastAsia="宋体"/>
-          <w:b w:val="0"/>
-          <w:color w:val="000000"/>
-          <w:sz w:val="22"/>
-        </w:rPr>
-        <w:t>审计全部公开数据 → 检查投票已关闭 → 按列密文相乘 → 生成汇总请求 → 独立进程复算核对 → 解密总票 → 总和检查</w:t>
-      </w:r>
-    </w:p>
-    <w:p>
-      <w:pPr>
-        <w:keepNext/>
-        <w:spacing w:line="300" w:lineRule="auto" w:after="100"/>
-      </w:pPr>
-      <w:r>
-        <w:rPr>
-          <w:rFonts w:ascii="宋体" w:hAnsi="宋体" w:eastAsia="宋体"/>
-          <w:b/>
-          <w:color w:val="000000"/>
-          <w:sz w:val="24"/>
-        </w:rPr>
-        <w:t>3.5 威胁模型与安全边界</w:t>
-      </w:r>
-    </w:p>
-    <w:p>
-      <w:pPr>
-        <w:spacing w:line="300" w:lineRule="auto" w:after="100"/>
-        <w:ind w:firstLine="480"/>
-      </w:pPr>
-      <w:r>
-        <w:rPr>
-          <w:rFonts w:ascii="宋体" w:hAnsi="宋体" w:eastAsia="宋体"/>
-          <w:b w:val="0"/>
-          <w:color w:val="000000"/>
-          <w:sz w:val="24"/>
-        </w:rPr>
-        <w:t>假设攻击者能够读取或修改公开选票目录，但不能获得保管口令和签名私钥，最初的公钥配置已可信确认。保护目标是隐藏单票选择并发现相对于签名清单的文件变化。应用运行在一台电脑上，角色隔离是教学流程；创建与解锁阶段可短暂接触完整密钥材料，不构成互不信任机构之间的物理隔离。</w:t>
-      </w:r>
-    </w:p>
-    <w:p>
-      <w:pPr>
-        <w:keepNext/>
-        <w:pageBreakBefore/>
-        <w:spacing w:line="300" w:lineRule="auto" w:after="160"/>
-      </w:pPr>
-      <w:r>
-        <w:rPr>
-          <w:rFonts w:ascii="宋体" w:hAnsi="宋体" w:eastAsia="宋体"/>
-          <w:b/>
-          <w:color w:val="000000"/>
-          <w:sz w:val="28"/>
-        </w:rPr>
-        <w:t>模块界面与数据说明</w:t>
-      </w:r>
-    </w:p>
-    <w:p>
+        <w:ind w:firstLine="0"/>
+        <w:jc w:val="center"/>
+      </w:pPr>
       <w:r>
         <w:drawing>
           <wp:inline xmlns:a="http://schemas.openxmlformats.org/drawingml/2006/main" xmlns:pic="http://schemas.openxmlformats.org/drawingml/2006/picture">
@@ -2941,365 +3090,345 @@
     </w:p>
     <w:p>
       <w:pPr>
-        <w:spacing w:line="300" w:lineRule="auto" w:after="160"/>
-        <w:jc w:val="center"/>
-      </w:pPr>
-      <w:r>
-        <w:rPr>
-          <w:rFonts w:ascii="宋体" w:hAnsi="宋体" w:eastAsia="宋体"/>
+        <w:pStyle w:val="ReportCaption"/>
+      </w:pPr>
+      <w:r>
+        <w:t>图2 独立进程返回总票数及实测耗时</w:t>
+      </w:r>
+    </w:p>
+    <w:p>
+      <w:pPr>
+        <w:pStyle w:val="ReportH2"/>
+      </w:pPr>
+      <w:r>
+        <w:t>3.7 公开数据与私有数据</w:t>
+      </w:r>
+    </w:p>
+    <w:p>
+      <w:pPr>
+        <w:pStyle w:val="ReportBody"/>
+      </w:pPr>
+      <w:r>
+        <w:rPr>
+          <w:rFonts w:ascii="Times New Roman" w:hAnsi="Times New Roman" w:eastAsia="宋体"/>
           <w:b w:val="0"/>
           <w:color w:val="000000"/>
-          <w:sz w:val="21"/>
-        </w:rPr>
-        <w:t>图1 独立进程返回的总票数与各阶段耗时</w:t>
-      </w:r>
-    </w:p>
-    <w:p>
-      <w:pPr>
+          <w:sz w:val="24"/>
+        </w:rPr>
+        <w:t>public/config.json保存标题、选项、名单、Paillier公钥n和审计公钥；public/ballots保存每张加密选票；public/manifest.json保存签名清单。private/trustee.vault保存加密后的私钥材料。公开包不包含private目录。口令经标准输入管道交给解密子进程，不放入命令行或日志。</w:t>
+      </w:r>
+    </w:p>
+    <w:p>
+      <w:pPr>
+        <w:pStyle w:val="ReportBody"/>
+      </w:pPr>
+      <w:r>
+        <w:rPr>
+          <w:rFonts w:ascii="Times New Roman" w:hAnsi="Times New Roman" w:eastAsia="宋体"/>
+          <w:b w:val="0"/>
+          <w:color w:val="000000"/>
+          <w:sz w:val="24"/>
+        </w:rPr>
+        <w:t>选票的时间戳、ID与随机标识属于公开元数据，隐私目标是投票内容保密，不是投票者匿名。演示和自动实验均使用虚构ID及合成选票。</w:t>
+      </w:r>
+    </w:p>
+    <w:p>
+      <w:pPr>
+        <w:pStyle w:val="ReportH1"/>
+      </w:pPr>
+      <w:r>
+        <w:rPr>
+          <w:rFonts w:ascii="Times New Roman" w:hAnsi="Times New Roman" w:eastAsia="宋体"/>
+          <w:b/>
+          <w:color w:val="000000"/>
+          <w:sz w:val="28"/>
+        </w:rPr>
+        <w:t>四、部分核心代码</w:t>
+      </w:r>
+    </w:p>
+    <w:p>
+      <w:pPr>
+        <w:pStyle w:val="ReportH2"/>
+      </w:pPr>
+      <w:r>
+        <w:rPr>
+          <w:rFonts w:ascii="Times New Roman" w:hAnsi="Times New Roman" w:eastAsia="宋体"/>
+          <w:b/>
+          <w:color w:val="000000"/>
+          <w:sz w:val="24"/>
+        </w:rPr>
+        <w:t>4.1 核心实现片段</w:t>
+      </w:r>
+    </w:p>
+    <w:p>
+      <w:pPr>
+        <w:pStyle w:val="ReportBody"/>
         <w:keepNext/>
-        <w:spacing w:line="300" w:lineRule="auto" w:after="100"/>
-      </w:pPr>
-      <w:r>
-        <w:rPr>
-          <w:rFonts w:ascii="宋体" w:hAnsi="宋体" w:eastAsia="宋体"/>
+      </w:pPr>
+      <w:r>
+        <w:rPr>
+          <w:rFonts w:ascii="Times New Roman" w:hAnsi="Times New Roman" w:eastAsia="宋体"/>
+          <w:b w:val="0"/>
+          <w:color w:val="000000"/>
+          <w:sz w:val="24"/>
+        </w:rPr>
+        <w:t>以下片段摘自 tally_service.py，完整上下文与异常处理见随附源代码。</w:t>
+      </w:r>
+    </w:p>
+    <w:p>
+      <w:pPr>
+        <w:pStyle w:val="ReportCode"/>
+        <w:keepNext/>
+      </w:pPr>
+      <w:r>
+        <w:rPr>
+          <w:rFonts w:ascii="Consolas" w:hAnsi="Consolas" w:eastAsia="新宋体"/>
+          <w:b w:val="0"/>
+          <w:color w:val="000000"/>
+          <w:sz w:val="20"/>
+        </w:rPr>
+        <w:t xml:space="preserve">    totals = [1] * len(config['options'])</w:t>
+      </w:r>
+    </w:p>
+    <w:p>
+      <w:pPr>
+        <w:pStyle w:val="ReportCode"/>
+        <w:keepNext/>
+      </w:pPr>
+      <w:r>
+        <w:rPr>
+          <w:rFonts w:ascii="Consolas" w:hAnsi="Consolas" w:eastAsia="新宋体"/>
+          <w:b w:val="0"/>
+          <w:color w:val="000000"/>
+          <w:sz w:val="20"/>
+        </w:rPr>
+        <w:t xml:space="preserve">    for ballot in ballots:</w:t>
+      </w:r>
+    </w:p>
+    <w:p>
+      <w:pPr>
+        <w:pStyle w:val="ReportCode"/>
+        <w:keepNext/>
+      </w:pPr>
+      <w:r>
+        <w:rPr>
+          <w:rFonts w:ascii="Consolas" w:hAnsi="Consolas" w:eastAsia="新宋体"/>
+          <w:b w:val="0"/>
+          <w:color w:val="000000"/>
+          <w:sz w:val="20"/>
+        </w:rPr>
+        <w:t xml:space="preserve">        for i, c in enumerate(ballot['ciphertexts']):</w:t>
+      </w:r>
+    </w:p>
+    <w:p>
+      <w:pPr>
+        <w:pStyle w:val="ReportCode"/>
+        <w:keepNext/>
+      </w:pPr>
+      <w:r>
+        <w:rPr>
+          <w:rFonts w:ascii="Consolas" w:hAnsi="Consolas" w:eastAsia="新宋体"/>
+          <w:b w:val="0"/>
+          <w:color w:val="000000"/>
+          <w:sz w:val="20"/>
+        </w:rPr>
+        <w:t xml:space="preserve">            totals[i] = totals[i] * int(c) % pub.nsquare</w:t>
+      </w:r>
+    </w:p>
+    <w:p>
+      <w:pPr>
+        <w:pStyle w:val="ReportCode"/>
+        <w:keepNext/>
+      </w:pPr>
+      <w:r>
+        <w:rPr>
+          <w:rFonts w:ascii="Consolas" w:hAnsi="Consolas" w:eastAsia="新宋体"/>
+          <w:b w:val="0"/>
+          <w:color w:val="000000"/>
+          <w:sz w:val="20"/>
+        </w:rPr>
+        <w:t xml:space="preserve">    return {'election_id': config['election_id'], 'manifest_sha256': digest(manifest),</w:t>
+      </w:r>
+    </w:p>
+    <w:p>
+      <w:pPr>
+        <w:pStyle w:val="ReportCode"/>
+        <w:keepNext/>
+      </w:pPr>
+      <w:r>
+        <w:rPr>
+          <w:rFonts w:ascii="Consolas" w:hAnsi="Consolas" w:eastAsia="新宋体"/>
+          <w:b w:val="0"/>
+          <w:color w:val="000000"/>
+          <w:sz w:val="20"/>
+        </w:rPr>
+        <w:t xml:space="preserve">            'ciphertexts': [str(c) for c in totals], 'accepted': len(ballots),</w:t>
+      </w:r>
+    </w:p>
+    <w:p>
+      <w:pPr>
+        <w:pStyle w:val="ReportCode"/>
+        <w:keepNext w:val="0"/>
+      </w:pPr>
+      <w:r>
+        <w:rPr>
+          <w:rFonts w:ascii="Consolas" w:hAnsi="Consolas" w:eastAsia="新宋体"/>
+          <w:b w:val="0"/>
+          <w:color w:val="000000"/>
+          <w:sz w:val="20"/>
+        </w:rPr>
+        <w:t xml:space="preserve">            'audit_ms': audit_ms, 'aggregate_ms': (perf_counter()-started)*1000}</w:t>
+      </w:r>
+    </w:p>
+    <w:p>
+      <w:pPr>
+        <w:pStyle w:val="ReportH2"/>
+      </w:pPr>
+      <w:r>
+        <w:rPr>
+          <w:rFonts w:ascii="Times New Roman" w:hAnsi="Times New Roman" w:eastAsia="宋体"/>
           <w:b/>
           <w:color w:val="000000"/>
           <w:sz w:val="24"/>
         </w:rPr>
-        <w:t>公开数据与私有数据</w:t>
-      </w:r>
-    </w:p>
-    <w:p>
-      <w:pPr>
-        <w:spacing w:line="300" w:lineRule="auto" w:after="100"/>
-        <w:ind w:firstLine="480"/>
-      </w:pPr>
-      <w:r>
-        <w:rPr>
-          <w:rFonts w:ascii="宋体" w:hAnsi="宋体" w:eastAsia="宋体"/>
+        <w:t>4.2 本模块可重复实验步骤</w:t>
+      </w:r>
+    </w:p>
+    <w:p>
+      <w:pPr>
+        <w:pStyle w:val="ReportBody"/>
+      </w:pPr>
+      <w:r>
+        <w:rPr>
+          <w:rFonts w:ascii="Times New Roman" w:hAnsi="Times New Roman" w:eastAsia="宋体"/>
           <w:b w:val="0"/>
           <w:color w:val="000000"/>
           <w:sz w:val="24"/>
         </w:rPr>
-        <w:t>public/config.json保存标题、选项、名单、Paillier公钥n和审计公钥；public/ballots保存每张加密选票；public/manifest.json保存签名清单。private/trustee.vault保存加密后的私钥材料。公开包不包含private目录。口令经标准输入管道交给解密子进程，不放入命令行或日志。</w:t>
-      </w:r>
-    </w:p>
-    <w:p>
-      <w:pPr>
-        <w:spacing w:line="300" w:lineRule="auto" w:after="100"/>
-        <w:ind w:firstLine="480"/>
-      </w:pPr>
-      <w:r>
-        <w:rPr>
-          <w:rFonts w:ascii="宋体" w:hAnsi="宋体" w:eastAsia="宋体"/>
+        <w:t>1．打开已创建的3选项投票，先尝试在投票开放时计票，确认系统拒绝查询阶段结果。</w:t>
+      </w:r>
+    </w:p>
+    <w:p>
+      <w:pPr>
+        <w:pStyle w:val="ReportBody"/>
+      </w:pPr>
+      <w:r>
+        <w:rPr>
+          <w:rFonts w:ascii="Times New Roman" w:hAnsi="Times New Roman" w:eastAsia="宋体"/>
           <w:b w:val="0"/>
           <w:color w:val="000000"/>
           <w:sz w:val="24"/>
         </w:rPr>
-        <w:t>选票的时间戳、ID与随机标识属于公开元数据，隐私目标是投票内容保密，不是投票者匿名。演示和自动实验均使用虚构ID及合成选票。</w:t>
-      </w:r>
-    </w:p>
-    <w:p>
-      <w:pPr>
+        <w:t>2．按[0,1,0,2,0,1]准备6张合成测试票。关闭投票后进入汇总与结果页，输入保管口令，预期得到[3,2,1]。</w:t>
+      </w:r>
+    </w:p>
+    <w:p>
+      <w:pPr>
+        <w:pStyle w:val="ReportBody"/>
+      </w:pPr>
+      <w:r>
+        <w:rPr>
+          <w:rFonts w:ascii="Times New Roman" w:hAnsi="Times New Roman" w:eastAsia="宋体"/>
+          <w:b w:val="0"/>
+          <w:color w:val="000000"/>
+          <w:sz w:val="24"/>
+        </w:rPr>
+        <w:t>3．导出无私钥公开包；在自动测试的独立目录中，仅凭公开文件重新计算汇总，比较密文向量完全一致。</w:t>
+      </w:r>
+    </w:p>
+    <w:p>
+      <w:pPr>
+        <w:pStyle w:val="ReportBody"/>
+      </w:pPr>
+      <w:r>
+        <w:rPr>
+          <w:rFonts w:ascii="Times New Roman" w:hAnsi="Times New Roman" w:eastAsia="宋体"/>
+          <w:b w:val="0"/>
+          <w:color w:val="000000"/>
+          <w:sz w:val="24"/>
+        </w:rPr>
+        <w:t>4．将汇总请求中的向量替换为单张选票密文，独立解密端应拒绝，不应输出该票的明文。</w:t>
+      </w:r>
+    </w:p>
+    <w:p>
+      <w:pPr>
+        <w:pStyle w:val="ReportBody"/>
+      </w:pPr>
+      <w:r>
+        <w:rPr>
+          <w:rFonts w:ascii="Times New Roman" w:hAnsi="Times New Roman" w:eastAsia="宋体"/>
+          <w:b w:val="0"/>
+          <w:color w:val="000000"/>
+          <w:sz w:val="24"/>
+        </w:rPr>
+        <w:t>5．分别执行零票和4选项实验，检查结果为[0,0]和[1,1,1,1]；检查总票数与接收数一致。</w:t>
+      </w:r>
+    </w:p>
+    <w:p>
+      <w:pPr>
+        <w:pStyle w:val="ReportBody"/>
+      </w:pPr>
+      <w:r>
+        <w:rPr>
+          <w:rFonts w:ascii="Times New Roman" w:hAnsi="Times New Roman" w:eastAsia="宋体"/>
+          <w:b w:val="0"/>
+          <w:color w:val="000000"/>
+          <w:sz w:val="24"/>
+        </w:rPr>
+        <w:t>6．运行10、100、1000人三次重复实验，分别测量加密、汇总和解密原语耗时，保留原始运行记录。</w:t>
+      </w:r>
+    </w:p>
+    <w:p>
+      <w:pPr>
+        <w:pStyle w:val="ReportH1"/>
+      </w:pPr>
+      <w:r>
+        <w:rPr>
+          <w:rFonts w:ascii="Times New Roman" w:hAnsi="Times New Roman" w:eastAsia="宋体"/>
+          <w:b/>
+          <w:color w:val="000000"/>
+          <w:sz w:val="28"/>
+        </w:rPr>
+        <w:t>五、课题完成过程中遇到的问题及解决方法</w:t>
+      </w:r>
+    </w:p>
+    <w:p>
+      <w:pPr>
+        <w:pStyle w:val="ReportH2"/>
+      </w:pPr>
+      <w:r>
+        <w:rPr>
+          <w:rFonts w:ascii="Times New Roman" w:hAnsi="Times New Roman" w:eastAsia="宋体"/>
+          <w:b/>
+          <w:color w:val="000000"/>
+          <w:sz w:val="24"/>
+        </w:rPr>
+        <w:t>5.1 实验环境与记录来源</w:t>
+      </w:r>
+    </w:p>
+    <w:p>
+      <w:pPr>
+        <w:pStyle w:val="ReportBody"/>
+      </w:pPr>
+      <w:r>
+        <w:t>本轮实测日期为2026年10月27日（北京时间）。环境为Windows-11-10.0.26200-SP0，Python 3.12.14；phe 1.5.0、gmpy2 2.3.2、cryptography 50.0.2、PySide6-Essentials 6.12.0。核心实验使用2048位Paillier模数；9项工程回归使用1024位密钥加速边界检查，不作为安全强度示范。</w:t>
+      </w:r>
+    </w:p>
+    <w:p>
+      <w:pPr>
+        <w:pStyle w:val="ReportBody"/>
+      </w:pPr>
+      <w:r>
+        <w:t>自动核心实验29项全部符合预期，另有9项工程回归和原生Qt界面测试通过。原始记录位于evidence/2026-10-27/full/，包含JSON与CSV；源码SHA-256逐文件记入JSON。表2列出本模块相关结果。“局限”用例通过表示成功复现边界，不表示已防御。</w:t>
+      </w:r>
+    </w:p>
+    <w:p>
+      <w:pPr>
+        <w:pStyle w:val="ReportCaption"/>
         <w:keepNext/>
-        <w:pageBreakBefore/>
-        <w:spacing w:line="300" w:lineRule="auto" w:after="160"/>
-      </w:pPr>
-      <w:r>
-        <w:rPr>
-          <w:rFonts w:ascii="宋体" w:hAnsi="宋体" w:eastAsia="宋体"/>
-          <w:b/>
-          <w:color w:val="000000"/>
-          <w:sz w:val="28"/>
-        </w:rPr>
-        <w:t>四 部分核心代码与实验步骤</w:t>
-      </w:r>
-    </w:p>
-    <w:p>
-      <w:pPr>
-        <w:keepNext/>
-        <w:spacing w:line="300" w:lineRule="auto" w:after="100"/>
-      </w:pPr>
-      <w:r>
-        <w:rPr>
-          <w:rFonts w:ascii="宋体" w:hAnsi="宋体" w:eastAsia="宋体"/>
-          <w:b/>
-          <w:color w:val="000000"/>
-          <w:sz w:val="24"/>
-        </w:rPr>
-        <w:t>4.1 核心实现片段</w:t>
-      </w:r>
-    </w:p>
-    <w:p>
-      <w:pPr>
-        <w:spacing w:line="300" w:lineRule="auto" w:after="100"/>
-      </w:pPr>
-      <w:r>
-        <w:rPr>
-          <w:rFonts w:ascii="宋体" w:hAnsi="宋体" w:eastAsia="宋体"/>
-          <w:b w:val="0"/>
-          <w:color w:val="000000"/>
-          <w:sz w:val="21"/>
-        </w:rPr>
-        <w:t>以下片段摘自 tally_service.py，完整上下文与异常处理见随附源代码。</w:t>
-      </w:r>
-    </w:p>
-    <w:p>
-      <w:pPr>
-        <w:spacing w:after="0" w:line="240" w:lineRule="auto"/>
-      </w:pPr>
-      <w:r>
-        <w:rPr>
-          <w:rFonts w:ascii="Consolas" w:hAnsi="Consolas" w:eastAsia="Consolas"/>
-          <w:b w:val="0"/>
-          <w:color w:val="000000"/>
-          <w:sz w:val="17"/>
-        </w:rPr>
-        <w:t xml:space="preserve">    totals = [1] * len(config['options'])</w:t>
-      </w:r>
-    </w:p>
-    <w:p>
-      <w:pPr>
-        <w:spacing w:after="0" w:line="240" w:lineRule="auto"/>
-      </w:pPr>
-      <w:r>
-        <w:rPr>
-          <w:rFonts w:ascii="Consolas" w:hAnsi="Consolas" w:eastAsia="Consolas"/>
-          <w:b w:val="0"/>
-          <w:color w:val="000000"/>
-          <w:sz w:val="17"/>
-        </w:rPr>
-        <w:t xml:space="preserve">    for ballot in ballots:</w:t>
-      </w:r>
-    </w:p>
-    <w:p>
-      <w:pPr>
-        <w:spacing w:after="0" w:line="240" w:lineRule="auto"/>
-      </w:pPr>
-      <w:r>
-        <w:rPr>
-          <w:rFonts w:ascii="Consolas" w:hAnsi="Consolas" w:eastAsia="Consolas"/>
-          <w:b w:val="0"/>
-          <w:color w:val="000000"/>
-          <w:sz w:val="17"/>
-        </w:rPr>
-        <w:t xml:space="preserve">        for i, c in enumerate(ballot['ciphertexts']):</w:t>
-      </w:r>
-    </w:p>
-    <w:p>
-      <w:pPr>
-        <w:spacing w:after="0" w:line="240" w:lineRule="auto"/>
-      </w:pPr>
-      <w:r>
-        <w:rPr>
-          <w:rFonts w:ascii="Consolas" w:hAnsi="Consolas" w:eastAsia="Consolas"/>
-          <w:b w:val="0"/>
-          <w:color w:val="000000"/>
-          <w:sz w:val="17"/>
-        </w:rPr>
-        <w:t xml:space="preserve">            totals[i] = totals[i] * int(c) % pub.nsquare</w:t>
-      </w:r>
-    </w:p>
-    <w:p>
-      <w:pPr>
-        <w:spacing w:after="0" w:line="240" w:lineRule="auto"/>
-      </w:pPr>
-      <w:r>
-        <w:rPr>
-          <w:rFonts w:ascii="Consolas" w:hAnsi="Consolas" w:eastAsia="Consolas"/>
-          <w:b w:val="0"/>
-          <w:color w:val="000000"/>
-          <w:sz w:val="17"/>
-        </w:rPr>
-        <w:t xml:space="preserve">    return {'election_id': config['election_id'], 'manifest_sha256': digest(manifest),</w:t>
-      </w:r>
-    </w:p>
-    <w:p>
-      <w:pPr>
-        <w:spacing w:after="0" w:line="240" w:lineRule="auto"/>
-      </w:pPr>
-      <w:r>
-        <w:rPr>
-          <w:rFonts w:ascii="Consolas" w:hAnsi="Consolas" w:eastAsia="Consolas"/>
-          <w:b w:val="0"/>
-          <w:color w:val="000000"/>
-          <w:sz w:val="17"/>
-        </w:rPr>
-        <w:t xml:space="preserve">            'ciphertexts': [str(c) for c in totals], 'accepted': len(ballots),</w:t>
-      </w:r>
-    </w:p>
-    <w:p>
-      <w:pPr>
-        <w:spacing w:after="0" w:line="240" w:lineRule="auto"/>
-      </w:pPr>
-      <w:r>
-        <w:rPr>
-          <w:rFonts w:ascii="Consolas" w:hAnsi="Consolas" w:eastAsia="Consolas"/>
-          <w:b w:val="0"/>
-          <w:color w:val="000000"/>
-          <w:sz w:val="17"/>
-        </w:rPr>
-        <w:t xml:space="preserve">            'audit_ms': audit_ms, 'aggregate_ms': (perf_counter()-started)*1000}</w:t>
-      </w:r>
-    </w:p>
-    <w:p>
-      <w:pPr>
-        <w:keepNext/>
-        <w:spacing w:line="300" w:lineRule="auto" w:after="100"/>
-      </w:pPr>
-      <w:r>
-        <w:rPr>
-          <w:rFonts w:ascii="宋体" w:hAnsi="宋体" w:eastAsia="宋体"/>
-          <w:b/>
-          <w:color w:val="000000"/>
-          <w:sz w:val="24"/>
-        </w:rPr>
-        <w:t>4.2 本模块可重复实验步骤</w:t>
-      </w:r>
-    </w:p>
-    <w:p>
-      <w:pPr>
-        <w:spacing w:line="300" w:lineRule="auto" w:after="100"/>
-      </w:pPr>
-      <w:r>
-        <w:rPr>
-          <w:rFonts w:ascii="宋体" w:hAnsi="宋体" w:eastAsia="宋体"/>
-          <w:b w:val="0"/>
-          <w:color w:val="000000"/>
-          <w:sz w:val="22"/>
-        </w:rPr>
-        <w:t>1．打开已创建的3选项投票，先尝试在投票开放时计票，确认系统拒绝查询阶段结果。</w:t>
-      </w:r>
-    </w:p>
-    <w:p>
-      <w:pPr>
-        <w:spacing w:line="300" w:lineRule="auto" w:after="100"/>
-      </w:pPr>
-      <w:r>
-        <w:rPr>
-          <w:rFonts w:ascii="宋体" w:hAnsi="宋体" w:eastAsia="宋体"/>
-          <w:b w:val="0"/>
-          <w:color w:val="000000"/>
-          <w:sz w:val="22"/>
-        </w:rPr>
-        <w:t>2．按[0,1,0,2,0,1]准备6张合成测试票。关闭投票后进入汇总与结果页，输入保管口令，预期得到[3,2,1]。</w:t>
-      </w:r>
-    </w:p>
-    <w:p>
-      <w:pPr>
-        <w:spacing w:line="300" w:lineRule="auto" w:after="100"/>
-      </w:pPr>
-      <w:r>
-        <w:rPr>
-          <w:rFonts w:ascii="宋体" w:hAnsi="宋体" w:eastAsia="宋体"/>
-          <w:b w:val="0"/>
-          <w:color w:val="000000"/>
-          <w:sz w:val="22"/>
-        </w:rPr>
-        <w:t>3．导出无私钥公开包；在自动测试的独立目录中，仅凭公开文件重新计算汇总，比较密文向量完全一致。</w:t>
-      </w:r>
-    </w:p>
-    <w:p>
-      <w:pPr>
-        <w:spacing w:line="300" w:lineRule="auto" w:after="100"/>
-      </w:pPr>
-      <w:r>
-        <w:rPr>
-          <w:rFonts w:ascii="宋体" w:hAnsi="宋体" w:eastAsia="宋体"/>
-          <w:b w:val="0"/>
-          <w:color w:val="000000"/>
-          <w:sz w:val="22"/>
-        </w:rPr>
-        <w:t>4．将汇总请求中的向量替换为单张选票密文，独立解密端应拒绝，不应输出该票的明文。</w:t>
-      </w:r>
-    </w:p>
-    <w:p>
-      <w:pPr>
-        <w:spacing w:line="300" w:lineRule="auto" w:after="100"/>
-      </w:pPr>
-      <w:r>
-        <w:rPr>
-          <w:rFonts w:ascii="宋体" w:hAnsi="宋体" w:eastAsia="宋体"/>
-          <w:b w:val="0"/>
-          <w:color w:val="000000"/>
-          <w:sz w:val="22"/>
-        </w:rPr>
-        <w:t>5．分别执行零票和4选项实验，检查结果为[0,0]和[1,1,1,1]；检查总票数与接收数一致。</w:t>
-      </w:r>
-    </w:p>
-    <w:p>
-      <w:pPr>
-        <w:spacing w:line="300" w:lineRule="auto" w:after="100"/>
-      </w:pPr>
-      <w:r>
-        <w:rPr>
-          <w:rFonts w:ascii="宋体" w:hAnsi="宋体" w:eastAsia="宋体"/>
-          <w:b w:val="0"/>
-          <w:color w:val="000000"/>
-          <w:sz w:val="22"/>
-        </w:rPr>
-        <w:t>6．运行10、100、1000人三次重复实验，分别测量加密、汇总和解密原语耗时，保留原始运行记录。</w:t>
-      </w:r>
-    </w:p>
-    <w:p>
-      <w:pPr>
-        <w:keepNext/>
-        <w:pageBreakBefore/>
-        <w:spacing w:line="300" w:lineRule="auto" w:after="160"/>
-      </w:pPr>
-      <w:r>
-        <w:rPr>
-          <w:rFonts w:ascii="宋体" w:hAnsi="宋体" w:eastAsia="宋体"/>
-          <w:b/>
-          <w:color w:val="000000"/>
-          <w:sz w:val="28"/>
-        </w:rPr>
-        <w:t>五 课题完成过程中遇到的问题及解决方法</w:t>
-      </w:r>
-    </w:p>
-    <w:p>
-      <w:pPr>
-        <w:keepNext/>
-        <w:spacing w:line="300" w:lineRule="auto" w:after="100"/>
-      </w:pPr>
-      <w:r>
-        <w:rPr>
-          <w:rFonts w:ascii="宋体" w:hAnsi="宋体" w:eastAsia="宋体"/>
-          <w:b/>
-          <w:color w:val="000000"/>
-          <w:sz w:val="24"/>
-        </w:rPr>
-        <w:t>5.1 实验环境与记录来源</w:t>
-      </w:r>
-    </w:p>
-    <w:p>
-      <w:pPr>
-        <w:spacing w:line="300" w:lineRule="auto" w:after="100"/>
-        <w:ind w:firstLine="480"/>
-      </w:pPr>
-      <w:r>
-        <w:rPr>
-          <w:rFonts w:ascii="宋体" w:hAnsi="宋体" w:eastAsia="宋体"/>
-          <w:b w:val="0"/>
-          <w:color w:val="000000"/>
-          <w:sz w:val="22"/>
-        </w:rPr>
-        <w:t>实测日期为2026年10月26日。环境为Windows-11-10.0.22631-SP0，Python 3.12.14，phe 1.5.0，gmpy2 2.3.2，cryptography 50.0.2，PySide6 6.12.0。Paillier模数2048位；数据来自experiment_results.json，不使用预测值替代实测。</w:t>
-      </w:r>
-    </w:p>
-    <w:p>
-      <w:pPr>
-        <w:spacing w:line="300" w:lineRule="auto" w:after="100"/>
-        <w:ind w:firstLine="480"/>
-      </w:pPr>
-      <w:r>
-        <w:rPr>
-          <w:rFonts w:ascii="宋体" w:hAnsi="宋体" w:eastAsia="宋体"/>
-          <w:b w:val="0"/>
-          <w:color w:val="000000"/>
-          <w:sz w:val="22"/>
-        </w:rPr>
-        <w:t>自动核心实验共25项，25项通过。下表选取与本分工相关的用例；完整记录在test_cases.csv。‘通过’表示符合预期，完整回滚用例的通过表示局限被成功复现，并不表示系统能够抵御回滚。</w:t>
+      </w:pPr>
+      <w:r>
+        <w:t>表2 本模块测试结果</w:t>
       </w:r>
     </w:p>
     <w:tbl>
@@ -3316,12 +3445,17 @@
       <w:tr>
         <w:trPr>
           <w:tblHeader/>
+          <w:tblHeader/>
         </w:trPr>
         <w:tc>
           <w:tcPr>
             <w:tcW w:type="dxa" w:w="2551"/>
             <w:vAlign w:val="center"/>
             <w:tcBorders>
+              <w:top w:val="single" w:sz="4" w:color="D9D9D9"/>
+              <w:left w:val="single" w:sz="4" w:color="D9D9D9"/>
+              <w:bottom w:val="single" w:sz="4" w:color="D9D9D9"/>
+              <w:right w:val="single" w:sz="4" w:color="D9D9D9"/>
               <w:top w:val="single" w:sz="4" w:color="D9D9D9"/>
               <w:left w:val="single" w:sz="4" w:color="D9D9D9"/>
               <w:bottom w:val="single" w:sz="4" w:color="D9D9D9"/>
@@ -3337,11 +3471,11 @@
           </w:tcPr>
           <w:p>
             <w:pPr>
-              <w:spacing w:after="40" w:line="264" w:lineRule="auto"/>
-            </w:pPr>
-            <w:r>
-              <w:rPr>
-                <w:rFonts w:ascii="宋体" w:hAnsi="宋体" w:eastAsia="宋体"/>
+              <w:spacing w:after="40" w:line="288" w:lineRule="auto" w:before="40"/>
+            </w:pPr>
+            <w:r>
+              <w:rPr>
+                <w:rFonts w:ascii="Times New Roman" w:hAnsi="Times New Roman" w:eastAsia="宋体"/>
                 <w:b/>
                 <w:color w:val="000000"/>
                 <w:sz w:val="21"/>
@@ -3355,6 +3489,10 @@
             <w:tcW w:type="dxa" w:w="6633"/>
             <w:vAlign w:val="center"/>
             <w:tcBorders>
+              <w:top w:val="single" w:sz="4" w:color="D9D9D9"/>
+              <w:left w:val="single" w:sz="4" w:color="D9D9D9"/>
+              <w:bottom w:val="single" w:sz="4" w:color="D9D9D9"/>
+              <w:right w:val="single" w:sz="4" w:color="D9D9D9"/>
               <w:top w:val="single" w:sz="4" w:color="D9D9D9"/>
               <w:left w:val="single" w:sz="4" w:color="D9D9D9"/>
               <w:bottom w:val="single" w:sz="4" w:color="D9D9D9"/>
@@ -3370,11 +3508,11 @@
           </w:tcPr>
           <w:p>
             <w:pPr>
-              <w:spacing w:after="40" w:line="264" w:lineRule="auto"/>
-            </w:pPr>
-            <w:r>
-              <w:rPr>
-                <w:rFonts w:ascii="宋体" w:hAnsi="宋体" w:eastAsia="宋体"/>
+              <w:spacing w:after="40" w:line="288" w:lineRule="auto" w:before="40"/>
+            </w:pPr>
+            <w:r>
+              <w:rPr>
+                <w:rFonts w:ascii="Times New Roman" w:hAnsi="Times New Roman" w:eastAsia="宋体"/>
                 <w:b/>
                 <w:color w:val="000000"/>
                 <w:sz w:val="21"/>
@@ -3385,11 +3523,16 @@
         </w:tc>
       </w:tr>
       <w:tr>
+        <w:trPr/>
         <w:tc>
           <w:tcPr>
             <w:tcW w:type="dxa" w:w="2551"/>
             <w:vAlign w:val="center"/>
             <w:tcBorders>
+              <w:top w:val="single" w:sz="4" w:color="D9D9D9"/>
+              <w:left w:val="single" w:sz="4" w:color="D9D9D9"/>
+              <w:bottom w:val="single" w:sz="4" w:color="D9D9D9"/>
+              <w:right w:val="single" w:sz="4" w:color="D9D9D9"/>
               <w:top w:val="single" w:sz="4" w:color="D9D9D9"/>
               <w:left w:val="single" w:sz="4" w:color="D9D9D9"/>
               <w:bottom w:val="single" w:sz="4" w:color="D9D9D9"/>
@@ -3404,11 +3547,11 @@
           </w:tcPr>
           <w:p>
             <w:pPr>
-              <w:spacing w:after="40" w:line="264" w:lineRule="auto"/>
-            </w:pPr>
-            <w:r>
-              <w:rPr>
-                <w:rFonts w:ascii="宋体" w:hAnsi="宋体" w:eastAsia="宋体"/>
+              <w:spacing w:after="40" w:line="288" w:lineRule="auto" w:before="40"/>
+            </w:pPr>
+            <w:r>
+              <w:rPr>
+                <w:rFonts w:ascii="Times New Roman" w:hAnsi="Times New Roman" w:eastAsia="宋体"/>
                 <w:b w:val="0"/>
                 <w:color w:val="000000"/>
                 <w:sz w:val="21"/>
@@ -3422,6 +3565,10 @@
             <w:tcW w:type="dxa" w:w="6633"/>
             <w:vAlign w:val="center"/>
             <w:tcBorders>
+              <w:top w:val="single" w:sz="4" w:color="D9D9D9"/>
+              <w:left w:val="single" w:sz="4" w:color="D9D9D9"/>
+              <w:bottom w:val="single" w:sz="4" w:color="D9D9D9"/>
+              <w:right w:val="single" w:sz="4" w:color="D9D9D9"/>
               <w:top w:val="single" w:sz="4" w:color="D9D9D9"/>
               <w:left w:val="single" w:sz="4" w:color="D9D9D9"/>
               <w:bottom w:val="single" w:sz="4" w:color="D9D9D9"/>
@@ -3436,11 +3583,11 @@
           </w:tcPr>
           <w:p>
             <w:pPr>
-              <w:spacing w:after="40" w:line="264" w:lineRule="auto"/>
-            </w:pPr>
-            <w:r>
-              <w:rPr>
-                <w:rFonts w:ascii="宋体" w:hAnsi="宋体" w:eastAsia="宋体"/>
+              <w:spacing w:after="40" w:line="288" w:lineRule="auto" w:before="40"/>
+            </w:pPr>
+            <w:r>
+              <w:rPr>
+                <w:rFonts w:ascii="Times New Roman" w:hAnsi="Times New Roman" w:eastAsia="宋体"/>
                 <w:b w:val="0"/>
                 <w:color w:val="000000"/>
                 <w:sz w:val="21"/>
@@ -3451,11 +3598,16 @@
         </w:tc>
       </w:tr>
       <w:tr>
+        <w:trPr/>
         <w:tc>
           <w:tcPr>
             <w:tcW w:type="dxa" w:w="2551"/>
             <w:vAlign w:val="center"/>
             <w:tcBorders>
+              <w:top w:val="single" w:sz="4" w:color="D9D9D9"/>
+              <w:left w:val="single" w:sz="4" w:color="D9D9D9"/>
+              <w:bottom w:val="single" w:sz="4" w:color="D9D9D9"/>
+              <w:right w:val="single" w:sz="4" w:color="D9D9D9"/>
               <w:top w:val="single" w:sz="4" w:color="D9D9D9"/>
               <w:left w:val="single" w:sz="4" w:color="D9D9D9"/>
               <w:bottom w:val="single" w:sz="4" w:color="D9D9D9"/>
@@ -3470,11 +3622,11 @@
           </w:tcPr>
           <w:p>
             <w:pPr>
-              <w:spacing w:after="40" w:line="264" w:lineRule="auto"/>
-            </w:pPr>
-            <w:r>
-              <w:rPr>
-                <w:rFonts w:ascii="宋体" w:hAnsi="宋体" w:eastAsia="宋体"/>
+              <w:spacing w:after="40" w:line="288" w:lineRule="auto" w:before="40"/>
+            </w:pPr>
+            <w:r>
+              <w:rPr>
+                <w:rFonts w:ascii="Times New Roman" w:hAnsi="Times New Roman" w:eastAsia="宋体"/>
                 <w:b w:val="0"/>
                 <w:color w:val="000000"/>
                 <w:sz w:val="21"/>
@@ -3488,6 +3640,10 @@
             <w:tcW w:type="dxa" w:w="6633"/>
             <w:vAlign w:val="center"/>
             <w:tcBorders>
+              <w:top w:val="single" w:sz="4" w:color="D9D9D9"/>
+              <w:left w:val="single" w:sz="4" w:color="D9D9D9"/>
+              <w:bottom w:val="single" w:sz="4" w:color="D9D9D9"/>
+              <w:right w:val="single" w:sz="4" w:color="D9D9D9"/>
               <w:top w:val="single" w:sz="4" w:color="D9D9D9"/>
               <w:left w:val="single" w:sz="4" w:color="D9D9D9"/>
               <w:bottom w:val="single" w:sz="4" w:color="D9D9D9"/>
@@ -3502,11 +3658,11 @@
           </w:tcPr>
           <w:p>
             <w:pPr>
-              <w:spacing w:after="40" w:line="264" w:lineRule="auto"/>
-            </w:pPr>
-            <w:r>
-              <w:rPr>
-                <w:rFonts w:ascii="宋体" w:hAnsi="宋体" w:eastAsia="宋体"/>
+              <w:spacing w:after="40" w:line="288" w:lineRule="auto" w:before="40"/>
+            </w:pPr>
+            <w:r>
+              <w:rPr>
+                <w:rFonts w:ascii="Times New Roman" w:hAnsi="Times New Roman" w:eastAsia="宋体"/>
                 <w:b w:val="0"/>
                 <w:color w:val="000000"/>
                 <w:sz w:val="21"/>
@@ -3517,11 +3673,16 @@
         </w:tc>
       </w:tr>
       <w:tr>
+        <w:trPr/>
         <w:tc>
           <w:tcPr>
             <w:tcW w:type="dxa" w:w="2551"/>
             <w:vAlign w:val="center"/>
             <w:tcBorders>
+              <w:top w:val="single" w:sz="4" w:color="D9D9D9"/>
+              <w:left w:val="single" w:sz="4" w:color="D9D9D9"/>
+              <w:bottom w:val="single" w:sz="4" w:color="D9D9D9"/>
+              <w:right w:val="single" w:sz="4" w:color="D9D9D9"/>
               <w:top w:val="single" w:sz="4" w:color="D9D9D9"/>
               <w:left w:val="single" w:sz="4" w:color="D9D9D9"/>
               <w:bottom w:val="single" w:sz="4" w:color="D9D9D9"/>
@@ -3536,11 +3697,11 @@
           </w:tcPr>
           <w:p>
             <w:pPr>
-              <w:spacing w:after="40" w:line="264" w:lineRule="auto"/>
-            </w:pPr>
-            <w:r>
-              <w:rPr>
-                <w:rFonts w:ascii="宋体" w:hAnsi="宋体" w:eastAsia="宋体"/>
+              <w:spacing w:after="40" w:line="288" w:lineRule="auto" w:before="40"/>
+            </w:pPr>
+            <w:r>
+              <w:rPr>
+                <w:rFonts w:ascii="Times New Roman" w:hAnsi="Times New Roman" w:eastAsia="宋体"/>
                 <w:b w:val="0"/>
                 <w:color w:val="000000"/>
                 <w:sz w:val="21"/>
@@ -3554,6 +3715,10 @@
             <w:tcW w:type="dxa" w:w="6633"/>
             <w:vAlign w:val="center"/>
             <w:tcBorders>
+              <w:top w:val="single" w:sz="4" w:color="D9D9D9"/>
+              <w:left w:val="single" w:sz="4" w:color="D9D9D9"/>
+              <w:bottom w:val="single" w:sz="4" w:color="D9D9D9"/>
+              <w:right w:val="single" w:sz="4" w:color="D9D9D9"/>
               <w:top w:val="single" w:sz="4" w:color="D9D9D9"/>
               <w:left w:val="single" w:sz="4" w:color="D9D9D9"/>
               <w:bottom w:val="single" w:sz="4" w:color="D9D9D9"/>
@@ -3568,11 +3733,11 @@
           </w:tcPr>
           <w:p>
             <w:pPr>
-              <w:spacing w:after="40" w:line="264" w:lineRule="auto"/>
-            </w:pPr>
-            <w:r>
-              <w:rPr>
-                <w:rFonts w:ascii="宋体" w:hAnsi="宋体" w:eastAsia="宋体"/>
+              <w:spacing w:after="40" w:line="288" w:lineRule="auto" w:before="40"/>
+            </w:pPr>
+            <w:r>
+              <w:rPr>
+                <w:rFonts w:ascii="Times New Roman" w:hAnsi="Times New Roman" w:eastAsia="宋体"/>
                 <w:b w:val="0"/>
                 <w:color w:val="000000"/>
                 <w:sz w:val="21"/>
@@ -3583,11 +3748,16 @@
         </w:tc>
       </w:tr>
       <w:tr>
+        <w:trPr/>
         <w:tc>
           <w:tcPr>
             <w:tcW w:type="dxa" w:w="2551"/>
             <w:vAlign w:val="center"/>
             <w:tcBorders>
+              <w:top w:val="single" w:sz="4" w:color="D9D9D9"/>
+              <w:left w:val="single" w:sz="4" w:color="D9D9D9"/>
+              <w:bottom w:val="single" w:sz="4" w:color="D9D9D9"/>
+              <w:right w:val="single" w:sz="4" w:color="D9D9D9"/>
               <w:top w:val="single" w:sz="4" w:color="D9D9D9"/>
               <w:left w:val="single" w:sz="4" w:color="D9D9D9"/>
               <w:bottom w:val="single" w:sz="4" w:color="D9D9D9"/>
@@ -3602,11 +3772,11 @@
           </w:tcPr>
           <w:p>
             <w:pPr>
-              <w:spacing w:after="40" w:line="264" w:lineRule="auto"/>
-            </w:pPr>
-            <w:r>
-              <w:rPr>
-                <w:rFonts w:ascii="宋体" w:hAnsi="宋体" w:eastAsia="宋体"/>
+              <w:spacing w:after="40" w:line="288" w:lineRule="auto" w:before="40"/>
+            </w:pPr>
+            <w:r>
+              <w:rPr>
+                <w:rFonts w:ascii="Times New Roman" w:hAnsi="Times New Roman" w:eastAsia="宋体"/>
                 <w:b w:val="0"/>
                 <w:color w:val="000000"/>
                 <w:sz w:val="21"/>
@@ -3620,6 +3790,10 @@
             <w:tcW w:type="dxa" w:w="6633"/>
             <w:vAlign w:val="center"/>
             <w:tcBorders>
+              <w:top w:val="single" w:sz="4" w:color="D9D9D9"/>
+              <w:left w:val="single" w:sz="4" w:color="D9D9D9"/>
+              <w:bottom w:val="single" w:sz="4" w:color="D9D9D9"/>
+              <w:right w:val="single" w:sz="4" w:color="D9D9D9"/>
               <w:top w:val="single" w:sz="4" w:color="D9D9D9"/>
               <w:left w:val="single" w:sz="4" w:color="D9D9D9"/>
               <w:bottom w:val="single" w:sz="4" w:color="D9D9D9"/>
@@ -3634,11 +3808,11 @@
           </w:tcPr>
           <w:p>
             <w:pPr>
-              <w:spacing w:after="40" w:line="264" w:lineRule="auto"/>
-            </w:pPr>
-            <w:r>
-              <w:rPr>
-                <w:rFonts w:ascii="宋体" w:hAnsi="宋体" w:eastAsia="宋体"/>
+              <w:spacing w:after="40" w:line="288" w:lineRule="auto" w:before="40"/>
+            </w:pPr>
+            <w:r>
+              <w:rPr>
+                <w:rFonts w:ascii="Times New Roman" w:hAnsi="Times New Roman" w:eastAsia="宋体"/>
                 <w:b w:val="0"/>
                 <w:color w:val="000000"/>
                 <w:sz w:val="21"/>
@@ -3649,11 +3823,16 @@
         </w:tc>
       </w:tr>
       <w:tr>
+        <w:trPr/>
         <w:tc>
           <w:tcPr>
             <w:tcW w:type="dxa" w:w="2551"/>
             <w:vAlign w:val="center"/>
             <w:tcBorders>
+              <w:top w:val="single" w:sz="4" w:color="D9D9D9"/>
+              <w:left w:val="single" w:sz="4" w:color="D9D9D9"/>
+              <w:bottom w:val="single" w:sz="4" w:color="D9D9D9"/>
+              <w:right w:val="single" w:sz="4" w:color="D9D9D9"/>
               <w:top w:val="single" w:sz="4" w:color="D9D9D9"/>
               <w:left w:val="single" w:sz="4" w:color="D9D9D9"/>
               <w:bottom w:val="single" w:sz="4" w:color="D9D9D9"/>
@@ -3668,11 +3847,11 @@
           </w:tcPr>
           <w:p>
             <w:pPr>
-              <w:spacing w:after="40" w:line="264" w:lineRule="auto"/>
-            </w:pPr>
-            <w:r>
-              <w:rPr>
-                <w:rFonts w:ascii="宋体" w:hAnsi="宋体" w:eastAsia="宋体"/>
+              <w:spacing w:after="40" w:line="288" w:lineRule="auto" w:before="40"/>
+            </w:pPr>
+            <w:r>
+              <w:rPr>
+                <w:rFonts w:ascii="Times New Roman" w:hAnsi="Times New Roman" w:eastAsia="宋体"/>
                 <w:b w:val="0"/>
                 <w:color w:val="000000"/>
                 <w:sz w:val="21"/>
@@ -3686,6 +3865,10 @@
             <w:tcW w:type="dxa" w:w="6633"/>
             <w:vAlign w:val="center"/>
             <w:tcBorders>
+              <w:top w:val="single" w:sz="4" w:color="D9D9D9"/>
+              <w:left w:val="single" w:sz="4" w:color="D9D9D9"/>
+              <w:bottom w:val="single" w:sz="4" w:color="D9D9D9"/>
+              <w:right w:val="single" w:sz="4" w:color="D9D9D9"/>
               <w:top w:val="single" w:sz="4" w:color="D9D9D9"/>
               <w:left w:val="single" w:sz="4" w:color="D9D9D9"/>
               <w:bottom w:val="single" w:sz="4" w:color="D9D9D9"/>
@@ -3700,11 +3883,11 @@
           </w:tcPr>
           <w:p>
             <w:pPr>
-              <w:spacing w:after="40" w:line="264" w:lineRule="auto"/>
-            </w:pPr>
-            <w:r>
-              <w:rPr>
-                <w:rFonts w:ascii="宋体" w:hAnsi="宋体" w:eastAsia="宋体"/>
+              <w:spacing w:after="40" w:line="288" w:lineRule="auto" w:before="40"/>
+            </w:pPr>
+            <w:r>
+              <w:rPr>
+                <w:rFonts w:ascii="Times New Roman" w:hAnsi="Times New Roman" w:eastAsia="宋体"/>
                 <w:b w:val="0"/>
                 <w:color w:val="000000"/>
                 <w:sz w:val="21"/>
@@ -3715,11 +3898,16 @@
         </w:tc>
       </w:tr>
       <w:tr>
+        <w:trPr/>
         <w:tc>
           <w:tcPr>
             <w:tcW w:type="dxa" w:w="2551"/>
             <w:vAlign w:val="center"/>
             <w:tcBorders>
+              <w:top w:val="single" w:sz="4" w:color="D9D9D9"/>
+              <w:left w:val="single" w:sz="4" w:color="D9D9D9"/>
+              <w:bottom w:val="single" w:sz="4" w:color="D9D9D9"/>
+              <w:right w:val="single" w:sz="4" w:color="D9D9D9"/>
               <w:top w:val="single" w:sz="4" w:color="D9D9D9"/>
               <w:left w:val="single" w:sz="4" w:color="D9D9D9"/>
               <w:bottom w:val="single" w:sz="4" w:color="D9D9D9"/>
@@ -3734,11 +3922,11 @@
           </w:tcPr>
           <w:p>
             <w:pPr>
-              <w:spacing w:after="40" w:line="264" w:lineRule="auto"/>
-            </w:pPr>
-            <w:r>
-              <w:rPr>
-                <w:rFonts w:ascii="宋体" w:hAnsi="宋体" w:eastAsia="宋体"/>
+              <w:spacing w:after="40" w:line="288" w:lineRule="auto" w:before="40"/>
+            </w:pPr>
+            <w:r>
+              <w:rPr>
+                <w:rFonts w:ascii="Times New Roman" w:hAnsi="Times New Roman" w:eastAsia="宋体"/>
                 <w:b w:val="0"/>
                 <w:color w:val="000000"/>
                 <w:sz w:val="21"/>
@@ -3752,6 +3940,10 @@
             <w:tcW w:type="dxa" w:w="6633"/>
             <w:vAlign w:val="center"/>
             <w:tcBorders>
+              <w:top w:val="single" w:sz="4" w:color="D9D9D9"/>
+              <w:left w:val="single" w:sz="4" w:color="D9D9D9"/>
+              <w:bottom w:val="single" w:sz="4" w:color="D9D9D9"/>
+              <w:right w:val="single" w:sz="4" w:color="D9D9D9"/>
               <w:top w:val="single" w:sz="4" w:color="D9D9D9"/>
               <w:left w:val="single" w:sz="4" w:color="D9D9D9"/>
               <w:bottom w:val="single" w:sz="4" w:color="D9D9D9"/>
@@ -3766,11 +3958,11 @@
           </w:tcPr>
           <w:p>
             <w:pPr>
-              <w:spacing w:after="40" w:line="264" w:lineRule="auto"/>
-            </w:pPr>
-            <w:r>
-              <w:rPr>
-                <w:rFonts w:ascii="宋体" w:hAnsi="宋体" w:eastAsia="宋体"/>
+              <w:spacing w:after="40" w:line="288" w:lineRule="auto" w:before="40"/>
+            </w:pPr>
+            <w:r>
+              <w:rPr>
+                <w:rFonts w:ascii="Times New Roman" w:hAnsi="Times New Roman" w:eastAsia="宋体"/>
                 <w:b w:val="0"/>
                 <w:color w:val="000000"/>
                 <w:sz w:val="21"/>
@@ -3781,11 +3973,16 @@
         </w:tc>
       </w:tr>
       <w:tr>
+        <w:trPr/>
         <w:tc>
           <w:tcPr>
             <w:tcW w:type="dxa" w:w="2551"/>
             <w:vAlign w:val="center"/>
             <w:tcBorders>
+              <w:top w:val="single" w:sz="4" w:color="D9D9D9"/>
+              <w:left w:val="single" w:sz="4" w:color="D9D9D9"/>
+              <w:bottom w:val="single" w:sz="4" w:color="D9D9D9"/>
+              <w:right w:val="single" w:sz="4" w:color="D9D9D9"/>
               <w:top w:val="single" w:sz="4" w:color="D9D9D9"/>
               <w:left w:val="single" w:sz="4" w:color="D9D9D9"/>
               <w:bottom w:val="single" w:sz="4" w:color="D9D9D9"/>
@@ -3800,11 +3997,11 @@
           </w:tcPr>
           <w:p>
             <w:pPr>
-              <w:spacing w:after="40" w:line="264" w:lineRule="auto"/>
-            </w:pPr>
-            <w:r>
-              <w:rPr>
-                <w:rFonts w:ascii="宋体" w:hAnsi="宋体" w:eastAsia="宋体"/>
+              <w:spacing w:after="40" w:line="288" w:lineRule="auto" w:before="40"/>
+            </w:pPr>
+            <w:r>
+              <w:rPr>
+                <w:rFonts w:ascii="Times New Roman" w:hAnsi="Times New Roman" w:eastAsia="宋体"/>
                 <w:b w:val="0"/>
                 <w:color w:val="000000"/>
                 <w:sz w:val="21"/>
@@ -3818,6 +4015,10 @@
             <w:tcW w:type="dxa" w:w="6633"/>
             <w:vAlign w:val="center"/>
             <w:tcBorders>
+              <w:top w:val="single" w:sz="4" w:color="D9D9D9"/>
+              <w:left w:val="single" w:sz="4" w:color="D9D9D9"/>
+              <w:bottom w:val="single" w:sz="4" w:color="D9D9D9"/>
+              <w:right w:val="single" w:sz="4" w:color="D9D9D9"/>
               <w:top w:val="single" w:sz="4" w:color="D9D9D9"/>
               <w:left w:val="single" w:sz="4" w:color="D9D9D9"/>
               <w:bottom w:val="single" w:sz="4" w:color="D9D9D9"/>
@@ -3832,11 +4033,11 @@
           </w:tcPr>
           <w:p>
             <w:pPr>
-              <w:spacing w:after="40" w:line="264" w:lineRule="auto"/>
-            </w:pPr>
-            <w:r>
-              <w:rPr>
-                <w:rFonts w:ascii="宋体" w:hAnsi="宋体" w:eastAsia="宋体"/>
+              <w:spacing w:after="40" w:line="288" w:lineRule="auto" w:before="40"/>
+            </w:pPr>
+            <w:r>
+              <w:rPr>
+                <w:rFonts w:ascii="Times New Roman" w:hAnsi="Times New Roman" w:eastAsia="宋体"/>
                 <w:b w:val="0"/>
                 <w:color w:val="000000"/>
                 <w:sz w:val="21"/>
@@ -3847,11 +4048,16 @@
         </w:tc>
       </w:tr>
       <w:tr>
+        <w:trPr/>
         <w:tc>
           <w:tcPr>
             <w:tcW w:type="dxa" w:w="2551"/>
             <w:vAlign w:val="center"/>
             <w:tcBorders>
+              <w:top w:val="single" w:sz="4" w:color="D9D9D9"/>
+              <w:left w:val="single" w:sz="4" w:color="D9D9D9"/>
+              <w:bottom w:val="single" w:sz="4" w:color="D9D9D9"/>
+              <w:right w:val="single" w:sz="4" w:color="D9D9D9"/>
               <w:top w:val="single" w:sz="4" w:color="D9D9D9"/>
               <w:left w:val="single" w:sz="4" w:color="D9D9D9"/>
               <w:bottom w:val="single" w:sz="4" w:color="D9D9D9"/>
@@ -3866,11 +4072,11 @@
           </w:tcPr>
           <w:p>
             <w:pPr>
-              <w:spacing w:after="40" w:line="264" w:lineRule="auto"/>
-            </w:pPr>
-            <w:r>
-              <w:rPr>
-                <w:rFonts w:ascii="宋体" w:hAnsi="宋体" w:eastAsia="宋体"/>
+              <w:spacing w:after="40" w:line="288" w:lineRule="auto" w:before="40"/>
+            </w:pPr>
+            <w:r>
+              <w:rPr>
+                <w:rFonts w:ascii="Times New Roman" w:hAnsi="Times New Roman" w:eastAsia="宋体"/>
                 <w:b w:val="0"/>
                 <w:color w:val="000000"/>
                 <w:sz w:val="21"/>
@@ -3884,6 +4090,10 @@
             <w:tcW w:type="dxa" w:w="6633"/>
             <w:vAlign w:val="center"/>
             <w:tcBorders>
+              <w:top w:val="single" w:sz="4" w:color="D9D9D9"/>
+              <w:left w:val="single" w:sz="4" w:color="D9D9D9"/>
+              <w:bottom w:val="single" w:sz="4" w:color="D9D9D9"/>
+              <w:right w:val="single" w:sz="4" w:color="D9D9D9"/>
               <w:top w:val="single" w:sz="4" w:color="D9D9D9"/>
               <w:left w:val="single" w:sz="4" w:color="D9D9D9"/>
               <w:bottom w:val="single" w:sz="4" w:color="D9D9D9"/>
@@ -3898,11 +4108,11 @@
           </w:tcPr>
           <w:p>
             <w:pPr>
-              <w:spacing w:after="40" w:line="264" w:lineRule="auto"/>
-            </w:pPr>
-            <w:r>
-              <w:rPr>
-                <w:rFonts w:ascii="宋体" w:hAnsi="宋体" w:eastAsia="宋体"/>
+              <w:spacing w:after="40" w:line="288" w:lineRule="auto" w:before="40"/>
+            </w:pPr>
+            <w:r>
+              <w:rPr>
+                <w:rFonts w:ascii="Times New Roman" w:hAnsi="Times New Roman" w:eastAsia="宋体"/>
                 <w:b w:val="0"/>
                 <w:color w:val="000000"/>
                 <w:sz w:val="21"/>
@@ -3912,96 +4122,192 @@
           </w:p>
         </w:tc>
       </w:tr>
+      <w:tr>
+        <w:trPr/>
+        <w:tc>
+          <w:tcPr>
+            <w:tcW w:type="dxa" w:w="2551"/>
+            <w:tcBorders>
+              <w:top w:val="single" w:sz="4" w:color="D9D9D9"/>
+              <w:left w:val="single" w:sz="4" w:color="D9D9D9"/>
+              <w:bottom w:val="single" w:sz="4" w:color="D9D9D9"/>
+              <w:right w:val="single" w:sz="4" w:color="D9D9D9"/>
+            </w:tcBorders>
+          </w:tcPr>
+          <w:p>
+            <w:pPr>
+              <w:spacing w:line="288" w:lineRule="auto" w:after="40" w:before="40"/>
+            </w:pPr>
+            <w:r>
+              <w:rPr>
+                <w:rFonts w:ascii="Times New Roman" w:hAnsi="Times New Roman" w:eastAsia="宋体"/>
+                <w:b w:val="0"/>
+                <w:color w:val="000000"/>
+                <w:sz w:val="21"/>
+              </w:rPr>
+              <w:t>单人投票隐私局限</w:t>
+            </w:r>
+          </w:p>
+        </w:tc>
+        <w:tc>
+          <w:tcPr>
+            <w:tcW w:type="dxa" w:w="6633"/>
+            <w:tcBorders>
+              <w:top w:val="single" w:sz="4" w:color="D9D9D9"/>
+              <w:left w:val="single" w:sz="4" w:color="D9D9D9"/>
+              <w:bottom w:val="single" w:sz="4" w:color="D9D9D9"/>
+              <w:right w:val="single" w:sz="4" w:color="D9D9D9"/>
+            </w:tcBorders>
+          </w:tcPr>
+          <w:p>
+            <w:pPr>
+              <w:spacing w:line="288" w:lineRule="auto" w:after="40" w:before="40"/>
+            </w:pPr>
+            <w:r>
+              <w:rPr>
+                <w:rFonts w:ascii="Times New Roman" w:hAnsi="Times New Roman" w:eastAsia="宋体"/>
+                <w:b w:val="0"/>
+                <w:color w:val="000000"/>
+                <w:sz w:val="21"/>
+              </w:rPr>
+              <w:t>一人总票[0,1]直接暴露该人的选择</w:t>
+            </w:r>
+          </w:p>
+        </w:tc>
+      </w:tr>
+      <w:tr>
+        <w:trPr/>
+        <w:tc>
+          <w:tcPr>
+            <w:tcW w:type="dxa" w:w="2551"/>
+            <w:tcBorders>
+              <w:top w:val="single" w:sz="4" w:color="D9D9D9"/>
+              <w:left w:val="single" w:sz="4" w:color="D9D9D9"/>
+              <w:bottom w:val="single" w:sz="4" w:color="D9D9D9"/>
+              <w:right w:val="single" w:sz="4" w:color="D9D9D9"/>
+            </w:tcBorders>
+          </w:tcPr>
+          <w:p>
+            <w:pPr>
+              <w:spacing w:line="288" w:lineRule="auto" w:after="40" w:before="40"/>
+            </w:pPr>
+            <w:r>
+              <w:rPr>
+                <w:rFonts w:ascii="Times New Roman" w:hAnsi="Times New Roman" w:eastAsia="宋体"/>
+                <w:b w:val="0"/>
+                <w:color w:val="000000"/>
+                <w:sz w:val="21"/>
+              </w:rPr>
+              <w:t>非法选票组合局限</w:t>
+            </w:r>
+          </w:p>
+        </w:tc>
+        <w:tc>
+          <w:tcPr>
+            <w:tcW w:type="dxa" w:w="6633"/>
+            <w:tcBorders>
+              <w:top w:val="single" w:sz="4" w:color="D9D9D9"/>
+              <w:left w:val="single" w:sz="4" w:color="D9D9D9"/>
+              <w:bottom w:val="single" w:sz="4" w:color="D9D9D9"/>
+              <w:right w:val="single" w:sz="4" w:color="D9D9D9"/>
+            </w:tcBorders>
+          </w:tcPr>
+          <w:p>
+            <w:pPr>
+              <w:spacing w:line="288" w:lineRule="auto" w:after="40" w:before="40"/>
+            </w:pPr>
+            <w:r>
+              <w:rPr>
+                <w:rFonts w:ascii="Times New Roman" w:hAnsi="Times New Roman" w:eastAsia="宋体"/>
+                <w:b w:val="0"/>
+                <w:color w:val="000000"/>
+                <w:sz w:val="21"/>
+              </w:rPr>
+              <w:t>总和约束不能替代逐票独热合法性证明</w:t>
+            </w:r>
+          </w:p>
+        </w:tc>
+      </w:tr>
     </w:tbl>
     <w:p>
       <w:pPr>
+        <w:pStyle w:val="ReportH2"/>
+      </w:pPr>
+      <w:r>
+        <w:rPr>
+          <w:rFonts w:ascii="Times New Roman" w:hAnsi="Times New Roman" w:eastAsia="宋体"/>
+          <w:b/>
+          <w:color w:val="000000"/>
+          <w:sz w:val="24"/>
+        </w:rPr>
+        <w:t>5.2 失败案例与误报分析</w:t>
+      </w:r>
+    </w:p>
+    <w:p>
+      <w:pPr>
+        <w:pStyle w:val="ReportBody"/>
+      </w:pPr>
+      <w:r>
+        <w:rPr>
+          <w:rFonts w:ascii="Times New Roman" w:hAnsi="Times New Roman" w:eastAsia="宋体"/>
+          <w:b w:val="0"/>
+          <w:color w:val="000000"/>
+          <w:sz w:val="24"/>
+        </w:rPr>
+        <w:t>失败与边界：直接接受外部任意密文会把系统变成解密查询接口。本实现对完整汇总复算并比较，实际单票替换实验得到拒绝。开放期间也禁止查询，减少差分推断。</w:t>
+      </w:r>
+    </w:p>
+    <w:p>
+      <w:pPr>
+        <w:pStyle w:val="ReportBody"/>
+      </w:pPr>
+      <w:r>
+        <w:rPr>
+          <w:rFonts w:ascii="Times New Roman" w:hAnsi="Times New Roman" w:eastAsia="宋体"/>
+          <w:b w:val="0"/>
+          <w:color w:val="000000"/>
+          <w:sz w:val="24"/>
+        </w:rPr>
+        <w:t>误报分析：使用过期清单生成的合法汇总请求可能被拒绝；这属于快照不一致。正确操作是重新读取当前关闭状态后生成汇总，不应跳过摘要检查。</w:t>
+      </w:r>
+    </w:p>
+    <w:p>
+      <w:pPr>
+        <w:pStyle w:val="ReportBody"/>
+      </w:pPr>
+      <w:r>
+        <w:rPr>
+          <w:rFonts w:ascii="Times New Roman" w:hAnsi="Times New Roman" w:eastAsia="宋体"/>
+          <w:b w:val="0"/>
+          <w:color w:val="000000"/>
+          <w:sz w:val="24"/>
+        </w:rPr>
+        <w:t>安全局限：一人投票时总票数本身暴露其选择，关闭投票不能解决小群体隐私。总和约束能发现[2,0]形式的异常，但恶意票之间相互抵消时仍可能通过；需要合法性证明才能进一步防护。</w:t>
+      </w:r>
+    </w:p>
+    <w:p>
+      <w:pPr>
+        <w:pStyle w:val="ReportH2"/>
+      </w:pPr>
+      <w:r>
+        <w:t>5.3 性能数据与结果分析</w:t>
+      </w:r>
+    </w:p>
+    <w:p>
+      <w:pPr>
+        <w:pStyle w:val="ReportBody"/>
+      </w:pPr>
+      <w:r>
+        <w:t>对10、100、1000名投票者各做3次三选项实验。合成明文使用种子20261026加重复序号，密码学随机数不固定；每次均核对解密计数与预期。表3取本轮JSON中的算术平均值，单位毫秒。</w:t>
+      </w:r>
+    </w:p>
+    <w:p>
+      <w:pPr>
+        <w:pStyle w:val="ReportCaption"/>
         <w:keepNext/>
-        <w:spacing w:line="300" w:lineRule="auto" w:after="100"/>
-      </w:pPr>
-      <w:r>
-        <w:rPr>
-          <w:rFonts w:ascii="宋体" w:hAnsi="宋体" w:eastAsia="宋体"/>
-          <w:b/>
-          <w:color w:val="000000"/>
-          <w:sz w:val="24"/>
-        </w:rPr>
-        <w:t>5.2 失败案例与误报分析</w:t>
-      </w:r>
-    </w:p>
-    <w:p>
-      <w:pPr>
-        <w:spacing w:line="300" w:lineRule="auto" w:after="120"/>
-        <w:ind w:firstLine="480"/>
-      </w:pPr>
-      <w:r>
-        <w:rPr>
-          <w:rFonts w:ascii="宋体" w:hAnsi="宋体" w:eastAsia="宋体"/>
-          <w:b w:val="0"/>
-          <w:color w:val="000000"/>
-          <w:sz w:val="22"/>
-        </w:rPr>
-        <w:t>失败与边界：直接接受外部任意密文会把系统变成解密查询接口。本实现对完整汇总复算并比较，实际单票替换实验得到拒绝。开放期间也禁止查询，减少差分推断。</w:t>
-      </w:r>
-    </w:p>
-    <w:p>
-      <w:pPr>
-        <w:spacing w:line="300" w:lineRule="auto" w:after="120"/>
-        <w:ind w:firstLine="480"/>
-      </w:pPr>
-      <w:r>
-        <w:rPr>
-          <w:rFonts w:ascii="宋体" w:hAnsi="宋体" w:eastAsia="宋体"/>
-          <w:b w:val="0"/>
-          <w:color w:val="000000"/>
-          <w:sz w:val="22"/>
-        </w:rPr>
-        <w:t>误报分析：使用过期清单生成的合法汇总请求可能被拒绝；这属于快照不一致。正确操作是重新读取当前关闭状态后生成汇总，不应跳过摘要检查。</w:t>
-      </w:r>
-    </w:p>
-    <w:p>
-      <w:pPr>
-        <w:spacing w:line="300" w:lineRule="auto" w:after="120"/>
-        <w:ind w:firstLine="480"/>
-      </w:pPr>
-      <w:r>
-        <w:rPr>
-          <w:rFonts w:ascii="宋体" w:hAnsi="宋体" w:eastAsia="宋体"/>
-          <w:b w:val="0"/>
-          <w:color w:val="000000"/>
-          <w:sz w:val="22"/>
-        </w:rPr>
-        <w:t>安全局限：一人投票时总票数本身暴露其选择，关闭投票不能解决小群体隐私。总和约束能发现[2,0]形式的异常，但恶意票之间相互抵消时仍可能通过；需要合法性证明才能进一步防护。</w:t>
-      </w:r>
-    </w:p>
-    <w:p>
-      <w:pPr>
-        <w:keepNext/>
-        <w:pageBreakBefore/>
-        <w:spacing w:line="300" w:lineRule="auto" w:after="160"/>
-      </w:pPr>
-      <w:r>
-        <w:rPr>
-          <w:rFonts w:ascii="宋体" w:hAnsi="宋体" w:eastAsia="宋体"/>
-          <w:b/>
-          <w:color w:val="000000"/>
-          <w:sz w:val="28"/>
-        </w:rPr>
-        <w:t>性能数据与结果分析</w:t>
-      </w:r>
-    </w:p>
-    <w:p>
-      <w:pPr>
-        <w:spacing w:line="300" w:lineRule="auto" w:after="100"/>
-        <w:ind w:firstLine="480"/>
-      </w:pPr>
-      <w:r>
-        <w:rPr>
-          <w:rFonts w:ascii="宋体" w:hAnsi="宋体" w:eastAsia="宋体"/>
-          <w:b w:val="0"/>
-          <w:color w:val="000000"/>
-          <w:sz w:val="22"/>
-        </w:rPr>
-        <w:t>对10、100、1000名投票者分别进行3次三选项实验。明文选项用固定种子20261026加重复序号生成，使预期总票可复算；密码学随机数保持系统随机。计时使用perf_counter，以下为三次算术平均，单位毫秒。</w:t>
+      </w:pPr>
+      <w:r>
+        <w:t>表3 加密 汇总与解密实测均值</w:t>
       </w:r>
     </w:p>
     <w:tbl>
@@ -4020,12 +4326,17 @@
       <w:tr>
         <w:trPr>
           <w:tblHeader/>
+          <w:tblHeader/>
         </w:trPr>
         <w:tc>
           <w:tcPr>
             <w:tcW w:type="dxa" w:w="1191"/>
             <w:vAlign w:val="center"/>
             <w:tcBorders>
+              <w:top w:val="single" w:sz="4" w:color="D9D9D9"/>
+              <w:left w:val="single" w:sz="4" w:color="D9D9D9"/>
+              <w:bottom w:val="single" w:sz="4" w:color="D9D9D9"/>
+              <w:right w:val="single" w:sz="4" w:color="D9D9D9"/>
               <w:top w:val="single" w:sz="4" w:color="D9D9D9"/>
               <w:left w:val="single" w:sz="4" w:color="D9D9D9"/>
               <w:bottom w:val="single" w:sz="4" w:color="D9D9D9"/>
@@ -4041,11 +4352,12 @@
           </w:tcPr>
           <w:p>
             <w:pPr>
-              <w:spacing w:after="40" w:line="264" w:lineRule="auto"/>
-            </w:pPr>
-            <w:r>
-              <w:rPr>
-                <w:rFonts w:ascii="宋体" w:hAnsi="宋体" w:eastAsia="宋体"/>
+              <w:keepNext/>
+              <w:spacing w:after="40" w:line="288" w:lineRule="auto" w:before="40"/>
+            </w:pPr>
+            <w:r>
+              <w:rPr>
+                <w:rFonts w:ascii="Times New Roman" w:hAnsi="Times New Roman" w:eastAsia="宋体"/>
                 <w:b/>
                 <w:color w:val="000000"/>
                 <w:sz w:val="21"/>
@@ -4059,6 +4371,10 @@
             <w:tcW w:type="dxa" w:w="2665"/>
             <w:vAlign w:val="center"/>
             <w:tcBorders>
+              <w:top w:val="single" w:sz="4" w:color="D9D9D9"/>
+              <w:left w:val="single" w:sz="4" w:color="D9D9D9"/>
+              <w:bottom w:val="single" w:sz="4" w:color="D9D9D9"/>
+              <w:right w:val="single" w:sz="4" w:color="D9D9D9"/>
               <w:top w:val="single" w:sz="4" w:color="D9D9D9"/>
               <w:left w:val="single" w:sz="4" w:color="D9D9D9"/>
               <w:bottom w:val="single" w:sz="4" w:color="D9D9D9"/>
@@ -4074,11 +4390,12 @@
           </w:tcPr>
           <w:p>
             <w:pPr>
-              <w:spacing w:after="40" w:line="264" w:lineRule="auto"/>
-            </w:pPr>
-            <w:r>
-              <w:rPr>
-                <w:rFonts w:ascii="宋体" w:hAnsi="宋体" w:eastAsia="宋体"/>
+              <w:keepNext/>
+              <w:spacing w:after="40" w:line="288" w:lineRule="auto" w:before="40"/>
+            </w:pPr>
+            <w:r>
+              <w:rPr>
+                <w:rFonts w:ascii="Times New Roman" w:hAnsi="Times New Roman" w:eastAsia="宋体"/>
                 <w:b/>
                 <w:color w:val="000000"/>
                 <w:sz w:val="21"/>
@@ -4092,6 +4409,10 @@
             <w:tcW w:type="dxa" w:w="2665"/>
             <w:vAlign w:val="center"/>
             <w:tcBorders>
+              <w:top w:val="single" w:sz="4" w:color="D9D9D9"/>
+              <w:left w:val="single" w:sz="4" w:color="D9D9D9"/>
+              <w:bottom w:val="single" w:sz="4" w:color="D9D9D9"/>
+              <w:right w:val="single" w:sz="4" w:color="D9D9D9"/>
               <w:top w:val="single" w:sz="4" w:color="D9D9D9"/>
               <w:left w:val="single" w:sz="4" w:color="D9D9D9"/>
               <w:bottom w:val="single" w:sz="4" w:color="D9D9D9"/>
@@ -4107,11 +4428,12 @@
           </w:tcPr>
           <w:p>
             <w:pPr>
-              <w:spacing w:after="40" w:line="264" w:lineRule="auto"/>
-            </w:pPr>
-            <w:r>
-              <w:rPr>
-                <w:rFonts w:ascii="宋体" w:hAnsi="宋体" w:eastAsia="宋体"/>
+              <w:keepNext/>
+              <w:spacing w:after="40" w:line="288" w:lineRule="auto" w:before="40"/>
+            </w:pPr>
+            <w:r>
+              <w:rPr>
+                <w:rFonts w:ascii="Times New Roman" w:hAnsi="Times New Roman" w:eastAsia="宋体"/>
                 <w:b/>
                 <w:color w:val="000000"/>
                 <w:sz w:val="21"/>
@@ -4125,6 +4447,10 @@
             <w:tcW w:type="dxa" w:w="2665"/>
             <w:vAlign w:val="center"/>
             <w:tcBorders>
+              <w:top w:val="single" w:sz="4" w:color="D9D9D9"/>
+              <w:left w:val="single" w:sz="4" w:color="D9D9D9"/>
+              <w:bottom w:val="single" w:sz="4" w:color="D9D9D9"/>
+              <w:right w:val="single" w:sz="4" w:color="D9D9D9"/>
               <w:top w:val="single" w:sz="4" w:color="D9D9D9"/>
               <w:left w:val="single" w:sz="4" w:color="D9D9D9"/>
               <w:bottom w:val="single" w:sz="4" w:color="D9D9D9"/>
@@ -4140,11 +4466,12 @@
           </w:tcPr>
           <w:p>
             <w:pPr>
-              <w:spacing w:after="40" w:line="264" w:lineRule="auto"/>
-            </w:pPr>
-            <w:r>
-              <w:rPr>
-                <w:rFonts w:ascii="宋体" w:hAnsi="宋体" w:eastAsia="宋体"/>
+              <w:keepNext/>
+              <w:spacing w:after="40" w:line="288" w:lineRule="auto" w:before="40"/>
+            </w:pPr>
+            <w:r>
+              <w:rPr>
+                <w:rFonts w:ascii="Times New Roman" w:hAnsi="Times New Roman" w:eastAsia="宋体"/>
                 <w:b/>
                 <w:color w:val="000000"/>
                 <w:sz w:val="21"/>
@@ -4155,11 +4482,16 @@
         </w:tc>
       </w:tr>
       <w:tr>
+        <w:trPr/>
         <w:tc>
           <w:tcPr>
             <w:tcW w:type="dxa" w:w="1191"/>
             <w:vAlign w:val="center"/>
             <w:tcBorders>
+              <w:top w:val="single" w:sz="4" w:color="D9D9D9"/>
+              <w:left w:val="single" w:sz="4" w:color="D9D9D9"/>
+              <w:bottom w:val="single" w:sz="4" w:color="D9D9D9"/>
+              <w:right w:val="single" w:sz="4" w:color="D9D9D9"/>
               <w:top w:val="single" w:sz="4" w:color="D9D9D9"/>
               <w:left w:val="single" w:sz="4" w:color="D9D9D9"/>
               <w:bottom w:val="single" w:sz="4" w:color="D9D9D9"/>
@@ -4174,11 +4506,12 @@
           </w:tcPr>
           <w:p>
             <w:pPr>
-              <w:spacing w:after="40" w:line="264" w:lineRule="auto"/>
-            </w:pPr>
-            <w:r>
-              <w:rPr>
-                <w:rFonts w:ascii="宋体" w:hAnsi="宋体" w:eastAsia="宋体"/>
+              <w:keepNext/>
+              <w:spacing w:line="288" w:lineRule="auto" w:after="40" w:before="40"/>
+            </w:pPr>
+            <w:r>
+              <w:rPr>
+                <w:rFonts w:ascii="Times New Roman" w:hAnsi="Times New Roman" w:eastAsia="宋体"/>
                 <w:b w:val="0"/>
                 <w:color w:val="000000"/>
                 <w:sz w:val="21"/>
@@ -4192,6 +4525,10 @@
             <w:tcW w:type="dxa" w:w="2665"/>
             <w:vAlign w:val="center"/>
             <w:tcBorders>
+              <w:top w:val="single" w:sz="4" w:color="D9D9D9"/>
+              <w:left w:val="single" w:sz="4" w:color="D9D9D9"/>
+              <w:bottom w:val="single" w:sz="4" w:color="D9D9D9"/>
+              <w:right w:val="single" w:sz="4" w:color="D9D9D9"/>
               <w:top w:val="single" w:sz="4" w:color="D9D9D9"/>
               <w:left w:val="single" w:sz="4" w:color="D9D9D9"/>
               <w:bottom w:val="single" w:sz="4" w:color="D9D9D9"/>
@@ -4206,16 +4543,17 @@
           </w:tcPr>
           <w:p>
             <w:pPr>
-              <w:spacing w:after="40" w:line="264" w:lineRule="auto"/>
-            </w:pPr>
-            <w:r>
-              <w:rPr>
-                <w:rFonts w:ascii="宋体" w:hAnsi="宋体" w:eastAsia="宋体"/>
+              <w:keepNext/>
+              <w:spacing w:line="288" w:lineRule="auto" w:after="40" w:before="40"/>
+            </w:pPr>
+            <w:r>
+              <w:rPr>
+                <w:rFonts w:ascii="Times New Roman" w:hAnsi="Times New Roman" w:eastAsia="宋体"/>
                 <w:b w:val="0"/>
                 <w:color w:val="000000"/>
                 <w:sz w:val="21"/>
               </w:rPr>
-              <w:t>230.19</w:t>
+              <w:t>538.06</w:t>
             </w:r>
           </w:p>
         </w:tc>
@@ -4224,6 +4562,10 @@
             <w:tcW w:type="dxa" w:w="2665"/>
             <w:vAlign w:val="center"/>
             <w:tcBorders>
+              <w:top w:val="single" w:sz="4" w:color="D9D9D9"/>
+              <w:left w:val="single" w:sz="4" w:color="D9D9D9"/>
+              <w:bottom w:val="single" w:sz="4" w:color="D9D9D9"/>
+              <w:right w:val="single" w:sz="4" w:color="D9D9D9"/>
               <w:top w:val="single" w:sz="4" w:color="D9D9D9"/>
               <w:left w:val="single" w:sz="4" w:color="D9D9D9"/>
               <w:bottom w:val="single" w:sz="4" w:color="D9D9D9"/>
@@ -4238,16 +4580,17 @@
           </w:tcPr>
           <w:p>
             <w:pPr>
-              <w:spacing w:after="40" w:line="264" w:lineRule="auto"/>
-            </w:pPr>
-            <w:r>
-              <w:rPr>
-                <w:rFonts w:ascii="宋体" w:hAnsi="宋体" w:eastAsia="宋体"/>
+              <w:keepNext/>
+              <w:spacing w:line="288" w:lineRule="auto" w:after="40" w:before="40"/>
+            </w:pPr>
+            <w:r>
+              <w:rPr>
+                <w:rFonts w:ascii="Times New Roman" w:hAnsi="Times New Roman" w:eastAsia="宋体"/>
                 <w:b w:val="0"/>
                 <w:color w:val="000000"/>
                 <w:sz w:val="21"/>
               </w:rPr>
-              <w:t>0.84</w:t>
+              <w:t>1.21</w:t>
             </w:r>
           </w:p>
         </w:tc>
@@ -4256,6 +4599,10 @@
             <w:tcW w:type="dxa" w:w="2665"/>
             <w:vAlign w:val="center"/>
             <w:tcBorders>
+              <w:top w:val="single" w:sz="4" w:color="D9D9D9"/>
+              <w:left w:val="single" w:sz="4" w:color="D9D9D9"/>
+              <w:bottom w:val="single" w:sz="4" w:color="D9D9D9"/>
+              <w:right w:val="single" w:sz="4" w:color="D9D9D9"/>
               <w:top w:val="single" w:sz="4" w:color="D9D9D9"/>
               <w:left w:val="single" w:sz="4" w:color="D9D9D9"/>
               <w:bottom w:val="single" w:sz="4" w:color="D9D9D9"/>
@@ -4270,26 +4617,32 @@
           </w:tcPr>
           <w:p>
             <w:pPr>
-              <w:spacing w:after="40" w:line="264" w:lineRule="auto"/>
-            </w:pPr>
-            <w:r>
-              <w:rPr>
-                <w:rFonts w:ascii="宋体" w:hAnsi="宋体" w:eastAsia="宋体"/>
+              <w:keepNext/>
+              <w:spacing w:line="288" w:lineRule="auto" w:after="40" w:before="40"/>
+            </w:pPr>
+            <w:r>
+              <w:rPr>
+                <w:rFonts w:ascii="Times New Roman" w:hAnsi="Times New Roman" w:eastAsia="宋体"/>
                 <w:b w:val="0"/>
                 <w:color w:val="000000"/>
                 <w:sz w:val="21"/>
               </w:rPr>
-              <w:t>6.21</w:t>
+              <w:t>16.72</w:t>
             </w:r>
           </w:p>
         </w:tc>
       </w:tr>
       <w:tr>
+        <w:trPr/>
         <w:tc>
           <w:tcPr>
             <w:tcW w:type="dxa" w:w="1191"/>
             <w:vAlign w:val="center"/>
             <w:tcBorders>
+              <w:top w:val="single" w:sz="4" w:color="D9D9D9"/>
+              <w:left w:val="single" w:sz="4" w:color="D9D9D9"/>
+              <w:bottom w:val="single" w:sz="4" w:color="D9D9D9"/>
+              <w:right w:val="single" w:sz="4" w:color="D9D9D9"/>
               <w:top w:val="single" w:sz="4" w:color="D9D9D9"/>
               <w:left w:val="single" w:sz="4" w:color="D9D9D9"/>
               <w:bottom w:val="single" w:sz="4" w:color="D9D9D9"/>
@@ -4304,11 +4657,12 @@
           </w:tcPr>
           <w:p>
             <w:pPr>
-              <w:spacing w:after="40" w:line="264" w:lineRule="auto"/>
-            </w:pPr>
-            <w:r>
-              <w:rPr>
-                <w:rFonts w:ascii="宋体" w:hAnsi="宋体" w:eastAsia="宋体"/>
+              <w:keepNext/>
+              <w:spacing w:line="288" w:lineRule="auto" w:after="40" w:before="40"/>
+            </w:pPr>
+            <w:r>
+              <w:rPr>
+                <w:rFonts w:ascii="Times New Roman" w:hAnsi="Times New Roman" w:eastAsia="宋体"/>
                 <w:b w:val="0"/>
                 <w:color w:val="000000"/>
                 <w:sz w:val="21"/>
@@ -4322,6 +4676,10 @@
             <w:tcW w:type="dxa" w:w="2665"/>
             <w:vAlign w:val="center"/>
             <w:tcBorders>
+              <w:top w:val="single" w:sz="4" w:color="D9D9D9"/>
+              <w:left w:val="single" w:sz="4" w:color="D9D9D9"/>
+              <w:bottom w:val="single" w:sz="4" w:color="D9D9D9"/>
+              <w:right w:val="single" w:sz="4" w:color="D9D9D9"/>
               <w:top w:val="single" w:sz="4" w:color="D9D9D9"/>
               <w:left w:val="single" w:sz="4" w:color="D9D9D9"/>
               <w:bottom w:val="single" w:sz="4" w:color="D9D9D9"/>
@@ -4336,16 +4694,17 @@
           </w:tcPr>
           <w:p>
             <w:pPr>
-              <w:spacing w:after="40" w:line="264" w:lineRule="auto"/>
-            </w:pPr>
-            <w:r>
-              <w:rPr>
-                <w:rFonts w:ascii="宋体" w:hAnsi="宋体" w:eastAsia="宋体"/>
+              <w:keepNext/>
+              <w:spacing w:line="288" w:lineRule="auto" w:after="40" w:before="40"/>
+            </w:pPr>
+            <w:r>
+              <w:rPr>
+                <w:rFonts w:ascii="Times New Roman" w:hAnsi="Times New Roman" w:eastAsia="宋体"/>
                 <w:b w:val="0"/>
                 <w:color w:val="000000"/>
                 <w:sz w:val="21"/>
               </w:rPr>
-              <w:t>2438.30</w:t>
+              <w:t>5345.25</w:t>
             </w:r>
           </w:p>
         </w:tc>
@@ -4354,6 +4713,10 @@
             <w:tcW w:type="dxa" w:w="2665"/>
             <w:vAlign w:val="center"/>
             <w:tcBorders>
+              <w:top w:val="single" w:sz="4" w:color="D9D9D9"/>
+              <w:left w:val="single" w:sz="4" w:color="D9D9D9"/>
+              <w:bottom w:val="single" w:sz="4" w:color="D9D9D9"/>
+              <w:right w:val="single" w:sz="4" w:color="D9D9D9"/>
               <w:top w:val="single" w:sz="4" w:color="D9D9D9"/>
               <w:left w:val="single" w:sz="4" w:color="D9D9D9"/>
               <w:bottom w:val="single" w:sz="4" w:color="D9D9D9"/>
@@ -4368,16 +4731,17 @@
           </w:tcPr>
           <w:p>
             <w:pPr>
-              <w:spacing w:after="40" w:line="264" w:lineRule="auto"/>
-            </w:pPr>
-            <w:r>
-              <w:rPr>
-                <w:rFonts w:ascii="宋体" w:hAnsi="宋体" w:eastAsia="宋体"/>
+              <w:keepNext/>
+              <w:spacing w:line="288" w:lineRule="auto" w:after="40" w:before="40"/>
+            </w:pPr>
+            <w:r>
+              <w:rPr>
+                <w:rFonts w:ascii="Times New Roman" w:hAnsi="Times New Roman" w:eastAsia="宋体"/>
                 <w:b w:val="0"/>
                 <w:color w:val="000000"/>
                 <w:sz w:val="21"/>
               </w:rPr>
-              <w:t>11.11</w:t>
+              <w:t>16.13</w:t>
             </w:r>
           </w:p>
         </w:tc>
@@ -4386,6 +4750,10 @@
             <w:tcW w:type="dxa" w:w="2665"/>
             <w:vAlign w:val="center"/>
             <w:tcBorders>
+              <w:top w:val="single" w:sz="4" w:color="D9D9D9"/>
+              <w:left w:val="single" w:sz="4" w:color="D9D9D9"/>
+              <w:bottom w:val="single" w:sz="4" w:color="D9D9D9"/>
+              <w:right w:val="single" w:sz="4" w:color="D9D9D9"/>
               <w:top w:val="single" w:sz="4" w:color="D9D9D9"/>
               <w:left w:val="single" w:sz="4" w:color="D9D9D9"/>
               <w:bottom w:val="single" w:sz="4" w:color="D9D9D9"/>
@@ -4400,26 +4768,32 @@
           </w:tcPr>
           <w:p>
             <w:pPr>
-              <w:spacing w:after="40" w:line="264" w:lineRule="auto"/>
-            </w:pPr>
-            <w:r>
-              <w:rPr>
-                <w:rFonts w:ascii="宋体" w:hAnsi="宋体" w:eastAsia="宋体"/>
+              <w:keepNext/>
+              <w:spacing w:line="288" w:lineRule="auto" w:after="40" w:before="40"/>
+            </w:pPr>
+            <w:r>
+              <w:rPr>
+                <w:rFonts w:ascii="Times New Roman" w:hAnsi="Times New Roman" w:eastAsia="宋体"/>
                 <w:b w:val="0"/>
                 <w:color w:val="000000"/>
                 <w:sz w:val="21"/>
               </w:rPr>
-              <w:t>7.86</w:t>
+              <w:t>19.20</w:t>
             </w:r>
           </w:p>
         </w:tc>
       </w:tr>
       <w:tr>
+        <w:trPr/>
         <w:tc>
           <w:tcPr>
             <w:tcW w:type="dxa" w:w="1191"/>
             <w:vAlign w:val="center"/>
             <w:tcBorders>
+              <w:top w:val="single" w:sz="4" w:color="D9D9D9"/>
+              <w:left w:val="single" w:sz="4" w:color="D9D9D9"/>
+              <w:bottom w:val="single" w:sz="4" w:color="D9D9D9"/>
+              <w:right w:val="single" w:sz="4" w:color="D9D9D9"/>
               <w:top w:val="single" w:sz="4" w:color="D9D9D9"/>
               <w:left w:val="single" w:sz="4" w:color="D9D9D9"/>
               <w:bottom w:val="single" w:sz="4" w:color="D9D9D9"/>
@@ -4434,11 +4808,12 @@
           </w:tcPr>
           <w:p>
             <w:pPr>
-              <w:spacing w:after="40" w:line="264" w:lineRule="auto"/>
-            </w:pPr>
-            <w:r>
-              <w:rPr>
-                <w:rFonts w:ascii="宋体" w:hAnsi="宋体" w:eastAsia="宋体"/>
+              <w:keepNext w:val="0"/>
+              <w:spacing w:line="288" w:lineRule="auto" w:after="40" w:before="40"/>
+            </w:pPr>
+            <w:r>
+              <w:rPr>
+                <w:rFonts w:ascii="Times New Roman" w:hAnsi="Times New Roman" w:eastAsia="宋体"/>
                 <w:b w:val="0"/>
                 <w:color w:val="000000"/>
                 <w:sz w:val="21"/>
@@ -4452,6 +4827,10 @@
             <w:tcW w:type="dxa" w:w="2665"/>
             <w:vAlign w:val="center"/>
             <w:tcBorders>
+              <w:top w:val="single" w:sz="4" w:color="D9D9D9"/>
+              <w:left w:val="single" w:sz="4" w:color="D9D9D9"/>
+              <w:bottom w:val="single" w:sz="4" w:color="D9D9D9"/>
+              <w:right w:val="single" w:sz="4" w:color="D9D9D9"/>
               <w:top w:val="single" w:sz="4" w:color="D9D9D9"/>
               <w:left w:val="single" w:sz="4" w:color="D9D9D9"/>
               <w:bottom w:val="single" w:sz="4" w:color="D9D9D9"/>
@@ -4466,16 +4845,17 @@
           </w:tcPr>
           <w:p>
             <w:pPr>
-              <w:spacing w:after="40" w:line="264" w:lineRule="auto"/>
-            </w:pPr>
-            <w:r>
-              <w:rPr>
-                <w:rFonts w:ascii="宋体" w:hAnsi="宋体" w:eastAsia="宋体"/>
+              <w:keepNext w:val="0"/>
+              <w:spacing w:line="288" w:lineRule="auto" w:after="40" w:before="40"/>
+            </w:pPr>
+            <w:r>
+              <w:rPr>
+                <w:rFonts w:ascii="Times New Roman" w:hAnsi="Times New Roman" w:eastAsia="宋体"/>
                 <w:b w:val="0"/>
                 <w:color w:val="000000"/>
                 <w:sz w:val="21"/>
               </w:rPr>
-              <w:t>28512.22</w:t>
+              <w:t>46302.62</w:t>
             </w:r>
           </w:p>
         </w:tc>
@@ -4484,6 +4864,10 @@
             <w:tcW w:type="dxa" w:w="2665"/>
             <w:vAlign w:val="center"/>
             <w:tcBorders>
+              <w:top w:val="single" w:sz="4" w:color="D9D9D9"/>
+              <w:left w:val="single" w:sz="4" w:color="D9D9D9"/>
+              <w:bottom w:val="single" w:sz="4" w:color="D9D9D9"/>
+              <w:right w:val="single" w:sz="4" w:color="D9D9D9"/>
               <w:top w:val="single" w:sz="4" w:color="D9D9D9"/>
               <w:left w:val="single" w:sz="4" w:color="D9D9D9"/>
               <w:bottom w:val="single" w:sz="4" w:color="D9D9D9"/>
@@ -4498,16 +4882,17 @@
           </w:tcPr>
           <w:p>
             <w:pPr>
-              <w:spacing w:after="40" w:line="264" w:lineRule="auto"/>
-            </w:pPr>
-            <w:r>
-              <w:rPr>
-                <w:rFonts w:ascii="宋体" w:hAnsi="宋体" w:eastAsia="宋体"/>
+              <w:keepNext w:val="0"/>
+              <w:spacing w:line="288" w:lineRule="auto" w:after="40" w:before="40"/>
+            </w:pPr>
+            <w:r>
+              <w:rPr>
+                <w:rFonts w:ascii="Times New Roman" w:hAnsi="Times New Roman" w:eastAsia="宋体"/>
                 <w:b w:val="0"/>
                 <w:color w:val="000000"/>
                 <w:sz w:val="21"/>
               </w:rPr>
-              <w:t>98.68</w:t>
+              <w:t>110.80</w:t>
             </w:r>
           </w:p>
         </w:tc>
@@ -4516,6 +4901,10 @@
             <w:tcW w:type="dxa" w:w="2665"/>
             <w:vAlign w:val="center"/>
             <w:tcBorders>
+              <w:top w:val="single" w:sz="4" w:color="D9D9D9"/>
+              <w:left w:val="single" w:sz="4" w:color="D9D9D9"/>
+              <w:bottom w:val="single" w:sz="4" w:color="D9D9D9"/>
+              <w:right w:val="single" w:sz="4" w:color="D9D9D9"/>
               <w:top w:val="single" w:sz="4" w:color="D9D9D9"/>
               <w:left w:val="single" w:sz="4" w:color="D9D9D9"/>
               <w:bottom w:val="single" w:sz="4" w:color="D9D9D9"/>
@@ -4530,16 +4919,17 @@
           </w:tcPr>
           <w:p>
             <w:pPr>
-              <w:spacing w:after="40" w:line="264" w:lineRule="auto"/>
-            </w:pPr>
-            <w:r>
-              <w:rPr>
-                <w:rFonts w:ascii="宋体" w:hAnsi="宋体" w:eastAsia="宋体"/>
+              <w:keepNext w:val="0"/>
+              <w:spacing w:line="288" w:lineRule="auto" w:after="40" w:before="40"/>
+            </w:pPr>
+            <w:r>
+              <w:rPr>
+                <w:rFonts w:ascii="Times New Roman" w:hAnsi="Times New Roman" w:eastAsia="宋体"/>
                 <w:b w:val="0"/>
                 <w:color w:val="000000"/>
                 <w:sz w:val="21"/>
               </w:rPr>
-              <w:t>6.47</w:t>
+              <w:t>11.96</w:t>
             </w:r>
           </w:p>
         </w:tc>
@@ -4547,327 +4937,284 @@
     </w:tbl>
     <w:p>
       <w:pPr>
-        <w:spacing w:line="300" w:lineRule="auto" w:after="100"/>
-        <w:ind w:firstLine="480"/>
-      </w:pPr>
-      <w:r>
-        <w:rPr>
-          <w:rFonts w:ascii="宋体" w:hAnsi="宋体" w:eastAsia="宋体"/>
+        <w:pStyle w:val="ReportBody"/>
+      </w:pPr>
+      <w:r>
+        <w:t>计时仅覆盖Paillier原语，不包括文件、签名、口令派生、进程及GUI；界面耗时则来自当前轮次的实际审计和解密端复算，二者口径不同。测试期间计算机有其他任务，三次原始记录保存在JSON中，均值不能当作部署保证。</w:t>
+      </w:r>
+    </w:p>
+    <w:p>
+      <w:pPr>
+        <w:pStyle w:val="ReportBody"/>
+      </w:pPr>
+      <w:r>
+        <w:rPr>
+          <w:rFonts w:ascii="Times New Roman" w:hAnsi="Times New Roman" w:eastAsia="宋体"/>
           <w:b w:val="0"/>
           <w:color w:val="000000"/>
-          <w:sz w:val="22"/>
-        </w:rPr>
-        <w:t>计时范围仅包含Paillier原语，不包括文件读写、清单签名、口令派生、进程启动和GUI刷新。结果反映本机当时负载，测试期间并非独占计算机；原始三次记录完整保留，不能将均值直接当作部署性能保证。</w:t>
-      </w:r>
-    </w:p>
-    <w:p>
-      <w:pPr>
-        <w:spacing w:line="300" w:lineRule="auto" w:after="100"/>
-        <w:ind w:firstLine="480"/>
-      </w:pPr>
-      <w:r>
-        <w:rPr>
-          <w:rFonts w:ascii="宋体" w:hAnsi="宋体" w:eastAsia="宋体"/>
+          <w:sz w:val="24"/>
+        </w:rPr>
+        <w:t>固定选项数时，汇总需要人数乘以选项数次模乘，人数增长会增加汇总时间；解密只对最终3个密文执行，因此人数增加时解密工作量基本不变。实测中解密时间有操作系统调度和后台负载波动，不能把单次波动解释为算法复杂度改变。</w:t>
+      </w:r>
+    </w:p>
+    <w:p>
+      <w:pPr>
+        <w:pStyle w:val="ReportH2"/>
+      </w:pPr>
+      <w:r>
+        <w:t>5.4 准确性与可重复性</w:t>
+      </w:r>
+    </w:p>
+    <w:p>
+      <w:pPr>
+        <w:pStyle w:val="ReportBody"/>
+      </w:pPr>
+      <w:r>
+        <w:t>基准6票序列[0,1,0,2,0,1]得到[3,2,1]；2、4、8选项各投一票均得到全1向量，零票返回全0。原生Qt测试记录在evidence/2026-10-27/ui/，验证6次控件投票、子进程计票和两种审计演示。图2采用本轮实际截图。</w:t>
+      </w:r>
+    </w:p>
+    <w:p>
+      <w:pPr>
+        <w:pStyle w:val="ReportH2"/>
+      </w:pPr>
+      <w:r>
+        <w:t>5.5 本轮发现的问题与处理</w:t>
+      </w:r>
+    </w:p>
+    <w:p>
+      <w:pPr>
+        <w:pStyle w:val="ReportBody"/>
+      </w:pPr>
+      <w:r>
+        <w:t>审查时发现，解密端虽然重新计算了完整汇总，却把请求内的audit_ms和aggregate_ms直接写入结果。调用者可传入负值污染性能记录。修复后结果改取expected中的复算耗时；回归测试用-999作为请求耗时，最终票数仍为[1,0]且返回耗时均为非负。</w:t>
+      </w:r>
+    </w:p>
+    <w:p>
+      <w:pPr>
+        <w:pStyle w:val="ReportH1"/>
+      </w:pPr>
+      <w:r>
+        <w:rPr>
+          <w:rFonts w:ascii="Times New Roman" w:hAnsi="Times New Roman" w:eastAsia="宋体"/>
+          <w:b/>
+          <w:color w:val="000000"/>
+          <w:sz w:val="28"/>
+        </w:rPr>
+        <w:t>六、总结</w:t>
+      </w:r>
+    </w:p>
+    <w:p>
+      <w:pPr>
+        <w:pStyle w:val="ReportBody"/>
+      </w:pPr>
+      <w:r>
+        <w:rPr>
+          <w:rFonts w:ascii="Times New Roman" w:hAnsi="Times New Roman" w:eastAsia="宋体"/>
           <w:b w:val="0"/>
           <w:color w:val="000000"/>
           <w:sz w:val="24"/>
         </w:rPr>
-        <w:t>固定选项数时，汇总需要人数乘以选项数次模乘，人数增长会增加汇总时间；解密只对最终3个密文执行，因此人数增加时解密工作量基本不变。实测中解密时间有操作系统调度和后台负载波动，不能把单次波动解释为算法复杂度改变。</w:t>
-      </w:r>
-    </w:p>
-    <w:p>
-      <w:pPr>
-        <w:keepNext/>
-        <w:spacing w:line="300" w:lineRule="auto" w:after="100"/>
-      </w:pPr>
-      <w:r>
-        <w:rPr>
-          <w:rFonts w:ascii="宋体" w:hAnsi="宋体" w:eastAsia="宋体"/>
+        <w:t>本模块验证了“计票端无私钥、按列汇总、仅返回总票”的操作流程。测量结果支持将较高的公钥加密成本放在投票端、将较轻的乘法汇总放在计票端。工程上的独立进程不是密码学上的门限解密，后续可以研究多方私钥分片。</w:t>
+      </w:r>
+    </w:p>
+    <w:p>
+      <w:pPr>
+        <w:pStyle w:val="ReportH2"/>
+      </w:pPr>
+      <w:r>
+        <w:rPr>
+          <w:rFonts w:ascii="Times New Roman" w:hAnsi="Times New Roman" w:eastAsia="宋体"/>
           <w:b/>
           <w:color w:val="000000"/>
           <w:sz w:val="24"/>
         </w:rPr>
-        <w:t>准确性与可重复性</w:t>
-      </w:r>
-    </w:p>
-    <w:p>
-      <w:pPr>
-        <w:spacing w:line="300" w:lineRule="auto" w:after="100"/>
-        <w:ind w:firstLine="480"/>
-      </w:pPr>
-      <w:r>
-        <w:rPr>
-          <w:rFonts w:ascii="宋体" w:hAnsi="宋体" w:eastAsia="宋体"/>
+        <w:t>6.1 安全局限与后续改进</w:t>
+      </w:r>
+    </w:p>
+    <w:p>
+      <w:pPr>
+        <w:pStyle w:val="ReportBody"/>
+      </w:pPr>
+      <w:r>
+        <w:rPr>
+          <w:rFonts w:ascii="Times New Roman" w:hAnsi="Times New Roman" w:eastAsia="宋体"/>
           <w:b w:val="0"/>
           <w:color w:val="000000"/>
-          <w:sz w:val="22"/>
-        </w:rPr>
-        <w:t>基准6票的选择序列为[0,1,0,2,0,1]，实测结果[3,2,1]；四选项实验每项一票，实测[1,1,1,1]。每次性能实验均比较解密结果与合成明文的计数。GUI测试使用实际Qt控件点击，并验证独立子进程返回的结果与审计演示；程序截图不是绘制的效果图。</w:t>
-      </w:r>
-    </w:p>
-    <w:p>
-      <w:pPr>
-        <w:keepNext/>
-        <w:spacing w:line="300" w:lineRule="auto" w:after="100"/>
-      </w:pPr>
-      <w:r>
-        <w:rPr>
-          <w:rFonts w:ascii="宋体" w:hAnsi="宋体" w:eastAsia="宋体"/>
+          <w:sz w:val="24"/>
+        </w:rPr>
+        <w:t>系统未实现零知识证明、门限解密、证书认证及完整状态回滚保护。名单ID不是身份认证；私钥持有者能在程序之外解密单票；小群体结果可能暴露个体偏好。签名验证依赖最初可信配置，攻击者若同时替换所有配置、密钥与历史数据，本地应用无法自行建立原始信任。单文件原子写入不等于跨文件事务，当前只支持单机单写入者。</w:t>
+      </w:r>
+    </w:p>
+    <w:p>
+      <w:pPr>
+        <w:pStyle w:val="ReportH2"/>
+      </w:pPr>
+      <w:r>
+        <w:rPr>
+          <w:rFonts w:ascii="Times New Roman" w:hAnsi="Times New Roman" w:eastAsia="宋体"/>
           <w:b/>
           <w:color w:val="000000"/>
           <w:sz w:val="24"/>
         </w:rPr>
-        <w:t>额外功能的实际意义</w:t>
-      </w:r>
-    </w:p>
-    <w:p>
-      <w:pPr>
-        <w:spacing w:line="300" w:lineRule="auto" w:after="100"/>
-        <w:ind w:firstLine="480"/>
-      </w:pPr>
-      <w:r>
-        <w:rPr>
-          <w:rFonts w:ascii="宋体" w:hAnsi="宋体" w:eastAsia="宋体"/>
+        <w:t>6.2 分工验收与口试准备</w:t>
+      </w:r>
+    </w:p>
+    <w:p>
+      <w:pPr>
+        <w:pStyle w:val="ReportBody"/>
+      </w:pPr>
+      <w:r>
+        <w:rPr>
+          <w:rFonts w:ascii="Times New Roman" w:hAnsi="Times New Roman" w:eastAsia="宋体"/>
           <w:b w:val="0"/>
           <w:color w:val="000000"/>
-          <w:sz w:val="22"/>
-        </w:rPr>
-        <w:t>关闭状态阻止继续接收选票和开放期计票；签名清单把已接收文件集合与摘要绑定起来。修改密文、删除选票、添加额外文件、修改配置或清单都会导致拒绝。临时副本演示便于现场复现，原始数据不会因此改变。</w:t>
-      </w:r>
-    </w:p>
-    <w:p>
-      <w:pPr>
-        <w:keepNext/>
-        <w:pageBreakBefore/>
-        <w:spacing w:line="300" w:lineRule="auto" w:after="160"/>
-      </w:pPr>
-      <w:r>
-        <w:rPr>
-          <w:rFonts w:ascii="宋体" w:hAnsi="宋体" w:eastAsia="宋体"/>
+          <w:sz w:val="24"/>
+        </w:rPr>
+        <w:t>为什么乘密文得到加票数？g的指数相加，随机因子也相乘。</w:t>
+      </w:r>
+    </w:p>
+    <w:p>
+      <w:pPr>
+        <w:pStyle w:val="ReportBody"/>
+      </w:pPr>
+      <w:r>
+        <w:rPr>
+          <w:rFonts w:ascii="Times New Roman" w:hAnsi="Times New Roman" w:eastAsia="宋体"/>
+          <w:b w:val="0"/>
+          <w:color w:val="000000"/>
+          <w:sz w:val="24"/>
+        </w:rPr>
+        <w:t>零票为什么可以输出0？累积元1解密为0。</w:t>
+      </w:r>
+    </w:p>
+    <w:p>
+      <w:pPr>
+        <w:pStyle w:val="ReportBody"/>
+      </w:pPr>
+      <w:r>
+        <w:rPr>
+          <w:rFonts w:ascii="Times New Roman" w:hAnsi="Times New Roman" w:eastAsia="宋体"/>
+          <w:b w:val="0"/>
+          <w:color w:val="000000"/>
+          <w:sz w:val="24"/>
+        </w:rPr>
+        <w:t>为什么拒绝任意解密请求？防止把私钥端当作单票解密查询服务。</w:t>
+      </w:r>
+    </w:p>
+    <w:p>
+      <w:pPr>
+        <w:pStyle w:val="ReportBody"/>
+      </w:pPr>
+      <w:r>
+        <w:rPr>
+          <w:rFonts w:ascii="Times New Roman" w:hAnsi="Times New Roman" w:eastAsia="宋体"/>
+          <w:b w:val="0"/>
+          <w:color w:val="000000"/>
+          <w:sz w:val="24"/>
+        </w:rPr>
+        <w:t>个人验收建议：在自己电脑上重新运行本模块实验，保存截图和测试记录；现场修改一个参数或校验条件，说明修改影响；根据真实参与情况补全姓名、学号与个人总结。</w:t>
+      </w:r>
+    </w:p>
+    <w:p>
+      <w:pPr>
+        <w:pStyle w:val="ReportH2"/>
+      </w:pPr>
+      <w:r>
+        <w:rPr>
+          <w:rFonts w:ascii="Times New Roman" w:hAnsi="Times New Roman" w:eastAsia="宋体"/>
           <w:b/>
           <w:color w:val="000000"/>
-          <w:sz w:val="28"/>
-        </w:rPr>
-        <w:t>六 总结</w:t>
-      </w:r>
-    </w:p>
-    <w:p>
-      <w:pPr>
-        <w:spacing w:line="300" w:lineRule="auto" w:after="100"/>
-        <w:ind w:firstLine="480"/>
-      </w:pPr>
-      <w:r>
-        <w:rPr>
-          <w:rFonts w:ascii="宋体" w:hAnsi="宋体" w:eastAsia="宋体"/>
+          <w:sz w:val="24"/>
+        </w:rPr>
+        <w:t>6.3 AI使用声明</w:t>
+      </w:r>
+    </w:p>
+    <w:p>
+      <w:pPr>
+        <w:pStyle w:val="ReportBody"/>
+      </w:pPr>
+      <w:r>
+        <w:t>本次使用OpenAI Codex辅助审查代码、修订报告、执行实验和拆分Git提交。初稿与本轮修改均有仓库记录，AI参与范围详见根目录AI使用声明.txt。A/B/C为模块责任标识，学生需据真实贡献补全个人信息和复核记录，并独立解释代码。</w:t>
+      </w:r>
+    </w:p>
+    <w:p>
+      <w:pPr>
+        <w:pStyle w:val="ReportH2"/>
+      </w:pPr>
+      <w:r>
+        <w:rPr>
+          <w:rFonts w:ascii="Times New Roman" w:hAnsi="Times New Roman" w:eastAsia="宋体"/>
+          <w:b/>
+          <w:color w:val="000000"/>
+          <w:sz w:val="24"/>
+        </w:rPr>
+        <w:t>参考资料</w:t>
+      </w:r>
+    </w:p>
+    <w:p>
+      <w:pPr>
+        <w:pStyle w:val="ReportBody"/>
+        <w:spacing w:line="288" w:lineRule="auto"/>
+        <w:ind w:firstLine="0"/>
+        <w:jc w:val="left"/>
+      </w:pPr>
+      <w:r>
+        <w:rPr>
+          <w:rFonts w:ascii="Times New Roman" w:hAnsi="Times New Roman" w:eastAsia="宋体"/>
           <w:b w:val="0"/>
           <w:color w:val="000000"/>
-          <w:sz w:val="24"/>
-        </w:rPr>
-        <w:t>本模块验证了“计票端无私钥、按列汇总、仅返回总票”的操作流程。测量结果支持将较高的公钥加密成本放在投票端、将较轻的乘法汇总放在计票端。工程上的独立进程不是密码学上的门限解密，后续可以研究多方私钥分片。</w:t>
-      </w:r>
-    </w:p>
-    <w:p>
-      <w:pPr>
-        <w:keepNext/>
-        <w:spacing w:line="300" w:lineRule="auto" w:after="100"/>
-      </w:pPr>
-      <w:r>
-        <w:rPr>
-          <w:rFonts w:ascii="宋体" w:hAnsi="宋体" w:eastAsia="宋体"/>
-          <w:b/>
-          <w:color w:val="000000"/>
-          <w:sz w:val="24"/>
-        </w:rPr>
-        <w:t>6.1 安全局限与后续改进</w:t>
-      </w:r>
-    </w:p>
-    <w:p>
-      <w:pPr>
-        <w:spacing w:line="300" w:lineRule="auto" w:after="100"/>
-        <w:ind w:firstLine="480"/>
-      </w:pPr>
-      <w:r>
-        <w:rPr>
-          <w:rFonts w:ascii="宋体" w:hAnsi="宋体" w:eastAsia="宋体"/>
+          <w:sz w:val="21"/>
+        </w:rPr>
+        <w:t>[1] 专业课程设计任务书 B230414 2026—2027第一学期。</w:t>
+      </w:r>
+    </w:p>
+    <w:p>
+      <w:pPr>
+        <w:pStyle w:val="ReportBody"/>
+        <w:spacing w:line="288" w:lineRule="auto"/>
+        <w:ind w:firstLine="0"/>
+        <w:jc w:val="left"/>
+      </w:pPr>
+      <w:r>
+        <w:rPr>
+          <w:rFonts w:ascii="Times New Roman" w:hAnsi="Times New Roman" w:eastAsia="宋体"/>
           <w:b w:val="0"/>
           <w:color w:val="000000"/>
-          <w:sz w:val="24"/>
-        </w:rPr>
-        <w:t>系统未实现零知识证明、门限解密、证书认证及完整状态回滚保护。名单ID不是身份认证；私钥持有者能在程序之外解密单票；小群体结果可能暴露个体偏好。签名验证依赖最初可信配置，攻击者若同时替换所有配置、密钥与历史数据，本地应用无法自行建立原始信任。单文件原子写入不等于跨文件事务，当前只支持单机单写入者。</w:t>
-      </w:r>
-    </w:p>
-    <w:p>
-      <w:pPr>
-        <w:keepNext/>
-        <w:spacing w:line="300" w:lineRule="auto" w:after="100"/>
-      </w:pPr>
-      <w:r>
-        <w:rPr>
-          <w:rFonts w:ascii="宋体" w:hAnsi="宋体" w:eastAsia="宋体"/>
-          <w:b/>
-          <w:color w:val="000000"/>
-          <w:sz w:val="24"/>
-        </w:rPr>
-        <w:t>6.2 分工验收与口试准备</w:t>
-      </w:r>
-    </w:p>
-    <w:p>
-      <w:pPr>
-        <w:spacing w:line="300" w:lineRule="auto" w:after="100"/>
-        <w:ind w:firstLine="480"/>
-      </w:pPr>
-      <w:r>
-        <w:rPr>
-          <w:rFonts w:ascii="宋体" w:hAnsi="宋体" w:eastAsia="宋体"/>
+          <w:sz w:val="21"/>
+        </w:rPr>
+        <w:t>[2] python-paillier API Documentation. https://python-paillier.readthedocs.io/en/stable/phe.html</w:t>
+      </w:r>
+    </w:p>
+    <w:p>
+      <w:pPr>
+        <w:pStyle w:val="ReportBody"/>
+        <w:spacing w:line="288" w:lineRule="auto"/>
+        <w:ind w:firstLine="0"/>
+        <w:jc w:val="left"/>
+      </w:pPr>
+      <w:r>
+        <w:rPr>
+          <w:rFonts w:ascii="Times New Roman" w:hAnsi="Times New Roman" w:eastAsia="宋体"/>
           <w:b w:val="0"/>
           <w:color w:val="000000"/>
-          <w:sz w:val="22"/>
-        </w:rPr>
-        <w:t>为什么乘密文得到加票数？g的指数相加，随机因子也相乘。</w:t>
-      </w:r>
-    </w:p>
-    <w:p>
-      <w:pPr>
-        <w:spacing w:line="300" w:lineRule="auto" w:after="100"/>
-        <w:ind w:firstLine="480"/>
-      </w:pPr>
-      <w:r>
-        <w:rPr>
-          <w:rFonts w:ascii="宋体" w:hAnsi="宋体" w:eastAsia="宋体"/>
+          <w:sz w:val="21"/>
+        </w:rPr>
+        <w:t>[3] Cryptography Ed25519 signing. https://cryptography.io/en/latest/hazmat/primitives/asymmetric/ed25519/</w:t>
+      </w:r>
+    </w:p>
+    <w:p>
+      <w:pPr>
+        <w:pStyle w:val="ReportBody"/>
+        <w:spacing w:line="288" w:lineRule="auto"/>
+        <w:ind w:firstLine="0"/>
+        <w:jc w:val="left"/>
+      </w:pPr>
+      <w:r>
+        <w:rPr>
+          <w:rFonts w:ascii="Times New Roman" w:hAnsi="Times New Roman" w:eastAsia="宋体"/>
           <w:b w:val="0"/>
           <w:color w:val="000000"/>
-          <w:sz w:val="22"/>
-        </w:rPr>
-        <w:t>零票为什么可以输出0？累积元1解密为0。</w:t>
-      </w:r>
-    </w:p>
-    <w:p>
-      <w:pPr>
-        <w:spacing w:line="300" w:lineRule="auto" w:after="100"/>
-        <w:ind w:firstLine="480"/>
-      </w:pPr>
-      <w:r>
-        <w:rPr>
-          <w:rFonts w:ascii="宋体" w:hAnsi="宋体" w:eastAsia="宋体"/>
-          <w:b w:val="0"/>
-          <w:color w:val="000000"/>
-          <w:sz w:val="22"/>
-        </w:rPr>
-        <w:t>为什么拒绝任意解密请求？防止把私钥端当作单票解密查询服务。</w:t>
-      </w:r>
-    </w:p>
-    <w:p>
-      <w:pPr>
-        <w:spacing w:line="300" w:lineRule="auto" w:after="100"/>
-        <w:ind w:firstLine="480"/>
-      </w:pPr>
-      <w:r>
-        <w:rPr>
-          <w:rFonts w:ascii="宋体" w:hAnsi="宋体" w:eastAsia="宋体"/>
-          <w:b w:val="0"/>
-          <w:color w:val="000000"/>
-          <w:sz w:val="22"/>
-        </w:rPr>
-        <w:t>个人验收建议：在自己电脑上重新运行本模块实验，保存截图和测试记录；现场修改一个参数或校验条件，说明修改影响；根据真实参与情况补全姓名、学号与个人总结。</w:t>
-      </w:r>
-    </w:p>
-    <w:p>
-      <w:pPr>
-        <w:keepNext/>
-        <w:spacing w:line="300" w:lineRule="auto" w:after="100"/>
-      </w:pPr>
-      <w:r>
-        <w:rPr>
-          <w:rFonts w:ascii="宋体" w:hAnsi="宋体" w:eastAsia="宋体"/>
-          <w:b/>
-          <w:color w:val="000000"/>
-          <w:sz w:val="24"/>
-        </w:rPr>
-        <w:t>6.3 AI使用声明</w:t>
-      </w:r>
-    </w:p>
-    <w:p>
-      <w:pPr>
-        <w:spacing w:line="300" w:lineRule="auto" w:after="100"/>
-        <w:ind w:firstLine="480"/>
-      </w:pPr>
-      <w:r>
-        <w:rPr>
-          <w:rFonts w:ascii="宋体" w:hAnsi="宋体" w:eastAsia="宋体"/>
-          <w:b w:val="0"/>
-          <w:color w:val="000000"/>
-          <w:sz w:val="22"/>
-        </w:rPr>
-        <w:t>本项目的初始代码、自动实验执行及报告初稿由OpenAI Codex辅助生成。报告中的数据来自实际运行，成员A/B/C表示建议的责任分配，不表示三位学生已经独立完成相应工作。学生须逐项验证、修改并能现场解释，个人完成情况、人工复核与新增Git提交应由本人补充。AI生成记录不冒充学生历史提交。</w:t>
-      </w:r>
-    </w:p>
-    <w:p>
-      <w:pPr>
-        <w:keepNext/>
-        <w:spacing w:line="300" w:lineRule="auto" w:after="100"/>
-      </w:pPr>
-      <w:r>
-        <w:rPr>
-          <w:rFonts w:ascii="宋体" w:hAnsi="宋体" w:eastAsia="宋体"/>
-          <w:b/>
-          <w:color w:val="000000"/>
-          <w:sz w:val="24"/>
-        </w:rPr>
-        <w:t>参考资料</w:t>
-      </w:r>
-    </w:p>
-    <w:p>
-      <w:pPr>
-        <w:spacing w:line="300" w:lineRule="auto" w:after="80"/>
-      </w:pPr>
-      <w:r>
-        <w:rPr>
-          <w:rFonts w:ascii="宋体" w:hAnsi="宋体" w:eastAsia="宋体"/>
-          <w:b w:val="0"/>
-          <w:color w:val="000000"/>
-          <w:sz w:val="18"/>
-        </w:rPr>
-        <w:t>[1] 专业课程设计任务书 B230414 2026—2027第一学期。</w:t>
-      </w:r>
-    </w:p>
-    <w:p>
-      <w:pPr>
-        <w:spacing w:line="300" w:lineRule="auto" w:after="80"/>
-      </w:pPr>
-      <w:r>
-        <w:rPr>
-          <w:rFonts w:ascii="宋体" w:hAnsi="宋体" w:eastAsia="宋体"/>
-          <w:b w:val="0"/>
-          <w:color w:val="000000"/>
-          <w:sz w:val="18"/>
-        </w:rPr>
-        <w:t>[2] python-paillier API Documentation. https://python-paillier.readthedocs.io/en/stable/phe.html</w:t>
-      </w:r>
-    </w:p>
-    <w:p>
-      <w:pPr>
-        <w:spacing w:line="300" w:lineRule="auto" w:after="80"/>
-      </w:pPr>
-      <w:r>
-        <w:rPr>
-          <w:rFonts w:ascii="宋体" w:hAnsi="宋体" w:eastAsia="宋体"/>
-          <w:b w:val="0"/>
-          <w:color w:val="000000"/>
-          <w:sz w:val="18"/>
-        </w:rPr>
-        <w:t>[3] Cryptography Ed25519 signing. https://cryptography.io/en/latest/hazmat/primitives/asymmetric/ed25519/</w:t>
-      </w:r>
-    </w:p>
-    <w:p>
-      <w:pPr>
-        <w:spacing w:line="300" w:lineRule="auto" w:after="80"/>
-      </w:pPr>
-      <w:r>
-        <w:rPr>
-          <w:rFonts w:ascii="宋体" w:hAnsi="宋体" w:eastAsia="宋体"/>
-          <w:b w:val="0"/>
-          <w:color w:val="000000"/>
-          <w:sz w:val="18"/>
+          <w:sz w:val="21"/>
         </w:rPr>
         <w:t>[4] PyInstaller Using PyInstaller. https://pyinstaller.org/en/stable/usage.html</w:t>
       </w:r>
@@ -4892,10 +5239,22 @@
     </w:pPr>
     <w:r>
       <w:rPr>
-        <w:kern w:val="0"/>
-        <w:szCs w:val="21"/>
+        <w:rFonts w:ascii="Times New Roman" w:hAnsi="Times New Roman" w:eastAsia="宋体"/>
+        <w:b w:val="0"/>
+        <w:color w:val="000000"/>
+        <w:sz w:val="18"/>
       </w:rPr>
-      <w:t>-</w:t>
+      <w:t xml:space="preserve">第 </w:t>
+    </w:r>
+    <w:fldSimple w:instr="PAGE"/>
+    <w:r>
+      <w:rPr>
+        <w:rFonts w:ascii="Times New Roman" w:hAnsi="Times New Roman" w:eastAsia="宋体"/>
+        <w:b w:val="0"/>
+        <w:color w:val="000000"/>
+        <w:sz w:val="18"/>
+      </w:rPr>
+      <w:t xml:space="preserve"> 页</w:t>
     </w:r>
   </w:p>
 </w:ftr>
@@ -5397,6 +5756,99 @@
       <w:ind w:firstLine="420" w:firstLineChars="200"/>
     </w:pPr>
   </w:style>
+  <w:style w:type="paragraph" w:customStyle="1" w:styleId="ReportTitle">
+    <w:name w:val="Report Title"/>
+    <w:basedOn w:val="1"/>
+    <w:pPr>
+      <w:keepNext/>
+      <w:widowControl/>
+      <w:spacing w:after="60" w:before="120" w:line="360" w:lineRule="auto"/>
+      <w:ind w:firstLine="0"/>
+    </w:pPr>
+    <w:rPr>
+      <w:rFonts w:ascii="Times New Roman" w:hAnsi="Times New Roman" w:eastAsia="宋体"/>
+      <w:b/>
+      <w:sz w:val="32"/>
+    </w:rPr>
+  </w:style>
+  <w:style w:type="paragraph" w:customStyle="1" w:styleId="ReportH1">
+    <w:name w:val="Report H1"/>
+    <w:basedOn w:val="1"/>
+    <w:pPr>
+      <w:keepNext/>
+      <w:widowControl/>
+      <w:spacing w:after="60" w:before="120" w:line="360" w:lineRule="auto"/>
+      <w:ind w:firstLine="0"/>
+      <w:outlineLvl w:val="0"/>
+    </w:pPr>
+    <w:rPr>
+      <w:rFonts w:ascii="Times New Roman" w:hAnsi="Times New Roman" w:eastAsia="宋体"/>
+      <w:b/>
+      <w:sz w:val="28"/>
+    </w:rPr>
+  </w:style>
+  <w:style w:type="paragraph" w:customStyle="1" w:styleId="ReportH2">
+    <w:name w:val="Report H2"/>
+    <w:basedOn w:val="1"/>
+    <w:pPr>
+      <w:keepNext/>
+      <w:widowControl/>
+      <w:spacing w:after="60" w:before="120" w:line="360" w:lineRule="auto"/>
+      <w:ind w:firstLine="0"/>
+      <w:outlineLvl w:val="1"/>
+    </w:pPr>
+    <w:rPr>
+      <w:rFonts w:ascii="Times New Roman" w:hAnsi="Times New Roman" w:eastAsia="宋体"/>
+      <w:b/>
+      <w:sz w:val="24"/>
+    </w:rPr>
+  </w:style>
+  <w:style w:type="paragraph" w:customStyle="1" w:styleId="ReportBody">
+    <w:name w:val="Report Body"/>
+    <w:basedOn w:val="1"/>
+    <w:pPr>
+      <w:keepLines/>
+      <w:widowControl/>
+      <w:spacing w:after="0" w:before="0" w:line="360" w:lineRule="auto"/>
+      <w:ind w:firstLine="480"/>
+    </w:pPr>
+    <w:rPr>
+      <w:rFonts w:ascii="Times New Roman" w:hAnsi="Times New Roman" w:eastAsia="宋体"/>
+      <w:b w:val="0"/>
+      <w:sz w:val="24"/>
+    </w:rPr>
+  </w:style>
+  <w:style w:type="paragraph" w:customStyle="1" w:styleId="ReportCaption">
+    <w:name w:val="Report Caption"/>
+    <w:basedOn w:val="1"/>
+    <w:pPr>
+      <w:widowControl/>
+      <w:spacing w:after="120" w:before="0" w:line="360" w:lineRule="auto"/>
+      <w:ind w:firstLine="0"/>
+      <w:jc w:val="center"/>
+    </w:pPr>
+    <w:rPr>
+      <w:rFonts w:ascii="Times New Roman" w:hAnsi="Times New Roman" w:eastAsia="宋体"/>
+      <w:b w:val="0"/>
+      <w:sz w:val="21"/>
+    </w:rPr>
+  </w:style>
+  <w:style w:type="paragraph" w:customStyle="1" w:styleId="ReportCode">
+    <w:name w:val="Report Code"/>
+    <w:basedOn w:val="1"/>
+    <w:pPr>
+      <w:keepLines/>
+      <w:widowControl/>
+      <w:spacing w:after="0" w:before="0" w:line="240" w:lineRule="auto"/>
+      <w:ind w:firstLine="0" w:left="240"/>
+      <w:jc w:val="left"/>
+    </w:pPr>
+    <w:rPr>
+      <w:rFonts w:ascii="Consolas" w:hAnsi="Consolas" w:eastAsia="新宋体"/>
+      <w:b w:val="0"/>
+      <w:sz w:val="20"/>
+    </w:rPr>
+  </w:style>
 </w:styles>
 </file>
 

</xml_diff>

<commit_message>
docs: revise report B for server aggregation and signed trustee results
</commit_message>
<xml_diff>
--- a/reports/成员B_同态汇总与受控解密模块_报告.docx
+++ b/reports/成员B_同态汇总与受控解密模块_报告.docx
@@ -2155,28 +2155,15 @@
         <w:pageBreakBefore/>
       </w:pPr>
       <w:r>
-        <w:rPr>
-          <w:rFonts w:ascii="Times New Roman" w:hAnsi="Times New Roman" w:eastAsia="宋体"/>
-          <w:b/>
-          <w:color w:val="000000"/>
-          <w:sz w:val="32"/>
-        </w:rPr>
         <w:t>基于同态加密的隐私保护投票系统</w:t>
       </w:r>
     </w:p>
     <w:p>
       <w:pPr>
         <w:pStyle w:val="ReportH2"/>
-        <w:spacing w:after="120"/>
-      </w:pPr>
-      <w:r>
-        <w:rPr>
-          <w:rFonts w:ascii="Times New Roman" w:hAnsi="Times New Roman" w:eastAsia="宋体"/>
-          <w:b/>
-          <w:color w:val="000000"/>
-          <w:sz w:val="24"/>
-        </w:rPr>
-        <w:t>成员B分工报告  同态汇总与受控解密模块</w:t>
+      </w:pPr>
+      <w:r>
+        <w:t>成员B分工报告  服务器同态汇总、离线解密与签名结果</w:t>
       </w:r>
     </w:p>
     <w:p>
@@ -2184,12 +2171,6 @@
         <w:pStyle w:val="ReportH1"/>
       </w:pPr>
       <w:r>
-        <w:rPr>
-          <w:rFonts w:ascii="Times New Roman" w:hAnsi="Times New Roman" w:eastAsia="宋体"/>
-          <w:b/>
-          <w:color w:val="000000"/>
-          <w:sz w:val="28"/>
-        </w:rPr>
         <w:t>一、课题内容和要求</w:t>
       </w:r>
     </w:p>
@@ -2198,12 +2179,6 @@
         <w:pStyle w:val="ReportH2"/>
       </w:pPr>
       <w:r>
-        <w:rPr>
-          <w:rFonts w:ascii="Times New Roman" w:hAnsi="Times New Roman" w:eastAsia="宋体"/>
-          <w:b/>
-          <w:color w:val="000000"/>
-          <w:sz w:val="24"/>
-        </w:rPr>
         <w:t>1.1 课题内容</w:t>
       </w:r>
     </w:p>
@@ -2212,13 +2187,7 @@
         <w:pStyle w:val="ReportBody"/>
       </w:pPr>
       <w:r>
-        <w:rPr>
-          <w:rFonts w:ascii="Times New Roman" w:hAnsi="Times New Roman" w:eastAsia="宋体"/>
-          <w:b w:val="0"/>
-          <w:color w:val="000000"/>
-          <w:sz w:val="24"/>
-        </w:rPr>
-        <w:t>系统使用Paillier加法同态加密实现本地可视化投票。投票端生成加密选票，计票端只访问公开数据并汇总密文，独立解密进程在投票关闭后返回各选项总票数。额外实现投票关闭与Ed25519签名清单审计，检测已接收选票的删除和修改。</w:t>
+        <w:t>设计一个电子投票系统，利用同态加密技术，使服务器在不查看个人投票内容的情况下统计总票。本实现采用Paillier加法同态：投票端本地加密，服务器只接收密文并进行列乘积，独立保管端只解密完整汇总，服务器公布经过签名的总票。</w:t>
       </w:r>
     </w:p>
     <w:p>
@@ -2226,13 +2195,7 @@
         <w:pStyle w:val="ReportBody"/>
       </w:pPr>
       <w:r>
-        <w:rPr>
-          <w:rFonts w:ascii="Times New Roman" w:hAnsi="Times New Roman" w:eastAsia="宋体"/>
-          <w:b w:val="0"/>
-          <w:color w:val="000000"/>
-          <w:sz w:val="24"/>
-        </w:rPr>
-        <w:t>在不解密单票的前提下汇总各选项密文，通过独立解密进程返回最终票数，并核对该请求确实来自当前完整且关闭的投票。重点是准确性、角色边界和性能解释。</w:t>
+        <w:t>操作场景为局域网服务器开放端口，各客户端填写IP和端口连接，也允许本机启动多个客户端模拟多端。选票包含ID、票型、时间戳、随机标识与密文向量；通过凭证绑定和签名记录检测重复、越权及数据修改。</w:t>
       </w:r>
     </w:p>
     <w:p>
@@ -2240,13 +2203,7 @@
         <w:pStyle w:val="ReportH2"/>
       </w:pPr>
       <w:r>
-        <w:rPr>
-          <w:rFonts w:ascii="Times New Roman" w:hAnsi="Times New Roman" w:eastAsia="宋体"/>
-          <w:b/>
-          <w:color w:val="000000"/>
-          <w:sz w:val="24"/>
-        </w:rPr>
-        <w:t>1.2 课题要求与本分工责任</w:t>
+        <w:t>1.2 本分工要求</w:t>
       </w:r>
     </w:p>
     <w:p>
@@ -2254,13 +2211,7 @@
         <w:pStyle w:val="ReportBody"/>
       </w:pPr>
       <w:r>
-        <w:rPr>
-          <w:rFonts w:ascii="Times New Roman" w:hAnsi="Times New Roman" w:eastAsia="宋体"/>
-          <w:b w:val="0"/>
-          <w:color w:val="000000"/>
-          <w:sz w:val="24"/>
-        </w:rPr>
-        <w:t>计票端只读取public目录并且不需要保管口令。开放状态禁止汇总查询；关闭后才允许计算结果。解密端独立检查签名清单，重新计算完整汇总，并核对轮次、清单摘要、密文向量和接收票数。结果必须满足各项票数不超过总票数且总和等于已接收人数。</w:t>
+        <w:t>本分工负责服务器同态汇总、离线解密与签名结果，需要说明数据输入、输出、失败条件及与其他模块的接口；通过可复跑的实验验证功能、耗时和安全边界。</w:t>
       </w:r>
     </w:p>
     <w:p>
@@ -2268,13 +2219,7 @@
         <w:pStyle w:val="ReportBody"/>
       </w:pPr>
       <w:r>
-        <w:rPr>
-          <w:rFonts w:ascii="Times New Roman" w:hAnsi="Times New Roman" w:eastAsia="宋体"/>
-          <w:b w:val="0"/>
-          <w:color w:val="000000"/>
-          <w:sz w:val="24"/>
-        </w:rPr>
-        <w:t>本报告对应的代码范围：tally_service.py；app_ui.py中的trustee_process；experiments.py中的准确性、零票、解密边界与性能实验。</w:t>
+        <w:t>本分工主要代码：network_protocol.py、network_trustee.py；与network_store.py的导出、发布接口协作。A/B/C表示模块责任，姓名学号与实际个人贡献由成员据实确认。</w:t>
       </w:r>
     </w:p>
     <w:p>
@@ -2282,12 +2227,6 @@
         <w:pStyle w:val="ReportH1"/>
       </w:pPr>
       <w:r>
-        <w:rPr>
-          <w:rFonts w:ascii="Times New Roman" w:hAnsi="Times New Roman" w:eastAsia="宋体"/>
-          <w:b/>
-          <w:color w:val="000000"/>
-          <w:sz w:val="28"/>
-        </w:rPr>
         <w:t>二、需求分析和总体设计</w:t>
       </w:r>
     </w:p>
@@ -2304,7 +2243,7 @@
         <w:pStyle w:val="ReportBody"/>
       </w:pPr>
       <w:r>
-        <w:t>计票模块只需公开配置、密文选票和签名清单，输出每个选项的密文乘积。保管端核验当前关闭状态及完整汇总后，使用私钥返回总票数。两端通过JSON请求关联轮次、清单摘要、密文向量与接收票数，结果须满足非负、单项上界和总和约束。</w:t>
+        <w:t>服务器审计已登记的密文集合，在关闭状态按选项列相乘，输出完整公开汇总包。独立保管端使用本地可信配置复核集合及乘积，再读取本地私钥解密各选项总票并签名。服务器核验签名后公布结果，所有客户端可验证。</w:t>
       </w:r>
     </w:p>
     <w:p>
@@ -2320,7 +2259,7 @@
         <w:pStyle w:val="ReportBody"/>
       </w:pPr>
       <w:r>
-        <w:t>选择按选项列进行模乘，避免逐票解密。累积元取1，因此空集合解密为0。为避免解密端成为任意密文查询服务，在加载私钥前独立审计和复算；对不完整或过期请求明确拒绝。耗时由复算端自身测量，不能由调用方提供负数或伪造值。</w:t>
+        <w:t>计票分为服务器密文计算与保管端总票解密两个步骤。服务器进程不导入解密操作，也没有接收私钥的接口。保管端先验证关闭清单，再独立计算完整乘积，拒绝单票或部分汇总请求；使用批准记录把同一轮次绑定到一个确定集合，结果签名密钥与服务器登记签名密钥分离。</w:t>
       </w:r>
     </w:p>
     <w:p>
@@ -2328,7 +2267,15 @@
         <w:pStyle w:val="ReportH2"/>
       </w:pPr>
       <w:r>
-        <w:t>2.3 模块接口与分工</w:t>
+        <w:t>2.3 系统部署与接口</w:t>
+      </w:r>
+    </w:p>
+    <w:p>
+      <w:pPr>
+        <w:pStyle w:val="ReportBody"/>
+      </w:pPr>
+      <w:r>
+        <w:t>组织者在保管端初始化三个目录：server部署到收票电脑，trustee留在独立保管电脑，organizer内的凭证按身份分发。初始化过程中产生私钥，但运行中的网络服务器从未获得Paillier私钥；服务器TLS私钥和登记签名私钥仅用于通信、审计，不具有选票解密能力。</w:t>
       </w:r>
     </w:p>
     <w:p>
@@ -2337,168 +2284,117 @@
         <w:keepNext/>
       </w:pPr>
       <w:r>
-        <w:t>表1 小组模块划分</w:t>
+        <w:t>表1 三端职责和数据边界</w:t>
       </w:r>
     </w:p>
     <w:tbl>
       <w:tblPr>
         <w:tblW w:type="auto" w:w="0"/>
-        <w:jc w:val="center"/>
         <w:tblLayout w:type="fixed"/>
         <w:tblLook w:firstColumn="1" w:firstRow="1" w:lastColumn="0" w:lastRow="0" w:noHBand="0" w:noVBand="1" w:val="04A0"/>
       </w:tblPr>
       <w:tblGrid>
-        <w:gridCol w:w="794"/>
-        <w:gridCol w:w="2665"/>
-        <w:gridCol w:w="5726"/>
+        <w:gridCol w:w="3118"/>
+        <w:gridCol w:w="3118"/>
+        <w:gridCol w:w="3118"/>
       </w:tblGrid>
       <w:tr>
         <w:trPr>
           <w:tblHeader/>
-          <w:tblHeader/>
         </w:trPr>
         <w:tc>
           <w:tcPr>
-            <w:tcW w:type="dxa" w:w="794"/>
-            <w:vAlign w:val="center"/>
-            <w:tcBorders>
-              <w:top w:val="single" w:sz="4" w:color="D9D9D9"/>
-              <w:left w:val="single" w:sz="4" w:color="D9D9D9"/>
-              <w:bottom w:val="single" w:sz="4" w:color="D9D9D9"/>
-              <w:right w:val="single" w:sz="4" w:color="D9D9D9"/>
-              <w:top w:val="single" w:sz="4" w:color="D9D9D9"/>
-              <w:left w:val="single" w:sz="4" w:color="D9D9D9"/>
-              <w:bottom w:val="single" w:sz="4" w:color="D9D9D9"/>
-              <w:right w:val="single" w:sz="4" w:color="D9D9D9"/>
-            </w:tcBorders>
-            <w:tcMar>
-              <w:top w:w="75" w:type="dxa"/>
-              <w:left w:w="75" w:type="dxa"/>
-              <w:bottom w:w="75" w:type="dxa"/>
-              <w:right w:w="75" w:type="dxa"/>
-            </w:tcMar>
-            <w:shd w:fill="E8EDF1"/>
-          </w:tcPr>
-          <w:p>
-            <w:pPr>
-              <w:keepNext/>
-              <w:spacing w:after="40" w:line="288" w:lineRule="auto" w:before="40"/>
-            </w:pPr>
-            <w:r>
-              <w:rPr>
-                <w:rFonts w:ascii="Times New Roman" w:hAnsi="Times New Roman" w:eastAsia="宋体"/>
-                <w:b/>
-                <w:color w:val="000000"/>
-                <w:sz w:val="21"/>
-              </w:rPr>
-              <w:t>成员</w:t>
-            </w:r>
-          </w:p>
-        </w:tc>
-        <w:tc>
-          <w:tcPr>
-            <w:tcW w:type="dxa" w:w="2665"/>
-            <w:vAlign w:val="center"/>
-            <w:tcBorders>
-              <w:top w:val="single" w:sz="4" w:color="D9D9D9"/>
-              <w:left w:val="single" w:sz="4" w:color="D9D9D9"/>
-              <w:bottom w:val="single" w:sz="4" w:color="D9D9D9"/>
-              <w:right w:val="single" w:sz="4" w:color="D9D9D9"/>
-              <w:top w:val="single" w:sz="4" w:color="D9D9D9"/>
-              <w:left w:val="single" w:sz="4" w:color="D9D9D9"/>
-              <w:bottom w:val="single" w:sz="4" w:color="D9D9D9"/>
-              <w:right w:val="single" w:sz="4" w:color="D9D9D9"/>
-            </w:tcBorders>
-            <w:tcMar>
-              <w:top w:w="75" w:type="dxa"/>
-              <w:left w:w="75" w:type="dxa"/>
-              <w:bottom w:w="75" w:type="dxa"/>
-              <w:right w:w="75" w:type="dxa"/>
-            </w:tcMar>
-            <w:shd w:fill="E8EDF1"/>
-          </w:tcPr>
-          <w:p>
-            <w:pPr>
-              <w:keepNext/>
-              <w:spacing w:after="40" w:line="288" w:lineRule="auto" w:before="40"/>
-            </w:pPr>
-            <w:r>
-              <w:rPr>
-                <w:rFonts w:ascii="Times New Roman" w:hAnsi="Times New Roman" w:eastAsia="宋体"/>
-                <w:b/>
-                <w:color w:val="000000"/>
-                <w:sz w:val="21"/>
-              </w:rPr>
-              <w:t>负责模块</w:t>
-            </w:r>
-          </w:p>
-        </w:tc>
-        <w:tc>
-          <w:tcPr>
-            <w:tcW w:type="dxa" w:w="5726"/>
-            <w:vAlign w:val="center"/>
-            <w:tcBorders>
-              <w:top w:val="single" w:sz="4" w:color="D9D9D9"/>
-              <w:left w:val="single" w:sz="4" w:color="D9D9D9"/>
-              <w:bottom w:val="single" w:sz="4" w:color="D9D9D9"/>
-              <w:right w:val="single" w:sz="4" w:color="D9D9D9"/>
-              <w:top w:val="single" w:sz="4" w:color="D9D9D9"/>
-              <w:left w:val="single" w:sz="4" w:color="D9D9D9"/>
-              <w:bottom w:val="single" w:sz="4" w:color="D9D9D9"/>
-              <w:right w:val="single" w:sz="4" w:color="D9D9D9"/>
-            </w:tcBorders>
-            <w:tcMar>
-              <w:top w:w="75" w:type="dxa"/>
-              <w:left w:w="75" w:type="dxa"/>
-              <w:bottom w:w="75" w:type="dxa"/>
-              <w:right w:w="75" w:type="dxa"/>
-            </w:tcMar>
-            <w:shd w:fill="E8EDF1"/>
-          </w:tcPr>
-          <w:p>
-            <w:pPr>
-              <w:keepNext/>
-              <w:spacing w:after="40" w:line="288" w:lineRule="auto" w:before="40"/>
-            </w:pPr>
-            <w:r>
-              <w:rPr>
-                <w:rFonts w:ascii="Times New Roman" w:hAnsi="Times New Roman" w:eastAsia="宋体"/>
-                <w:b/>
-                <w:color w:val="000000"/>
-                <w:sz w:val="21"/>
-              </w:rPr>
-              <w:t>交付与验证</w:t>
+            <w:tcW w:type="dxa" w:w="1361"/>
+            <w:tcBorders>
+              <w:top w:val="single" w:sz="4" w:color="C9D4DF"/>
+              <w:left w:val="single" w:sz="4" w:color="C9D4DF"/>
+              <w:bottom w:val="single" w:sz="4" w:color="C9D4DF"/>
+              <w:right w:val="single" w:sz="4" w:color="C9D4DF"/>
+            </w:tcBorders>
+            <w:shd w:fill="E8EEF3"/>
+          </w:tcPr>
+          <w:p>
+            <w:pPr>
+              <w:spacing w:line="288" w:lineRule="auto" w:before="60" w:after="60"/>
+            </w:pPr>
+            <w:r>
+              <w:rPr>
+                <w:rFonts w:ascii="Times New Roman" w:hAnsi="Times New Roman" w:eastAsia="宋体"/>
+                <w:b/>
+                <w:color w:val="000000"/>
+                <w:sz w:val="21"/>
+              </w:rPr>
+              <w:t>角色</w:t>
+            </w:r>
+          </w:p>
+        </w:tc>
+        <w:tc>
+          <w:tcPr>
+            <w:tcW w:type="dxa" w:w="4535"/>
+            <w:tcBorders>
+              <w:top w:val="single" w:sz="4" w:color="C9D4DF"/>
+              <w:left w:val="single" w:sz="4" w:color="C9D4DF"/>
+              <w:bottom w:val="single" w:sz="4" w:color="C9D4DF"/>
+              <w:right w:val="single" w:sz="4" w:color="C9D4DF"/>
+            </w:tcBorders>
+            <w:shd w:fill="E8EEF3"/>
+          </w:tcPr>
+          <w:p>
+            <w:pPr>
+              <w:spacing w:line="288" w:lineRule="auto" w:before="60" w:after="60"/>
+            </w:pPr>
+            <w:r>
+              <w:rPr>
+                <w:rFonts w:ascii="Times New Roman" w:hAnsi="Times New Roman" w:eastAsia="宋体"/>
+                <w:b/>
+                <w:color w:val="000000"/>
+                <w:sz w:val="21"/>
+              </w:rPr>
+              <w:t>输入与操作</w:t>
+            </w:r>
+          </w:p>
+        </w:tc>
+        <w:tc>
+          <w:tcPr>
+            <w:tcW w:type="dxa" w:w="2948"/>
+            <w:tcBorders>
+              <w:top w:val="single" w:sz="4" w:color="C9D4DF"/>
+              <w:left w:val="single" w:sz="4" w:color="C9D4DF"/>
+              <w:bottom w:val="single" w:sz="4" w:color="C9D4DF"/>
+              <w:right w:val="single" w:sz="4" w:color="C9D4DF"/>
+            </w:tcBorders>
+            <w:shd w:fill="E8EEF3"/>
+          </w:tcPr>
+          <w:p>
+            <w:pPr>
+              <w:spacing w:line="288" w:lineRule="auto" w:before="60" w:after="60"/>
+            </w:pPr>
+            <w:r>
+              <w:rPr>
+                <w:rFonts w:ascii="Times New Roman" w:hAnsi="Times New Roman" w:eastAsia="宋体"/>
+                <w:b/>
+                <w:color w:val="000000"/>
+                <w:sz w:val="21"/>
+              </w:rPr>
+              <w:t>可持有的秘密</w:t>
             </w:r>
           </w:p>
         </w:tc>
       </w:tr>
       <w:tr>
-        <w:trPr/>
-        <w:tc>
-          <w:tcPr>
-            <w:tcW w:type="dxa" w:w="794"/>
-            <w:vAlign w:val="center"/>
-            <w:tcBorders>
-              <w:top w:val="single" w:sz="4" w:color="D9D9D9"/>
-              <w:left w:val="single" w:sz="4" w:color="D9D9D9"/>
-              <w:bottom w:val="single" w:sz="4" w:color="D9D9D9"/>
-              <w:right w:val="single" w:sz="4" w:color="D9D9D9"/>
-              <w:top w:val="single" w:sz="4" w:color="D9D9D9"/>
-              <w:left w:val="single" w:sz="4" w:color="D9D9D9"/>
-              <w:bottom w:val="single" w:sz="4" w:color="D9D9D9"/>
-              <w:right w:val="single" w:sz="4" w:color="D9D9D9"/>
-            </w:tcBorders>
-            <w:tcMar>
-              <w:top w:w="75" w:type="dxa"/>
-              <w:left w:w="75" w:type="dxa"/>
-              <w:bottom w:w="75" w:type="dxa"/>
-              <w:right w:w="75" w:type="dxa"/>
-            </w:tcMar>
-          </w:tcPr>
-          <w:p>
-            <w:pPr>
-              <w:keepNext/>
-              <w:spacing w:after="40" w:line="288" w:lineRule="auto" w:before="40"/>
+        <w:tc>
+          <w:tcPr>
+            <w:tcW w:type="dxa" w:w="1361"/>
+            <w:tcBorders>
+              <w:top w:val="single" w:sz="4" w:color="C9D4DF"/>
+              <w:left w:val="single" w:sz="4" w:color="C9D4DF"/>
+              <w:bottom w:val="single" w:sz="4" w:color="C9D4DF"/>
+              <w:right w:val="single" w:sz="4" w:color="C9D4DF"/>
+            </w:tcBorders>
+          </w:tcPr>
+          <w:p>
+            <w:pPr>
+              <w:spacing w:line="288" w:lineRule="auto" w:before="60" w:after="60"/>
             </w:pPr>
             <w:r>
               <w:rPr>
@@ -2507,35 +2403,23 @@
                 <w:color w:val="000000"/>
                 <w:sz w:val="21"/>
               </w:rPr>
-              <w:t>A</w:t>
-            </w:r>
-          </w:p>
-        </w:tc>
-        <w:tc>
-          <w:tcPr>
-            <w:tcW w:type="dxa" w:w="2665"/>
-            <w:vAlign w:val="center"/>
-            <w:tcBorders>
-              <w:top w:val="single" w:sz="4" w:color="D9D9D9"/>
-              <w:left w:val="single" w:sz="4" w:color="D9D9D9"/>
-              <w:bottom w:val="single" w:sz="4" w:color="D9D9D9"/>
-              <w:right w:val="single" w:sz="4" w:color="D9D9D9"/>
-              <w:top w:val="single" w:sz="4" w:color="D9D9D9"/>
-              <w:left w:val="single" w:sz="4" w:color="D9D9D9"/>
-              <w:bottom w:val="single" w:sz="4" w:color="D9D9D9"/>
-              <w:right w:val="single" w:sz="4" w:color="D9D9D9"/>
-            </w:tcBorders>
-            <w:tcMar>
-              <w:top w:w="75" w:type="dxa"/>
-              <w:left w:w="75" w:type="dxa"/>
-              <w:bottom w:w="75" w:type="dxa"/>
-              <w:right w:w="75" w:type="dxa"/>
-            </w:tcMar>
-          </w:tcPr>
-          <w:p>
-            <w:pPr>
-              <w:keepNext/>
-              <w:spacing w:after="40" w:line="288" w:lineRule="auto" w:before="40"/>
+              <w:t>客户端</w:t>
+            </w:r>
+          </w:p>
+        </w:tc>
+        <w:tc>
+          <w:tcPr>
+            <w:tcW w:type="dxa" w:w="4535"/>
+            <w:tcBorders>
+              <w:top w:val="single" w:sz="4" w:color="C9D4DF"/>
+              <w:left w:val="single" w:sz="4" w:color="C9D4DF"/>
+              <w:bottom w:val="single" w:sz="4" w:color="C9D4DF"/>
+              <w:right w:val="single" w:sz="4" w:color="C9D4DF"/>
+            </w:tcBorders>
+          </w:tcPr>
+          <w:p>
+            <w:pPr>
+              <w:spacing w:line="288" w:lineRule="auto" w:before="60" w:after="60"/>
             </w:pPr>
             <w:r>
               <w:rPr>
@@ -2544,35 +2428,23 @@
                 <w:color w:val="000000"/>
                 <w:sz w:val="21"/>
               </w:rPr>
-              <w:t>密钥与加密选票</w:t>
-            </w:r>
-          </w:p>
-        </w:tc>
-        <w:tc>
-          <w:tcPr>
-            <w:tcW w:type="dxa" w:w="5726"/>
-            <w:vAlign w:val="center"/>
-            <w:tcBorders>
-              <w:top w:val="single" w:sz="4" w:color="D9D9D9"/>
-              <w:left w:val="single" w:sz="4" w:color="D9D9D9"/>
-              <w:bottom w:val="single" w:sz="4" w:color="D9D9D9"/>
-              <w:right w:val="single" w:sz="4" w:color="D9D9D9"/>
-              <w:top w:val="single" w:sz="4" w:color="D9D9D9"/>
-              <w:left w:val="single" w:sz="4" w:color="D9D9D9"/>
-              <w:bottom w:val="single" w:sz="4" w:color="D9D9D9"/>
-              <w:right w:val="single" w:sz="4" w:color="D9D9D9"/>
-            </w:tcBorders>
-            <w:tcMar>
-              <w:top w:w="75" w:type="dxa"/>
-              <w:left w:w="75" w:type="dxa"/>
-              <w:bottom w:w="75" w:type="dxa"/>
-              <w:right w:w="75" w:type="dxa"/>
-            </w:tcMar>
-          </w:tcPr>
-          <w:p>
-            <w:pPr>
-              <w:keepNext/>
-              <w:spacing w:after="40" w:line="288" w:lineRule="auto" w:before="40"/>
+              <w:t>IP、端口、凭证；本地加密后提交密文</w:t>
+            </w:r>
+          </w:p>
+        </w:tc>
+        <w:tc>
+          <w:tcPr>
+            <w:tcW w:type="dxa" w:w="2948"/>
+            <w:tcBorders>
+              <w:top w:val="single" w:sz="4" w:color="C9D4DF"/>
+              <w:left w:val="single" w:sz="4" w:color="C9D4DF"/>
+              <w:bottom w:val="single" w:sz="4" w:color="C9D4DF"/>
+              <w:right w:val="single" w:sz="4" w:color="C9D4DF"/>
+            </w:tcBorders>
+          </w:tcPr>
+          <w:p>
+            <w:pPr>
+              <w:spacing w:line="288" w:lineRule="auto" w:before="60" w:after="60"/>
             </w:pPr>
             <w:r>
               <w:rPr>
@@ -2581,38 +2453,25 @@
                 <w:color w:val="000000"/>
                 <w:sz w:val="21"/>
               </w:rPr>
-              <w:t>编码、随机加密、密钥封装；同态和输入边界测试</w:t>
+              <w:t>本人票码、当前选择</w:t>
             </w:r>
           </w:p>
         </w:tc>
       </w:tr>
       <w:tr>
-        <w:trPr/>
-        <w:tc>
-          <w:tcPr>
-            <w:tcW w:type="dxa" w:w="794"/>
-            <w:vAlign w:val="center"/>
-            <w:tcBorders>
-              <w:top w:val="single" w:sz="4" w:color="D9D9D9"/>
-              <w:left w:val="single" w:sz="4" w:color="D9D9D9"/>
-              <w:bottom w:val="single" w:sz="4" w:color="D9D9D9"/>
-              <w:right w:val="single" w:sz="4" w:color="D9D9D9"/>
-              <w:top w:val="single" w:sz="4" w:color="D9D9D9"/>
-              <w:left w:val="single" w:sz="4" w:color="D9D9D9"/>
-              <w:bottom w:val="single" w:sz="4" w:color="D9D9D9"/>
-              <w:right w:val="single" w:sz="4" w:color="D9D9D9"/>
-            </w:tcBorders>
-            <w:tcMar>
-              <w:top w:w="75" w:type="dxa"/>
-              <w:left w:w="75" w:type="dxa"/>
-              <w:bottom w:w="75" w:type="dxa"/>
-              <w:right w:w="75" w:type="dxa"/>
-            </w:tcMar>
-          </w:tcPr>
-          <w:p>
-            <w:pPr>
-              <w:keepNext/>
-              <w:spacing w:after="40" w:line="288" w:lineRule="auto" w:before="40"/>
+        <w:tc>
+          <w:tcPr>
+            <w:tcW w:type="dxa" w:w="1361"/>
+            <w:tcBorders>
+              <w:top w:val="single" w:sz="4" w:color="C9D4DF"/>
+              <w:left w:val="single" w:sz="4" w:color="C9D4DF"/>
+              <w:bottom w:val="single" w:sz="4" w:color="C9D4DF"/>
+              <w:right w:val="single" w:sz="4" w:color="C9D4DF"/>
+            </w:tcBorders>
+          </w:tcPr>
+          <w:p>
+            <w:pPr>
+              <w:spacing w:line="288" w:lineRule="auto" w:before="60" w:after="60"/>
             </w:pPr>
             <w:r>
               <w:rPr>
@@ -2621,35 +2480,23 @@
                 <w:color w:val="000000"/>
                 <w:sz w:val="21"/>
               </w:rPr>
-              <w:t>B</w:t>
-            </w:r>
-          </w:p>
-        </w:tc>
-        <w:tc>
-          <w:tcPr>
-            <w:tcW w:type="dxa" w:w="2665"/>
-            <w:vAlign w:val="center"/>
-            <w:tcBorders>
-              <w:top w:val="single" w:sz="4" w:color="D9D9D9"/>
-              <w:left w:val="single" w:sz="4" w:color="D9D9D9"/>
-              <w:bottom w:val="single" w:sz="4" w:color="D9D9D9"/>
-              <w:right w:val="single" w:sz="4" w:color="D9D9D9"/>
-              <w:top w:val="single" w:sz="4" w:color="D9D9D9"/>
-              <w:left w:val="single" w:sz="4" w:color="D9D9D9"/>
-              <w:bottom w:val="single" w:sz="4" w:color="D9D9D9"/>
-              <w:right w:val="single" w:sz="4" w:color="D9D9D9"/>
-            </w:tcBorders>
-            <w:tcMar>
-              <w:top w:w="75" w:type="dxa"/>
-              <w:left w:w="75" w:type="dxa"/>
-              <w:bottom w:w="75" w:type="dxa"/>
-              <w:right w:w="75" w:type="dxa"/>
-            </w:tcMar>
-          </w:tcPr>
-          <w:p>
-            <w:pPr>
-              <w:keepNext/>
-              <w:spacing w:after="40" w:line="288" w:lineRule="auto" w:before="40"/>
+              <w:t>服务器</w:t>
+            </w:r>
+          </w:p>
+        </w:tc>
+        <w:tc>
+          <w:tcPr>
+            <w:tcW w:type="dxa" w:w="4535"/>
+            <w:tcBorders>
+              <w:top w:val="single" w:sz="4" w:color="C9D4DF"/>
+              <w:left w:val="single" w:sz="4" w:color="C9D4DF"/>
+              <w:bottom w:val="single" w:sz="4" w:color="C9D4DF"/>
+              <w:right w:val="single" w:sz="4" w:color="C9D4DF"/>
+            </w:tcBorders>
+          </w:tcPr>
+          <w:p>
+            <w:pPr>
+              <w:spacing w:line="288" w:lineRule="auto" w:before="60" w:after="60"/>
             </w:pPr>
             <w:r>
               <w:rPr>
@@ -2658,35 +2505,23 @@
                 <w:color w:val="000000"/>
                 <w:sz w:val="21"/>
               </w:rPr>
-              <w:t>同态汇总与受控解密</w:t>
-            </w:r>
-          </w:p>
-        </w:tc>
-        <w:tc>
-          <w:tcPr>
-            <w:tcW w:type="dxa" w:w="5726"/>
-            <w:vAlign w:val="center"/>
-            <w:tcBorders>
-              <w:top w:val="single" w:sz="4" w:color="D9D9D9"/>
-              <w:left w:val="single" w:sz="4" w:color="D9D9D9"/>
-              <w:bottom w:val="single" w:sz="4" w:color="D9D9D9"/>
-              <w:right w:val="single" w:sz="4" w:color="D9D9D9"/>
-              <w:top w:val="single" w:sz="4" w:color="D9D9D9"/>
-              <w:left w:val="single" w:sz="4" w:color="D9D9D9"/>
-              <w:bottom w:val="single" w:sz="4" w:color="D9D9D9"/>
-              <w:right w:val="single" w:sz="4" w:color="D9D9D9"/>
-            </w:tcBorders>
-            <w:tcMar>
-              <w:top w:w="75" w:type="dxa"/>
-              <w:left w:w="75" w:type="dxa"/>
-              <w:bottom w:w="75" w:type="dxa"/>
-              <w:right w:w="75" w:type="dxa"/>
-            </w:tcMar>
-          </w:tcPr>
-          <w:p>
-            <w:pPr>
-              <w:keepNext/>
-              <w:spacing w:after="40" w:line="288" w:lineRule="auto" w:before="40"/>
+              <w:t>认证登记、关闭、密文汇总与结果发布</w:t>
+            </w:r>
+          </w:p>
+        </w:tc>
+        <w:tc>
+          <w:tcPr>
+            <w:tcW w:type="dxa" w:w="2948"/>
+            <w:tcBorders>
+              <w:top w:val="single" w:sz="4" w:color="C9D4DF"/>
+              <w:left w:val="single" w:sz="4" w:color="C9D4DF"/>
+              <w:bottom w:val="single" w:sz="4" w:color="C9D4DF"/>
+              <w:right w:val="single" w:sz="4" w:color="C9D4DF"/>
+            </w:tcBorders>
+          </w:tcPr>
+          <w:p>
+            <w:pPr>
+              <w:spacing w:line="288" w:lineRule="auto" w:before="60" w:after="60"/>
             </w:pPr>
             <w:r>
               <w:rPr>
@@ -2695,38 +2530,25 @@
                 <w:color w:val="000000"/>
                 <w:sz w:val="21"/>
               </w:rPr>
-              <w:t>独立解密进程、总票数校验；准确性与性能实验</w:t>
+              <w:t>TLS和登记签名密钥、票码摘要</w:t>
             </w:r>
           </w:p>
         </w:tc>
       </w:tr>
       <w:tr>
-        <w:trPr/>
-        <w:tc>
-          <w:tcPr>
-            <w:tcW w:type="dxa" w:w="794"/>
-            <w:vAlign w:val="center"/>
-            <w:tcBorders>
-              <w:top w:val="single" w:sz="4" w:color="D9D9D9"/>
-              <w:left w:val="single" w:sz="4" w:color="D9D9D9"/>
-              <w:bottom w:val="single" w:sz="4" w:color="D9D9D9"/>
-              <w:right w:val="single" w:sz="4" w:color="D9D9D9"/>
-              <w:top w:val="single" w:sz="4" w:color="D9D9D9"/>
-              <w:left w:val="single" w:sz="4" w:color="D9D9D9"/>
-              <w:bottom w:val="single" w:sz="4" w:color="D9D9D9"/>
-              <w:right w:val="single" w:sz="4" w:color="D9D9D9"/>
-            </w:tcBorders>
-            <w:tcMar>
-              <w:top w:w="75" w:type="dxa"/>
-              <w:left w:w="75" w:type="dxa"/>
-              <w:bottom w:w="75" w:type="dxa"/>
-              <w:right w:w="75" w:type="dxa"/>
-            </w:tcMar>
-          </w:tcPr>
-          <w:p>
-            <w:pPr>
-              <w:keepNext w:val="0"/>
-              <w:spacing w:after="40" w:line="288" w:lineRule="auto" w:before="40"/>
+        <w:tc>
+          <w:tcPr>
+            <w:tcW w:type="dxa" w:w="1361"/>
+            <w:tcBorders>
+              <w:top w:val="single" w:sz="4" w:color="C9D4DF"/>
+              <w:left w:val="single" w:sz="4" w:color="C9D4DF"/>
+              <w:bottom w:val="single" w:sz="4" w:color="C9D4DF"/>
+              <w:right w:val="single" w:sz="4" w:color="C9D4DF"/>
+            </w:tcBorders>
+          </w:tcPr>
+          <w:p>
+            <w:pPr>
+              <w:spacing w:line="288" w:lineRule="auto" w:before="60" w:after="60"/>
             </w:pPr>
             <w:r>
               <w:rPr>
@@ -2735,35 +2557,23 @@
                 <w:color w:val="000000"/>
                 <w:sz w:val="21"/>
               </w:rPr>
-              <w:t>C</w:t>
-            </w:r>
-          </w:p>
-        </w:tc>
-        <w:tc>
-          <w:tcPr>
-            <w:tcW w:type="dxa" w:w="2665"/>
-            <w:vAlign w:val="center"/>
-            <w:tcBorders>
-              <w:top w:val="single" w:sz="4" w:color="D9D9D9"/>
-              <w:left w:val="single" w:sz="4" w:color="D9D9D9"/>
-              <w:bottom w:val="single" w:sz="4" w:color="D9D9D9"/>
-              <w:right w:val="single" w:sz="4" w:color="D9D9D9"/>
-              <w:top w:val="single" w:sz="4" w:color="D9D9D9"/>
-              <w:left w:val="single" w:sz="4" w:color="D9D9D9"/>
-              <w:bottom w:val="single" w:sz="4" w:color="D9D9D9"/>
-              <w:right w:val="single" w:sz="4" w:color="D9D9D9"/>
-            </w:tcBorders>
-            <w:tcMar>
-              <w:top w:w="75" w:type="dxa"/>
-              <w:left w:w="75" w:type="dxa"/>
-              <w:bottom w:w="75" w:type="dxa"/>
-              <w:right w:w="75" w:type="dxa"/>
-            </w:tcMar>
-          </w:tcPr>
-          <w:p>
-            <w:pPr>
-              <w:keepNext w:val="0"/>
-              <w:spacing w:after="40" w:line="288" w:lineRule="auto" w:before="40"/>
+              <w:t>保管端</w:t>
+            </w:r>
+          </w:p>
+        </w:tc>
+        <w:tc>
+          <w:tcPr>
+            <w:tcW w:type="dxa" w:w="4535"/>
+            <w:tcBorders>
+              <w:top w:val="single" w:sz="4" w:color="C9D4DF"/>
+              <w:left w:val="single" w:sz="4" w:color="C9D4DF"/>
+              <w:bottom w:val="single" w:sz="4" w:color="C9D4DF"/>
+              <w:right w:val="single" w:sz="4" w:color="C9D4DF"/>
+            </w:tcBorders>
+          </w:tcPr>
+          <w:p>
+            <w:pPr>
+              <w:spacing w:line="288" w:lineRule="auto" w:before="60" w:after="60"/>
             </w:pPr>
             <w:r>
               <w:rPr>
@@ -2772,35 +2582,23 @@
                 <w:color w:val="000000"/>
                 <w:sz w:val="21"/>
               </w:rPr>
-              <w:t>界面与签名审计</w:t>
-            </w:r>
-          </w:p>
-        </w:tc>
-        <w:tc>
-          <w:tcPr>
-            <w:tcW w:type="dxa" w:w="5726"/>
-            <w:vAlign w:val="center"/>
-            <w:tcBorders>
-              <w:top w:val="single" w:sz="4" w:color="D9D9D9"/>
-              <w:left w:val="single" w:sz="4" w:color="D9D9D9"/>
-              <w:bottom w:val="single" w:sz="4" w:color="D9D9D9"/>
-              <w:right w:val="single" w:sz="4" w:color="D9D9D9"/>
-              <w:top w:val="single" w:sz="4" w:color="D9D9D9"/>
-              <w:left w:val="single" w:sz="4" w:color="D9D9D9"/>
-              <w:bottom w:val="single" w:sz="4" w:color="D9D9D9"/>
-              <w:right w:val="single" w:sz="4" w:color="D9D9D9"/>
-            </w:tcBorders>
-            <w:tcMar>
-              <w:top w:w="75" w:type="dxa"/>
-              <w:left w:w="75" w:type="dxa"/>
-              <w:bottom w:w="75" w:type="dxa"/>
-              <w:right w:w="75" w:type="dxa"/>
-            </w:tcMar>
-          </w:tcPr>
-          <w:p>
-            <w:pPr>
-              <w:keepNext w:val="0"/>
-              <w:spacing w:after="40" w:line="288" w:lineRule="auto" w:before="40"/>
+              <w:t>离线核验完整汇总、解密并签署总票</w:t>
+            </w:r>
+          </w:p>
+        </w:tc>
+        <w:tc>
+          <w:tcPr>
+            <w:tcW w:type="dxa" w:w="2948"/>
+            <w:tcBorders>
+              <w:top w:val="single" w:sz="4" w:color="C9D4DF"/>
+              <w:left w:val="single" w:sz="4" w:color="C9D4DF"/>
+              <w:bottom w:val="single" w:sz="4" w:color="C9D4DF"/>
+              <w:right w:val="single" w:sz="4" w:color="C9D4DF"/>
+            </w:tcBorders>
+          </w:tcPr>
+          <w:p>
+            <w:pPr>
+              <w:spacing w:line="288" w:lineRule="auto" w:before="60" w:after="60"/>
             </w:pPr>
             <w:r>
               <w:rPr>
@@ -2809,7 +2607,7 @@
                 <w:color w:val="000000"/>
                 <w:sz w:val="21"/>
               </w:rPr>
-              <w:t>ID校验、关闭状态、签名清单、GUI与打包测试</w:t>
+              <w:t>Paillier私钥、结果签名私钥</w:t>
             </w:r>
           </w:p>
         </w:tc>
@@ -2820,7 +2618,7 @@
         <w:pStyle w:val="ReportBody"/>
       </w:pPr>
       <w:r>
-        <w:t>公开选票由A交给C登记，C把签名清单与密文交给B汇总，B向保管端提交完整汇总请求。各角色报告分别讨论编码与密钥、汇总与解密、界面与审计；实际姓名、学号和完成记录由成员核对填写。</w:t>
+        <w:t>网络接口均以/api为前缀，以JSON交换数据：election和status返回公开状态；ballots只接受密文选票；me返回绑定身份和本人回执；管理员使用close、export和results。服务器不提供接收明文choice、私钥或保管口令的接口。</w:t>
       </w:r>
     </w:p>
     <w:p>
@@ -2828,12 +2626,6 @@
         <w:pStyle w:val="ReportH1"/>
       </w:pPr>
       <w:r>
-        <w:rPr>
-          <w:rFonts w:ascii="Times New Roman" w:hAnsi="Times New Roman" w:eastAsia="宋体"/>
-          <w:b/>
-          <w:color w:val="000000"/>
-          <w:sz w:val="28"/>
-        </w:rPr>
         <w:t>三、相关功能模块详细设计</w:t>
       </w:r>
     </w:p>
@@ -2842,13 +2634,7 @@
         <w:pStyle w:val="ReportH2"/>
       </w:pPr>
       <w:r>
-        <w:rPr>
-          <w:rFonts w:ascii="Times New Roman" w:hAnsi="Times New Roman" w:eastAsia="宋体"/>
-          <w:b/>
-          <w:color w:val="000000"/>
-          <w:sz w:val="24"/>
-        </w:rPr>
-        <w:t>3.1 密文乘法实现明文加法</w:t>
+        <w:t>3.1 同态加密原理与计票过程</w:t>
       </w:r>
     </w:p>
     <w:p>
@@ -2856,7 +2642,7 @@
         <w:pStyle w:val="ReportBody"/>
       </w:pPr>
       <w:r>
-        <w:t>上游先生成n=pq及g=n+1，把单选编码为独热向量；每项m以c=</w:t>
+        <w:t>Paillier密钥取不同素数p、q，令n=pq、g=n+1。明文m使用与n互素的独立随机数r加密：c=</w:t>
       </w:r>
       <w:r>
         <w:t>g</w:t>
@@ -2880,7 +2666,19 @@
         <w:t>n</w:t>
       </w:r>
       <w:r>
-        <w:t xml:space="preserve"> mod n²独立随机加密。私钥p、q由口令保管库保护。汇总端只读取n，保管端才加载p、q并调用raw_decrypt，这与原语接口的分工一致[2]。</w:t>
+        <w:t xml:space="preserve"> mod n²。私钥可用λ=lcm(p−1,q−1)与μ表示，解密为m=L(</w:t>
+      </w:r>
+      <w:r>
+        <w:t>c</w:t>
+      </w:r>
+      <w:r>
+        <w:rPr>
+          <w:vertAlign w:val="superscript"/>
+        </w:rPr>
+        <w:t>λ</w:t>
+      </w:r>
+      <w:r>
+        <w:t xml:space="preserve"> mod n²)μ mod n，其中L(u)=(u−1)/n；phe实现利用p、q及CRT加速[2]。</w:t>
       </w:r>
     </w:p>
     <w:p>
@@ -2888,13 +2686,7 @@
         <w:pStyle w:val="ReportBody"/>
       </w:pPr>
       <w:r>
-        <w:rPr>
-          <w:rFonts w:ascii="Times New Roman" w:hAnsi="Times New Roman" w:eastAsia="宋体"/>
-          <w:b w:val="0"/>
-          <w:color w:val="000000"/>
-          <w:sz w:val="24"/>
-        </w:rPr>
-        <w:t>Paillier满足E(a;r1)E(b;r2) mod n² = E((a+b) mod n;r1r2 mod n)。本实验人数不超过10000，远小于2048位n，因此不会发生票数模n回绕。每个选项初始化累积值1，再将该列所有密文相乘并对n²取模。程序使用原始非负整数编码，不涉及浮点指数。</w:t>
+        <w:t>同态关系为E(a;r₁)E(b;r₂) mod n² = E((a+b) mod n;r₁r₂ mod n)。单选编码为独热向量，服务器对每个选项分别累乘密文，得到计数之和的加密形式。人数上限10000远小于2048位n，因此正常计数不会模n回绕。服务器计算列乘积无需解密。</w:t>
       </w:r>
     </w:p>
     <w:p>
@@ -2902,13 +2694,7 @@
         <w:pStyle w:val="ReportH2"/>
       </w:pPr>
       <w:r>
-        <w:rPr>
-          <w:rFonts w:ascii="Times New Roman" w:hAnsi="Times New Roman" w:eastAsia="宋体"/>
-          <w:b/>
-          <w:color w:val="000000"/>
-          <w:sz w:val="24"/>
-        </w:rPr>
-        <w:t>3.2 汇总请求与完整性绑定</w:t>
+        <w:t>3.2 本模块设计</w:t>
       </w:r>
     </w:p>
     <w:p>
@@ -2916,13 +2702,7 @@
         <w:pStyle w:val="ReportBody"/>
       </w:pPr>
       <w:r>
-        <w:rPr>
-          <w:rFonts w:ascii="Times New Roman" w:hAnsi="Times New Roman" w:eastAsia="宋体"/>
-          <w:b w:val="0"/>
-          <w:color w:val="000000"/>
-          <w:sz w:val="24"/>
-        </w:rPr>
-        <w:t>aggregate先调用audit，再检查closed状态，输出轮次、签名清单payload摘要、密文向量、票数和耗时。没有任何Paillier私钥输入。公开ZIP不包含private目录；把公开包放到独立目录中仍可进行汇总，测试已验证这一点。</w:t>
+        <w:t>聚合向量的初值为1，逐列执行C_j=∏c_ij mod n²，因此空集合解密为零。保管端对选票ID、随机标识、摘要、顺序和签名清单作一致性核验，并比较自己计算的密文向量与请求。结果绑定轮次、配置摘要、清单摘要和汇总包摘要；只有本地批准记录允许的完整集合才返回结果。重复处理同一个汇总返回已有签名结果。</w:t>
       </w:r>
     </w:p>
     <w:p>
@@ -2930,13 +2710,7 @@
         <w:pStyle w:val="ReportH2"/>
       </w:pPr>
       <w:r>
-        <w:rPr>
-          <w:rFonts w:ascii="Times New Roman" w:hAnsi="Times New Roman" w:eastAsia="宋体"/>
-          <w:b/>
-          <w:color w:val="000000"/>
-          <w:sz w:val="24"/>
-        </w:rPr>
-        <w:t>3.3 解密端拒绝任意密文查询</w:t>
+        <w:t>3.3 验证与失败处理</w:t>
       </w:r>
     </w:p>
     <w:p>
@@ -2944,13 +2718,7 @@
         <w:pStyle w:val="ReportBody"/>
       </w:pPr>
       <w:r>
-        <w:rPr>
-          <w:rFonts w:ascii="Times New Roman" w:hAnsi="Times New Roman" w:eastAsia="宋体"/>
-          <w:b w:val="0"/>
-          <w:color w:val="000000"/>
-          <w:sz w:val="24"/>
-        </w:rPr>
-        <w:t>trustee_process使用标准输入管道传递口令，命令行参数中不包含口令。子进程重新审计并重新汇总，只有请求与当前完整结果一致才加载私钥。它没有“解密选中单票”的界面或接口。此措施限制正常程序调用，不能阻止拥有私钥及本机控制权的人自行解密。</w:t>
+        <w:t>票码使用系统随机数生成并在服务器仅保存SHA-256摘要。TLS证书指纹固定在凭证中，客户端先验指纹后发送票码。接收端检查字段、轮次、ID、密文维度与合法密文空间；关闭与登记在SQLite事务内处理。保管端结果绑定完整汇总摘要，服务器和客户端分别核验Ed25519签名[3]。</w:t>
       </w:r>
     </w:p>
     <w:p>
@@ -2966,12 +2734,11 @@
         <w:pStyle w:val="ReportCaption"/>
         <w:keepNext/>
       </w:pPr>
-      <w:r/>
       <w:r>
         <w:drawing>
           <wp:inline xmlns:a="http://schemas.openxmlformats.org/drawingml/2006/main" xmlns:pic="http://schemas.openxmlformats.org/drawingml/2006/picture">
             <wp:extent cx="5760000" cy="3456000"/>
-            <wp:docPr id="2" name="Picture 2"/>
+            <wp:docPr id="1" name="Picture 1"/>
             <wp:cNvGraphicFramePr>
               <a:graphicFrameLocks noChangeAspect="1"/>
             </wp:cNvGraphicFramePr>
@@ -2979,11 +2746,11 @@
               <a:graphicData uri="http://schemas.openxmlformats.org/drawingml/2006/picture">
                 <pic:pic>
                   <pic:nvPicPr>
-                    <pic:cNvPr id="0" name="flow-B.png"/>
+                    <pic:cNvPr id="0" name="B-flow.png"/>
                     <pic:cNvPicPr/>
                   </pic:nvPicPr>
                   <pic:blipFill>
-                    <a:blip r:embed="rId12"/>
+                    <a:blip r:embed="rId13"/>
                     <a:stretch>
                       <a:fillRect/>
                     </a:stretch>
@@ -3007,7 +2774,7 @@
         <w:pStyle w:val="ReportCaption"/>
       </w:pPr>
       <w:r>
-        <w:t>图1 本模块处理流程与失败出口</w:t>
+        <w:t>图1 本模块处理流程及失败出口</w:t>
       </w:r>
     </w:p>
     <w:p>
@@ -3015,49 +2782,19 @@
         <w:pStyle w:val="ReportH2"/>
       </w:pPr>
       <w:r>
-        <w:rPr>
-          <w:rFonts w:ascii="Times New Roman" w:hAnsi="Times New Roman" w:eastAsia="宋体"/>
-          <w:b/>
-          <w:color w:val="000000"/>
-          <w:sz w:val="24"/>
-        </w:rPr>
-        <w:t>3.5 威胁模型与安全边界</w:t>
-      </w:r>
-    </w:p>
-    <w:p>
-      <w:pPr>
-        <w:pStyle w:val="ReportBody"/>
-      </w:pPr>
-      <w:r>
-        <w:rPr>
-          <w:rFonts w:ascii="Times New Roman" w:hAnsi="Times New Roman" w:eastAsia="宋体"/>
-          <w:b w:val="0"/>
-          <w:color w:val="000000"/>
-          <w:sz w:val="24"/>
-        </w:rPr>
-        <w:t>假设攻击者能够读取或修改公开选票目录，但不能获得保管口令和签名私钥，最初的公钥配置已可信确认。保护目标是隐藏单票选择并发现相对于签名清单的文件变化。应用运行在一台电脑上，角色隔离是教学流程；创建与解锁阶段可短暂接触完整密钥材料，不构成互不信任机构之间的物理隔离。</w:t>
-      </w:r>
-    </w:p>
-    <w:p>
-      <w:pPr>
-        <w:pStyle w:val="ReportH2"/>
-      </w:pPr>
-      <w:r>
-        <w:t>3.6 模块界面与数据说明</w:t>
-      </w:r>
-    </w:p>
-    <w:p>
-      <w:pPr>
-        <w:pStyle w:val="ReportBody"/>
+        <w:t>3.5 模块界面与角色隔离</w:t>
+      </w:r>
+    </w:p>
+    <w:p>
+      <w:pPr>
+        <w:pStyle w:val="ReportCaption"/>
         <w:keepNext/>
-        <w:ind w:firstLine="0"/>
-        <w:jc w:val="center"/>
       </w:pPr>
       <w:r>
         <w:drawing>
           <wp:inline xmlns:a="http://schemas.openxmlformats.org/drawingml/2006/main" xmlns:pic="http://schemas.openxmlformats.org/drawingml/2006/picture">
-            <wp:extent cx="5796000" cy="4027729"/>
-            <wp:docPr id="1" name="Picture 1"/>
+            <wp:extent cx="5760000" cy="4143157"/>
+            <wp:docPr id="2" name="Picture 2"/>
             <wp:cNvGraphicFramePr>
               <a:graphicFrameLocks noChangeAspect="1"/>
             </wp:cNvGraphicFramePr>
@@ -3065,11 +2802,11 @@
               <a:graphicData uri="http://schemas.openxmlformats.org/drawingml/2006/picture">
                 <pic:pic>
                   <pic:nvPicPr>
-                    <pic:cNvPr id="0" name="03_results.png"/>
+                    <pic:cNvPr id="0" name="04_published.png"/>
                     <pic:cNvPicPr/>
                   </pic:nvPicPr>
                   <pic:blipFill>
-                    <a:blip r:embed="rId11"/>
+                    <a:blip r:embed="rId14"/>
                     <a:stretch>
                       <a:fillRect/>
                     </a:stretch>
@@ -3077,7 +2814,7 @@
                   <pic:spPr>
                     <a:xfrm>
                       <a:off x="0" y="0"/>
-                      <a:ext cx="5796000" cy="4027729"/>
+                      <a:ext cx="5760000" cy="4143157"/>
                     </a:xfrm>
                     <a:prstGeom prst="rect"/>
                   </pic:spPr>
@@ -3093,7 +2830,23 @@
         <w:pStyle w:val="ReportCaption"/>
       </w:pPr>
       <w:r>
-        <w:t>图2 独立进程返回总票数及实测耗时</w:t>
+        <w:t>图2 客户端验证保管端签名后显示公开总票</w:t>
+      </w:r>
+    </w:p>
+    <w:p>
+      <w:pPr>
+        <w:pStyle w:val="ReportBody"/>
+      </w:pPr>
+      <w:r>
+        <w:t>图2来自本轮Windows原生Qt实际运行。投票人和管理员导入不同凭证，连接同一端口后得到各自权限。实际部署只向服务器复制server目录，保管端通过公开汇总文件与签名结果文件交接；同机测试使用独立目录和进程，不能声称已建立物理隔离。</w:t>
+      </w:r>
+    </w:p>
+    <w:p>
+      <w:pPr>
+        <w:pStyle w:val="ReportH1"/>
+      </w:pPr>
+      <w:r>
+        <w:t>四、部分核心代码</w:t>
       </w:r>
     </w:p>
     <w:p>
@@ -3101,62 +2854,6 @@
         <w:pStyle w:val="ReportH2"/>
       </w:pPr>
       <w:r>
-        <w:t>3.7 公开数据与私有数据</w:t>
-      </w:r>
-    </w:p>
-    <w:p>
-      <w:pPr>
-        <w:pStyle w:val="ReportBody"/>
-      </w:pPr>
-      <w:r>
-        <w:rPr>
-          <w:rFonts w:ascii="Times New Roman" w:hAnsi="Times New Roman" w:eastAsia="宋体"/>
-          <w:b w:val="0"/>
-          <w:color w:val="000000"/>
-          <w:sz w:val="24"/>
-        </w:rPr>
-        <w:t>public/config.json保存标题、选项、名单、Paillier公钥n和审计公钥；public/ballots保存每张加密选票；public/manifest.json保存签名清单。private/trustee.vault保存加密后的私钥材料。公开包不包含private目录。口令经标准输入管道交给解密子进程，不放入命令行或日志。</w:t>
-      </w:r>
-    </w:p>
-    <w:p>
-      <w:pPr>
-        <w:pStyle w:val="ReportBody"/>
-      </w:pPr>
-      <w:r>
-        <w:rPr>
-          <w:rFonts w:ascii="Times New Roman" w:hAnsi="Times New Roman" w:eastAsia="宋体"/>
-          <w:b w:val="0"/>
-          <w:color w:val="000000"/>
-          <w:sz w:val="24"/>
-        </w:rPr>
-        <w:t>选票的时间戳、ID与随机标识属于公开元数据，隐私目标是投票内容保密，不是投票者匿名。演示和自动实验均使用虚构ID及合成选票。</w:t>
-      </w:r>
-    </w:p>
-    <w:p>
-      <w:pPr>
-        <w:pStyle w:val="ReportH1"/>
-      </w:pPr>
-      <w:r>
-        <w:rPr>
-          <w:rFonts w:ascii="Times New Roman" w:hAnsi="Times New Roman" w:eastAsia="宋体"/>
-          <w:b/>
-          <w:color w:val="000000"/>
-          <w:sz w:val="28"/>
-        </w:rPr>
-        <w:t>四、部分核心代码</w:t>
-      </w:r>
-    </w:p>
-    <w:p>
-      <w:pPr>
-        <w:pStyle w:val="ReportH2"/>
-      </w:pPr>
-      <w:r>
-        <w:rPr>
-          <w:rFonts w:ascii="Times New Roman" w:hAnsi="Times New Roman" w:eastAsia="宋体"/>
-          <w:b/>
-          <w:color w:val="000000"/>
-          <w:sz w:val="24"/>
-        </w:rPr>
         <w:t>4.1 核心实现片段</w:t>
       </w:r>
     </w:p>
@@ -3166,19 +2863,13 @@
         <w:keepNext/>
       </w:pPr>
       <w:r>
-        <w:rPr>
-          <w:rFonts w:ascii="Times New Roman" w:hAnsi="Times New Roman" w:eastAsia="宋体"/>
-          <w:b w:val="0"/>
-          <w:color w:val="000000"/>
-          <w:sz w:val="24"/>
-        </w:rPr>
-        <w:t>以下片段摘自 tally_service.py，完整上下文与异常处理见随附源代码。</w:t>
+        <w:t>以下片段摘自network_protocol.py中aggregate_records，省略前置审计和计时，按版面折行。完整异常处理和调用上下文以源码为准。</w:t>
       </w:r>
     </w:p>
     <w:p>
       <w:pPr>
         <w:pStyle w:val="ReportCode"/>
-        <w:keepNext/>
+        <w:keepLines/>
       </w:pPr>
       <w:r>
         <w:rPr>
@@ -3187,97 +2878,31 @@
           <w:color w:val="000000"/>
           <w:sz w:val="20"/>
         </w:rPr>
-        <w:t xml:space="preserve">    totals = [1] * len(config['options'])</w:t>
-      </w:r>
-    </w:p>
-    <w:p>
-      <w:pPr>
-        <w:pStyle w:val="ReportCode"/>
-        <w:keepNext/>
-      </w:pPr>
-      <w:r>
-        <w:rPr>
-          <w:rFonts w:ascii="Consolas" w:hAnsi="Consolas" w:eastAsia="新宋体"/>
-          <w:b w:val="0"/>
-          <w:color w:val="000000"/>
-          <w:sz w:val="20"/>
-        </w:rPr>
-        <w:t xml:space="preserve">    for ballot in ballots:</w:t>
-      </w:r>
-    </w:p>
-    <w:p>
-      <w:pPr>
-        <w:pStyle w:val="ReportCode"/>
-        <w:keepNext/>
-      </w:pPr>
-      <w:r>
-        <w:rPr>
-          <w:rFonts w:ascii="Consolas" w:hAnsi="Consolas" w:eastAsia="新宋体"/>
-          <w:b w:val="0"/>
-          <w:color w:val="000000"/>
-          <w:sz w:val="20"/>
-        </w:rPr>
-        <w:t xml:space="preserve">        for i, c in enumerate(ballot['ciphertexts']):</w:t>
-      </w:r>
-    </w:p>
-    <w:p>
-      <w:pPr>
-        <w:pStyle w:val="ReportCode"/>
-        <w:keepNext/>
-      </w:pPr>
-      <w:r>
-        <w:rPr>
-          <w:rFonts w:ascii="Consolas" w:hAnsi="Consolas" w:eastAsia="新宋体"/>
-          <w:b w:val="0"/>
-          <w:color w:val="000000"/>
-          <w:sz w:val="20"/>
-        </w:rPr>
-        <w:t xml:space="preserve">            totals[i] = totals[i] * int(c) % pub.nsquare</w:t>
-      </w:r>
-    </w:p>
-    <w:p>
-      <w:pPr>
-        <w:pStyle w:val="ReportCode"/>
-        <w:keepNext/>
-      </w:pPr>
-      <w:r>
-        <w:rPr>
-          <w:rFonts w:ascii="Consolas" w:hAnsi="Consolas" w:eastAsia="新宋体"/>
-          <w:b w:val="0"/>
-          <w:color w:val="000000"/>
-          <w:sz w:val="20"/>
-        </w:rPr>
-        <w:t xml:space="preserve">    return {'election_id': config['election_id'], 'manifest_sha256': digest(manifest),</w:t>
-      </w:r>
-    </w:p>
-    <w:p>
-      <w:pPr>
-        <w:pStyle w:val="ReportCode"/>
-        <w:keepNext/>
-      </w:pPr>
-      <w:r>
-        <w:rPr>
-          <w:rFonts w:ascii="Consolas" w:hAnsi="Consolas" w:eastAsia="新宋体"/>
-          <w:b w:val="0"/>
-          <w:color w:val="000000"/>
-          <w:sz w:val="20"/>
-        </w:rPr>
-        <w:t xml:space="preserve">            'ciphertexts': [str(c) for c in totals], 'accepted': len(ballots),</w:t>
-      </w:r>
-    </w:p>
-    <w:p>
-      <w:pPr>
-        <w:pStyle w:val="ReportCode"/>
-        <w:keepNext w:val="0"/>
-      </w:pPr>
-      <w:r>
-        <w:rPr>
-          <w:rFonts w:ascii="Consolas" w:hAnsi="Consolas" w:eastAsia="新宋体"/>
-          <w:b w:val="0"/>
-          <w:color w:val="000000"/>
-          <w:sz w:val="20"/>
-        </w:rPr>
-        <w:t xml:space="preserve">            'audit_ms': audit_ms, 'aggregate_ms': (perf_counter()-started)*1000}</w:t>
+        <w:t>n = int(election['config']['n'])</w:t>
+        <w:br/>
+        <w:t>totals = [1] * len(election['config']['options'])</w:t>
+        <w:br/>
+        <w:t>for ballot in ballots:</w:t>
+        <w:br/>
+        <w:t xml:space="preserve">    totals = [</w:t>
+        <w:br/>
+        <w:t xml:space="preserve">        (value * int(c)) % (n*n)</w:t>
+        <w:br/>
+        <w:t xml:space="preserve">        for value, c in zip(totals, ballot['ciphertexts'])</w:t>
+        <w:br/>
+        <w:t xml:space="preserve">    ]</w:t>
+        <w:br/>
+        <w:t>aggregate = {</w:t>
+        <w:br/>
+        <w:t xml:space="preserve">    'election_id': election['config']['election_id'],</w:t>
+        <w:br/>
+        <w:t xml:space="preserve">    'manifest_sha256': digest(payload),</w:t>
+        <w:br/>
+        <w:t xml:space="preserve">    'accepted': len(ballots),</w:t>
+        <w:br/>
+        <w:t xml:space="preserve">    'ciphertexts': [str(value) for value in totals],</w:t>
+        <w:br/>
+        <w:t>}</w:t>
       </w:r>
     </w:p>
     <w:p>
@@ -3285,13 +2910,7 @@
         <w:pStyle w:val="ReportH2"/>
       </w:pPr>
       <w:r>
-        <w:rPr>
-          <w:rFonts w:ascii="Times New Roman" w:hAnsi="Times New Roman" w:eastAsia="宋体"/>
-          <w:b/>
-          <w:color w:val="000000"/>
-          <w:sz w:val="24"/>
-        </w:rPr>
-        <w:t>4.2 本模块可重复实验步骤</w:t>
+        <w:t>4.2 可重复实验步骤</w:t>
       </w:r>
     </w:p>
     <w:p>
@@ -3299,13 +2918,7 @@
         <w:pStyle w:val="ReportBody"/>
       </w:pPr>
       <w:r>
-        <w:rPr>
-          <w:rFonts w:ascii="Times New Roman" w:hAnsi="Times New Roman" w:eastAsia="宋体"/>
-          <w:b w:val="0"/>
-          <w:color w:val="000000"/>
-          <w:sz w:val="24"/>
-        </w:rPr>
-        <w:t>1．打开已创建的3选项投票，先尝试在投票开放时计票，确认系统拒绝查询阶段结果。</w:t>
+        <w:t>1．按照README安装依赖，在保管者电脑运行init生成新轮次。分发server目录、各人凭证；保留trustee目录和口令。</w:t>
       </w:r>
     </w:p>
     <w:p>
@@ -3313,13 +2926,7 @@
         <w:pStyle w:val="ReportBody"/>
       </w:pPr>
       <w:r>
-        <w:rPr>
-          <w:rFonts w:ascii="Times New Roman" w:hAnsi="Times New Roman" w:eastAsia="宋体"/>
-          <w:b w:val="0"/>
-          <w:color w:val="000000"/>
-          <w:sz w:val="24"/>
-        </w:rPr>
-        <w:t>2．按[0,1,0,2,0,1]准备6张合成测试票。关闭投票后进入汇总与结果页，输入保管口令，预期得到[3,2,1]。</w:t>
+        <w:t>2．服务器运行serve指定目录、监听IP和端口。客户端启动默认界面，填写服务器IPv4地址和端口，导入本人凭证并连接。本机多端使用127.0.0.1。</w:t>
       </w:r>
     </w:p>
     <w:p>
@@ -3327,13 +2934,7 @@
         <w:pStyle w:val="ReportBody"/>
       </w:pPr>
       <w:r>
-        <w:rPr>
-          <w:rFonts w:ascii="Times New Roman" w:hAnsi="Times New Roman" w:eastAsia="宋体"/>
-          <w:b w:val="0"/>
-          <w:color w:val="000000"/>
-          <w:sz w:val="24"/>
-        </w:rPr>
-        <w:t>3．导出无私钥公开包；在自动测试的独立目录中，仅凭公开文件重新计算汇总，比较密文向量完全一致。</w:t>
+        <w:t>3．使用不同ID依次或同时投票，记录纸面预期计数。重复ID、名单冒用和错误指纹应被拒绝，关闭前不能导出汇总。</w:t>
       </w:r>
     </w:p>
     <w:p>
@@ -3341,13 +2942,7 @@
         <w:pStyle w:val="ReportBody"/>
       </w:pPr>
       <w:r>
-        <w:rPr>
-          <w:rFonts w:ascii="Times New Roman" w:hAnsi="Times New Roman" w:eastAsia="宋体"/>
-          <w:b w:val="0"/>
-          <w:color w:val="000000"/>
-          <w:sz w:val="24"/>
-        </w:rPr>
-        <w:t>4．将汇总请求中的向量替换为单张选票密文，独立解密端应拒绝，不应输出该票的明文。</w:t>
+        <w:t>4．管理员关闭并导出密文汇总；保管端运行decrypt，输入本地口令，产生签名总票；管理员发布后，各端刷新核对结果。</w:t>
       </w:r>
     </w:p>
     <w:p>
@@ -3355,13 +2950,23 @@
         <w:pStyle w:val="ReportBody"/>
       </w:pPr>
       <w:r>
-        <w:rPr>
-          <w:rFonts w:ascii="Times New Roman" w:hAnsi="Times New Roman" w:eastAsia="宋体"/>
-          <w:b w:val="0"/>
-          <w:color w:val="000000"/>
-          <w:sz w:val="24"/>
-        </w:rPr>
-        <w:t>5．分别执行零票和4选项实验，检查结果为[0,0]和[1,1,1,1]；检查总票数与接收数一致。</w:t>
+        <w:t>5．重新连接检查回执，重启服务器检查状态；再初始化不同人数和选项的新轮次。跨电脑时核对防火墙与网络互通，现场结果单独记录。</w:t>
+      </w:r>
+    </w:p>
+    <w:p>
+      <w:pPr>
+        <w:pStyle w:val="ReportH1"/>
+      </w:pPr>
+      <w:r>
+        <w:t>五、课题完成过程中遇到的问题及解决方法</w:t>
+      </w:r>
+    </w:p>
+    <w:p>
+      <w:pPr>
+        <w:pStyle w:val="ReportH2"/>
+      </w:pPr>
+      <w:r>
+        <w:t>5.1 原实现问题与本轮修正</w:t>
       </w:r>
     </w:p>
     <w:p>
@@ -3369,27 +2974,15 @@
         <w:pStyle w:val="ReportBody"/>
       </w:pPr>
       <w:r>
-        <w:rPr>
-          <w:rFonts w:ascii="Times New Roman" w:hAnsi="Times New Roman" w:eastAsia="宋体"/>
-          <w:b w:val="0"/>
-          <w:color w:val="000000"/>
-          <w:sz w:val="24"/>
-        </w:rPr>
-        <w:t>6．运行10、100、1000人三次重复实验，分别测量加密、汇总和解密原语耗时，保留原始运行记录。</w:t>
-      </w:r>
-    </w:p>
-    <w:p>
-      <w:pPr>
-        <w:pStyle w:val="ReportH1"/>
-      </w:pPr>
-      <w:r>
-        <w:rPr>
-          <w:rFonts w:ascii="Times New Roman" w:hAnsi="Times New Roman" w:eastAsia="宋体"/>
-          <w:b/>
-          <w:color w:val="000000"/>
-          <w:sz w:val="28"/>
-        </w:rPr>
-        <w:t>五、课题完成过程中遇到的问题及解决方法</w:t>
+        <w:t>原来的独立解密子进程仍与收票端共享同一电脑上的私钥文件，无法证明网络服务器没有私钥。此次把解密入口改为离线decrypt命令，服务器只接收签名结果。测试还构造由服务器合法重签的另一个子集合，验证保管端在已批准一个汇总后拒绝再次解密不同集合；这仍不能替代首次集合的外部见证。</w:t>
+      </w:r>
+    </w:p>
+    <w:p>
+      <w:pPr>
+        <w:pStyle w:val="ReportBody"/>
+      </w:pPr>
+      <w:r>
+        <w:t>单机阶段已有真实密码学运算，但没有网络收票服务器，因此原整体完成判断不充分。本次把联网架构作为主要实现，原单机入口仅保留为算法实验。实验记录和报告分别标注所属阶段，避免用旧单机测试证明多端可用。</w:t>
       </w:r>
     </w:p>
     <w:p>
@@ -3397,13 +2990,7 @@
         <w:pStyle w:val="ReportH2"/>
       </w:pPr>
       <w:r>
-        <w:rPr>
-          <w:rFonts w:ascii="Times New Roman" w:hAnsi="Times New Roman" w:eastAsia="宋体"/>
-          <w:b/>
-          <w:color w:val="000000"/>
-          <w:sz w:val="24"/>
-        </w:rPr>
-        <w:t>5.1 实验环境与记录来源</w:t>
+        <w:t>5.2 实验环境与结果</w:t>
       </w:r>
     </w:p>
     <w:p>
@@ -3411,15 +2998,7 @@
         <w:pStyle w:val="ReportBody"/>
       </w:pPr>
       <w:r>
-        <w:t>本轮实测日期为2026年10月27日（北京时间）。环境为Windows-11-10.0.26200-SP0，Python 3.12.14；phe 1.5.0、gmpy2 2.3.2、cryptography 50.0.2、PySide6-Essentials 6.12.0。核心实验使用2048位Paillier模数；9项工程回归使用1024位密钥加速边界检查，不作为安全强度示范。</w:t>
-      </w:r>
-    </w:p>
-    <w:p>
-      <w:pPr>
-        <w:pStyle w:val="ReportBody"/>
-      </w:pPr>
-      <w:r>
-        <w:t>自动核心实验29项全部符合预期，另有9项工程回归和原生Qt界面测试通过。原始记录位于evidence/2026-10-27/full/，包含JSON与CSV；源码SHA-256逐文件记入JSON。表2列出本模块相关结果。“局限”用例通过表示成功复现边界，不表示已防御。</w:t>
+        <w:t>本轮日期为2026年10月27日（北京时间），Windows 11 x64、Python 3.12.14，phe 1.5.0、gmpy2 2.3.2、cryptography 50.0.2、PySide6-Essentials 6.12.0。端到端验收采用2048位Paillier；18项联网边界测试使用1024位密钥加速，不作为安全强度示范。另有9项既有工程回归。</w:t>
       </w:r>
     </w:p>
     <w:p>
@@ -3428,126 +3007,90 @@
         <w:keepNext/>
       </w:pPr>
       <w:r>
-        <w:t>表2 本模块测试结果</w:t>
+        <w:t>表2 联网与交互验证结果</w:t>
       </w:r>
     </w:p>
     <w:tbl>
       <w:tblPr>
         <w:tblW w:type="auto" w:w="0"/>
-        <w:jc w:val="center"/>
         <w:tblLayout w:type="fixed"/>
         <w:tblLook w:firstColumn="1" w:firstRow="1" w:lastColumn="0" w:lastRow="0" w:noHBand="0" w:noVBand="1" w:val="04A0"/>
       </w:tblPr>
       <w:tblGrid>
-        <w:gridCol w:w="2551"/>
-        <w:gridCol w:w="6633"/>
+        <w:gridCol w:w="4677"/>
+        <w:gridCol w:w="4677"/>
       </w:tblGrid>
       <w:tr>
         <w:trPr>
           <w:tblHeader/>
-          <w:tblHeader/>
         </w:trPr>
         <w:tc>
           <w:tcPr>
-            <w:tcW w:type="dxa" w:w="2551"/>
-            <w:vAlign w:val="center"/>
-            <w:tcBorders>
-              <w:top w:val="single" w:sz="4" w:color="D9D9D9"/>
-              <w:left w:val="single" w:sz="4" w:color="D9D9D9"/>
-              <w:bottom w:val="single" w:sz="4" w:color="D9D9D9"/>
-              <w:right w:val="single" w:sz="4" w:color="D9D9D9"/>
-              <w:top w:val="single" w:sz="4" w:color="D9D9D9"/>
-              <w:left w:val="single" w:sz="4" w:color="D9D9D9"/>
-              <w:bottom w:val="single" w:sz="4" w:color="D9D9D9"/>
-              <w:right w:val="single" w:sz="4" w:color="D9D9D9"/>
-            </w:tcBorders>
-            <w:tcMar>
-              <w:top w:w="75" w:type="dxa"/>
-              <w:left w:w="75" w:type="dxa"/>
-              <w:bottom w:w="75" w:type="dxa"/>
-              <w:right w:w="75" w:type="dxa"/>
-            </w:tcMar>
-            <w:shd w:fill="E8EDF1"/>
-          </w:tcPr>
-          <w:p>
-            <w:pPr>
-              <w:spacing w:after="40" w:line="288" w:lineRule="auto" w:before="40"/>
-            </w:pPr>
-            <w:r>
-              <w:rPr>
-                <w:rFonts w:ascii="Times New Roman" w:hAnsi="Times New Roman" w:eastAsia="宋体"/>
-                <w:b/>
-                <w:color w:val="000000"/>
-                <w:sz w:val="21"/>
-              </w:rPr>
-              <w:t>实验项</w:t>
-            </w:r>
-          </w:p>
-        </w:tc>
-        <w:tc>
-          <w:tcPr>
-            <w:tcW w:type="dxa" w:w="6633"/>
-            <w:vAlign w:val="center"/>
-            <w:tcBorders>
-              <w:top w:val="single" w:sz="4" w:color="D9D9D9"/>
-              <w:left w:val="single" w:sz="4" w:color="D9D9D9"/>
-              <w:bottom w:val="single" w:sz="4" w:color="D9D9D9"/>
-              <w:right w:val="single" w:sz="4" w:color="D9D9D9"/>
-              <w:top w:val="single" w:sz="4" w:color="D9D9D9"/>
-              <w:left w:val="single" w:sz="4" w:color="D9D9D9"/>
-              <w:bottom w:val="single" w:sz="4" w:color="D9D9D9"/>
-              <w:right w:val="single" w:sz="4" w:color="D9D9D9"/>
-            </w:tcBorders>
-            <w:tcMar>
-              <w:top w:w="75" w:type="dxa"/>
-              <w:left w:w="75" w:type="dxa"/>
-              <w:bottom w:w="75" w:type="dxa"/>
-              <w:right w:w="75" w:type="dxa"/>
-            </w:tcMar>
-            <w:shd w:fill="E8EDF1"/>
-          </w:tcPr>
-          <w:p>
-            <w:pPr>
-              <w:spacing w:after="40" w:line="288" w:lineRule="auto" w:before="40"/>
-            </w:pPr>
-            <w:r>
-              <w:rPr>
-                <w:rFonts w:ascii="Times New Roman" w:hAnsi="Times New Roman" w:eastAsia="宋体"/>
-                <w:b/>
-                <w:color w:val="000000"/>
-                <w:sz w:val="21"/>
-              </w:rPr>
-              <w:t>实测结果</w:t>
+            <w:tcW w:type="dxa" w:w="2835"/>
+            <w:tcBorders>
+              <w:top w:val="single" w:sz="4" w:color="C9D4DF"/>
+              <w:left w:val="single" w:sz="4" w:color="C9D4DF"/>
+              <w:bottom w:val="single" w:sz="4" w:color="C9D4DF"/>
+              <w:right w:val="single" w:sz="4" w:color="C9D4DF"/>
+            </w:tcBorders>
+            <w:shd w:fill="E8EEF3"/>
+          </w:tcPr>
+          <w:p>
+            <w:pPr>
+              <w:spacing w:line="288" w:lineRule="auto" w:before="60" w:after="60"/>
+            </w:pPr>
+            <w:r>
+              <w:rPr>
+                <w:rFonts w:ascii="Times New Roman" w:hAnsi="Times New Roman" w:eastAsia="宋体"/>
+                <w:b/>
+                <w:color w:val="000000"/>
+                <w:sz w:val="21"/>
+              </w:rPr>
+              <w:t>项目</w:t>
+            </w:r>
+          </w:p>
+        </w:tc>
+        <w:tc>
+          <w:tcPr>
+            <w:tcW w:type="dxa" w:w="6009"/>
+            <w:tcBorders>
+              <w:top w:val="single" w:sz="4" w:color="C9D4DF"/>
+              <w:left w:val="single" w:sz="4" w:color="C9D4DF"/>
+              <w:bottom w:val="single" w:sz="4" w:color="C9D4DF"/>
+              <w:right w:val="single" w:sz="4" w:color="C9D4DF"/>
+            </w:tcBorders>
+            <w:shd w:fill="E8EEF3"/>
+          </w:tcPr>
+          <w:p>
+            <w:pPr>
+              <w:spacing w:line="288" w:lineRule="auto" w:before="60" w:after="60"/>
+            </w:pPr>
+            <w:r>
+              <w:rPr>
+                <w:rFonts w:ascii="Times New Roman" w:hAnsi="Times New Roman" w:eastAsia="宋体"/>
+                <w:b/>
+                <w:color w:val="000000"/>
+                <w:sz w:val="21"/>
+              </w:rPr>
+              <w:t>实际结果</w:t>
             </w:r>
           </w:p>
         </w:tc>
       </w:tr>
       <w:tr>
-        <w:trPr/>
-        <w:tc>
-          <w:tcPr>
-            <w:tcW w:type="dxa" w:w="2551"/>
-            <w:vAlign w:val="center"/>
-            <w:tcBorders>
-              <w:top w:val="single" w:sz="4" w:color="D9D9D9"/>
-              <w:left w:val="single" w:sz="4" w:color="D9D9D9"/>
-              <w:bottom w:val="single" w:sz="4" w:color="D9D9D9"/>
-              <w:right w:val="single" w:sz="4" w:color="D9D9D9"/>
-              <w:top w:val="single" w:sz="4" w:color="D9D9D9"/>
-              <w:left w:val="single" w:sz="4" w:color="D9D9D9"/>
-              <w:bottom w:val="single" w:sz="4" w:color="D9D9D9"/>
-              <w:right w:val="single" w:sz="4" w:color="D9D9D9"/>
-            </w:tcBorders>
-            <w:tcMar>
-              <w:top w:w="75" w:type="dxa"/>
-              <w:left w:w="75" w:type="dxa"/>
-              <w:bottom w:w="75" w:type="dxa"/>
-              <w:right w:w="75" w:type="dxa"/>
-            </w:tcMar>
-          </w:tcPr>
-          <w:p>
-            <w:pPr>
-              <w:spacing w:after="40" w:line="288" w:lineRule="auto" w:before="40"/>
+        <w:tc>
+          <w:tcPr>
+            <w:tcW w:type="dxa" w:w="2835"/>
+            <w:tcBorders>
+              <w:top w:val="single" w:sz="4" w:color="C9D4DF"/>
+              <w:left w:val="single" w:sz="4" w:color="C9D4DF"/>
+              <w:bottom w:val="single" w:sz="4" w:color="C9D4DF"/>
+              <w:right w:val="single" w:sz="4" w:color="C9D4DF"/>
+            </w:tcBorders>
+          </w:tcPr>
+          <w:p>
+            <w:pPr>
+              <w:spacing w:line="288" w:lineRule="auto" w:before="60" w:after="60"/>
             </w:pPr>
             <w:r>
               <w:rPr>
@@ -3556,34 +3099,23 @@
                 <w:color w:val="000000"/>
                 <w:sz w:val="21"/>
               </w:rPr>
-              <w:t>加法同态性质</w:t>
-            </w:r>
-          </w:p>
-        </w:tc>
-        <w:tc>
-          <w:tcPr>
-            <w:tcW w:type="dxa" w:w="6633"/>
-            <w:vAlign w:val="center"/>
-            <w:tcBorders>
-              <w:top w:val="single" w:sz="4" w:color="D9D9D9"/>
-              <w:left w:val="single" w:sz="4" w:color="D9D9D9"/>
-              <w:bottom w:val="single" w:sz="4" w:color="D9D9D9"/>
-              <w:right w:val="single" w:sz="4" w:color="D9D9D9"/>
-              <w:top w:val="single" w:sz="4" w:color="D9D9D9"/>
-              <w:left w:val="single" w:sz="4" w:color="D9D9D9"/>
-              <w:bottom w:val="single" w:sz="4" w:color="D9D9D9"/>
-              <w:right w:val="single" w:sz="4" w:color="D9D9D9"/>
-            </w:tcBorders>
-            <w:tcMar>
-              <w:top w:w="75" w:type="dxa"/>
-              <w:left w:w="75" w:type="dxa"/>
-              <w:bottom w:w="75" w:type="dxa"/>
-              <w:right w:w="75" w:type="dxa"/>
-            </w:tcMar>
-          </w:tcPr>
-          <w:p>
-            <w:pPr>
-              <w:spacing w:after="40" w:line="288" w:lineRule="auto" w:before="40"/>
+              <w:t>TLS与权限、事务、完整性</w:t>
+            </w:r>
+          </w:p>
+        </w:tc>
+        <w:tc>
+          <w:tcPr>
+            <w:tcW w:type="dxa" w:w="6009"/>
+            <w:tcBorders>
+              <w:top w:val="single" w:sz="4" w:color="C9D4DF"/>
+              <w:left w:val="single" w:sz="4" w:color="C9D4DF"/>
+              <w:bottom w:val="single" w:sz="4" w:color="C9D4DF"/>
+              <w:right w:val="single" w:sz="4" w:color="C9D4DF"/>
+            </w:tcBorders>
+          </w:tcPr>
+          <w:p>
+            <w:pPr>
+              <w:spacing w:line="288" w:lineRule="auto" w:before="60" w:after="60"/>
             </w:pPr>
             <w:r>
               <w:rPr>
@@ -3592,37 +3124,25 @@
                 <w:color w:val="000000"/>
                 <w:sz w:val="21"/>
               </w:rPr>
-              <w:t>E(2) × E(3) mod n² 解密为5</w:t>
+              <w:t>18项联网测试＋9项回归全部通过</w:t>
             </w:r>
           </w:p>
         </w:tc>
       </w:tr>
       <w:tr>
-        <w:trPr/>
-        <w:tc>
-          <w:tcPr>
-            <w:tcW w:type="dxa" w:w="2551"/>
-            <w:vAlign w:val="center"/>
-            <w:tcBorders>
-              <w:top w:val="single" w:sz="4" w:color="D9D9D9"/>
-              <w:left w:val="single" w:sz="4" w:color="D9D9D9"/>
-              <w:bottom w:val="single" w:sz="4" w:color="D9D9D9"/>
-              <w:right w:val="single" w:sz="4" w:color="D9D9D9"/>
-              <w:top w:val="single" w:sz="4" w:color="D9D9D9"/>
-              <w:left w:val="single" w:sz="4" w:color="D9D9D9"/>
-              <w:bottom w:val="single" w:sz="4" w:color="D9D9D9"/>
-              <w:right w:val="single" w:sz="4" w:color="D9D9D9"/>
-            </w:tcBorders>
-            <w:tcMar>
-              <w:top w:w="75" w:type="dxa"/>
-              <w:left w:w="75" w:type="dxa"/>
-              <w:bottom w:w="75" w:type="dxa"/>
-              <w:right w:w="75" w:type="dxa"/>
-            </w:tcMar>
-          </w:tcPr>
-          <w:p>
-            <w:pPr>
-              <w:spacing w:after="40" w:line="288" w:lineRule="auto" w:before="40"/>
+        <w:tc>
+          <w:tcPr>
+            <w:tcW w:type="dxa" w:w="2835"/>
+            <w:tcBorders>
+              <w:top w:val="single" w:sz="4" w:color="C9D4DF"/>
+              <w:left w:val="single" w:sz="4" w:color="C9D4DF"/>
+              <w:bottom w:val="single" w:sz="4" w:color="C9D4DF"/>
+              <w:right w:val="single" w:sz="4" w:color="C9D4DF"/>
+            </w:tcBorders>
+          </w:tcPr>
+          <w:p>
+            <w:pPr>
+              <w:spacing w:line="288" w:lineRule="auto" w:before="60" w:after="60"/>
             </w:pPr>
             <w:r>
               <w:rPr>
@@ -3631,34 +3151,23 @@
                 <w:color w:val="000000"/>
                 <w:sz w:val="21"/>
               </w:rPr>
-              <w:t>未关闭禁止汇总</w:t>
-            </w:r>
-          </w:p>
-        </w:tc>
-        <w:tc>
-          <w:tcPr>
-            <w:tcW w:type="dxa" w:w="6633"/>
-            <w:vAlign w:val="center"/>
-            <w:tcBorders>
-              <w:top w:val="single" w:sz="4" w:color="D9D9D9"/>
-              <w:left w:val="single" w:sz="4" w:color="D9D9D9"/>
-              <w:bottom w:val="single" w:sz="4" w:color="D9D9D9"/>
-              <w:right w:val="single" w:sz="4" w:color="D9D9D9"/>
-              <w:top w:val="single" w:sz="4" w:color="D9D9D9"/>
-              <w:left w:val="single" w:sz="4" w:color="D9D9D9"/>
-              <w:bottom w:val="single" w:sz="4" w:color="D9D9D9"/>
-              <w:right w:val="single" w:sz="4" w:color="D9D9D9"/>
-            </w:tcBorders>
-            <w:tcMar>
-              <w:top w:w="75" w:type="dxa"/>
-              <w:left w:w="75" w:type="dxa"/>
-              <w:bottom w:w="75" w:type="dxa"/>
-              <w:right w:w="75" w:type="dxa"/>
-            </w:tcMar>
-          </w:tcPr>
-          <w:p>
-            <w:pPr>
-              <w:spacing w:after="40" w:line="288" w:lineRule="auto" w:before="40"/>
+              <w:t>6个独立客户端进程</w:t>
+            </w:r>
+          </w:p>
+        </w:tc>
+        <w:tc>
+          <w:tcPr>
+            <w:tcW w:type="dxa" w:w="6009"/>
+            <w:tcBorders>
+              <w:top w:val="single" w:sz="4" w:color="C9D4DF"/>
+              <w:left w:val="single" w:sz="4" w:color="C9D4DF"/>
+              <w:bottom w:val="single" w:sz="4" w:color="C9D4DF"/>
+              <w:right w:val="single" w:sz="4" w:color="C9D4DF"/>
+            </w:tcBorders>
+          </w:tcPr>
+          <w:p>
+            <w:pPr>
+              <w:spacing w:line="288" w:lineRule="auto" w:before="60" w:after="60"/>
             </w:pPr>
             <w:r>
               <w:rPr>
@@ -3667,37 +3176,25 @@
                 <w:color w:val="000000"/>
                 <w:sz w:val="21"/>
               </w:rPr>
-              <w:t>请先关闭投票，避免通过重复查询推断单票</w:t>
+              <w:t>实际连接同一TLS端口，6票结果[3,2,1]</w:t>
             </w:r>
           </w:p>
         </w:tc>
       </w:tr>
       <w:tr>
-        <w:trPr/>
-        <w:tc>
-          <w:tcPr>
-            <w:tcW w:type="dxa" w:w="2551"/>
-            <w:vAlign w:val="center"/>
-            <w:tcBorders>
-              <w:top w:val="single" w:sz="4" w:color="D9D9D9"/>
-              <w:left w:val="single" w:sz="4" w:color="D9D9D9"/>
-              <w:bottom w:val="single" w:sz="4" w:color="D9D9D9"/>
-              <w:right w:val="single" w:sz="4" w:color="D9D9D9"/>
-              <w:top w:val="single" w:sz="4" w:color="D9D9D9"/>
-              <w:left w:val="single" w:sz="4" w:color="D9D9D9"/>
-              <w:bottom w:val="single" w:sz="4" w:color="D9D9D9"/>
-              <w:right w:val="single" w:sz="4" w:color="D9D9D9"/>
-            </w:tcBorders>
-            <w:tcMar>
-              <w:top w:w="75" w:type="dxa"/>
-              <w:left w:w="75" w:type="dxa"/>
-              <w:bottom w:w="75" w:type="dxa"/>
-              <w:right w:w="75" w:type="dxa"/>
-            </w:tcMar>
-          </w:tcPr>
-          <w:p>
-            <w:pPr>
-              <w:spacing w:after="40" w:line="288" w:lineRule="auto" w:before="40"/>
+        <w:tc>
+          <w:tcPr>
+            <w:tcW w:type="dxa" w:w="2835"/>
+            <w:tcBorders>
+              <w:top w:val="single" w:sz="4" w:color="C9D4DF"/>
+              <w:left w:val="single" w:sz="4" w:color="C9D4DF"/>
+              <w:bottom w:val="single" w:sz="4" w:color="C9D4DF"/>
+              <w:right w:val="single" w:sz="4" w:color="C9D4DF"/>
+            </w:tcBorders>
+          </w:tcPr>
+          <w:p>
+            <w:pPr>
+              <w:spacing w:line="288" w:lineRule="auto" w:before="60" w:after="60"/>
             </w:pPr>
             <w:r>
               <w:rPr>
@@ -3706,34 +3203,23 @@
                 <w:color w:val="000000"/>
                 <w:sz w:val="21"/>
               </w:rPr>
-              <w:t>已知票数准确性</w:t>
-            </w:r>
-          </w:p>
-        </w:tc>
-        <w:tc>
-          <w:tcPr>
-            <w:tcW w:type="dxa" w:w="6633"/>
-            <w:vAlign w:val="center"/>
-            <w:tcBorders>
-              <w:top w:val="single" w:sz="4" w:color="D9D9D9"/>
-              <w:left w:val="single" w:sz="4" w:color="D9D9D9"/>
-              <w:bottom w:val="single" w:sz="4" w:color="D9D9D9"/>
-              <w:right w:val="single" w:sz="4" w:color="D9D9D9"/>
-              <w:top w:val="single" w:sz="4" w:color="D9D9D9"/>
-              <w:left w:val="single" w:sz="4" w:color="D9D9D9"/>
-              <w:bottom w:val="single" w:sz="4" w:color="D9D9D9"/>
-              <w:right w:val="single" w:sz="4" w:color="D9D9D9"/>
-            </w:tcBorders>
-            <w:tcMar>
-              <w:top w:w="75" w:type="dxa"/>
-              <w:left w:w="75" w:type="dxa"/>
-              <w:bottom w:w="75" w:type="dxa"/>
-              <w:right w:w="75" w:type="dxa"/>
-            </w:tcMar>
-          </w:tcPr>
-          <w:p>
-            <w:pPr>
-              <w:spacing w:after="40" w:line="288" w:lineRule="auto" w:before="40"/>
+              <w:t>同一ID并发8次</w:t>
+            </w:r>
+          </w:p>
+        </w:tc>
+        <w:tc>
+          <w:tcPr>
+            <w:tcW w:type="dxa" w:w="6009"/>
+            <w:tcBorders>
+              <w:top w:val="single" w:sz="4" w:color="C9D4DF"/>
+              <w:left w:val="single" w:sz="4" w:color="C9D4DF"/>
+              <w:bottom w:val="single" w:sz="4" w:color="C9D4DF"/>
+              <w:right w:val="single" w:sz="4" w:color="C9D4DF"/>
+            </w:tcBorders>
+          </w:tcPr>
+          <w:p>
+            <w:pPr>
+              <w:spacing w:line="288" w:lineRule="auto" w:before="60" w:after="60"/>
             </w:pPr>
             <w:r>
               <w:rPr>
@@ -3742,37 +3228,25 @@
                 <w:color w:val="000000"/>
                 <w:sz w:val="21"/>
               </w:rPr>
-              <w:t>6张票得到 [3, 2, 1]</w:t>
+              <w:t>只接受1次，其余7次拒绝</w:t>
             </w:r>
           </w:p>
         </w:tc>
       </w:tr>
       <w:tr>
-        <w:trPr/>
-        <w:tc>
-          <w:tcPr>
-            <w:tcW w:type="dxa" w:w="2551"/>
-            <w:vAlign w:val="center"/>
-            <w:tcBorders>
-              <w:top w:val="single" w:sz="4" w:color="D9D9D9"/>
-              <w:left w:val="single" w:sz="4" w:color="D9D9D9"/>
-              <w:bottom w:val="single" w:sz="4" w:color="D9D9D9"/>
-              <w:right w:val="single" w:sz="4" w:color="D9D9D9"/>
-              <w:top w:val="single" w:sz="4" w:color="D9D9D9"/>
-              <w:left w:val="single" w:sz="4" w:color="D9D9D9"/>
-              <w:bottom w:val="single" w:sz="4" w:color="D9D9D9"/>
-              <w:right w:val="single" w:sz="4" w:color="D9D9D9"/>
-            </w:tcBorders>
-            <w:tcMar>
-              <w:top w:w="75" w:type="dxa"/>
-              <w:left w:w="75" w:type="dxa"/>
-              <w:bottom w:w="75" w:type="dxa"/>
-              <w:right w:w="75" w:type="dxa"/>
-            </w:tcMar>
-          </w:tcPr>
-          <w:p>
-            <w:pPr>
-              <w:spacing w:after="40" w:line="288" w:lineRule="auto" w:before="40"/>
+        <w:tc>
+          <w:tcPr>
+            <w:tcW w:type="dxa" w:w="2835"/>
+            <w:tcBorders>
+              <w:top w:val="single" w:sz="4" w:color="C9D4DF"/>
+              <w:left w:val="single" w:sz="4" w:color="C9D4DF"/>
+              <w:bottom w:val="single" w:sz="4" w:color="C9D4DF"/>
+              <w:right w:val="single" w:sz="4" w:color="C9D4DF"/>
+            </w:tcBorders>
+          </w:tcPr>
+          <w:p>
+            <w:pPr>
+              <w:spacing w:line="288" w:lineRule="auto" w:before="60" w:after="60"/>
             </w:pPr>
             <w:r>
               <w:rPr>
@@ -3781,34 +3255,23 @@
                 <w:color w:val="000000"/>
                 <w:sz w:val="21"/>
               </w:rPr>
-              <w:t>拒绝单票解密请求</w:t>
-            </w:r>
-          </w:p>
-        </w:tc>
-        <w:tc>
-          <w:tcPr>
-            <w:tcW w:type="dxa" w:w="6633"/>
-            <w:vAlign w:val="center"/>
-            <w:tcBorders>
-              <w:top w:val="single" w:sz="4" w:color="D9D9D9"/>
-              <w:left w:val="single" w:sz="4" w:color="D9D9D9"/>
-              <w:bottom w:val="single" w:sz="4" w:color="D9D9D9"/>
-              <w:right w:val="single" w:sz="4" w:color="D9D9D9"/>
-              <w:top w:val="single" w:sz="4" w:color="D9D9D9"/>
-              <w:left w:val="single" w:sz="4" w:color="D9D9D9"/>
-              <w:bottom w:val="single" w:sz="4" w:color="D9D9D9"/>
-              <w:right w:val="single" w:sz="4" w:color="D9D9D9"/>
-            </w:tcBorders>
-            <w:tcMar>
-              <w:top w:w="75" w:type="dxa"/>
-              <w:left w:w="75" w:type="dxa"/>
-              <w:bottom w:w="75" w:type="dxa"/>
-              <w:right w:w="75" w:type="dxa"/>
-            </w:tcMar>
-          </w:tcPr>
-          <w:p>
-            <w:pPr>
-              <w:spacing w:after="40" w:line="288" w:lineRule="auto" w:before="40"/>
+              <w:t>凭证冒用、错误指纹</w:t>
+            </w:r>
+          </w:p>
+        </w:tc>
+        <w:tc>
+          <w:tcPr>
+            <w:tcW w:type="dxa" w:w="6009"/>
+            <w:tcBorders>
+              <w:top w:val="single" w:sz="4" w:color="C9D4DF"/>
+              <w:left w:val="single" w:sz="4" w:color="C9D4DF"/>
+              <w:bottom w:val="single" w:sz="4" w:color="C9D4DF"/>
+              <w:right w:val="single" w:sz="4" w:color="C9D4DF"/>
+            </w:tcBorders>
+          </w:tcPr>
+          <w:p>
+            <w:pPr>
+              <w:spacing w:line="288" w:lineRule="auto" w:before="60" w:after="60"/>
             </w:pPr>
             <w:r>
               <w:rPr>
@@ -3817,37 +3280,25 @@
                 <w:color w:val="000000"/>
                 <w:sz w:val="21"/>
               </w:rPr>
-              <w:t>拒绝解密：请求不是当前完整投票的汇总</w:t>
+              <w:t>被拒绝；指纹失败时未发送票码</w:t>
             </w:r>
           </w:p>
         </w:tc>
       </w:tr>
       <w:tr>
-        <w:trPr/>
-        <w:tc>
-          <w:tcPr>
-            <w:tcW w:type="dxa" w:w="2551"/>
-            <w:vAlign w:val="center"/>
-            <w:tcBorders>
-              <w:top w:val="single" w:sz="4" w:color="D9D9D9"/>
-              <w:left w:val="single" w:sz="4" w:color="D9D9D9"/>
-              <w:bottom w:val="single" w:sz="4" w:color="D9D9D9"/>
-              <w:right w:val="single" w:sz="4" w:color="D9D9D9"/>
-              <w:top w:val="single" w:sz="4" w:color="D9D9D9"/>
-              <w:left w:val="single" w:sz="4" w:color="D9D9D9"/>
-              <w:bottom w:val="single" w:sz="4" w:color="D9D9D9"/>
-              <w:right w:val="single" w:sz="4" w:color="D9D9D9"/>
-            </w:tcBorders>
-            <w:tcMar>
-              <w:top w:w="75" w:type="dxa"/>
-              <w:left w:w="75" w:type="dxa"/>
-              <w:bottom w:w="75" w:type="dxa"/>
-              <w:right w:w="75" w:type="dxa"/>
-            </w:tcMar>
-          </w:tcPr>
-          <w:p>
-            <w:pPr>
-              <w:spacing w:after="40" w:line="288" w:lineRule="auto" w:before="40"/>
+        <w:tc>
+          <w:tcPr>
+            <w:tcW w:type="dxa" w:w="2835"/>
+            <w:tcBorders>
+              <w:top w:val="single" w:sz="4" w:color="C9D4DF"/>
+              <w:left w:val="single" w:sz="4" w:color="C9D4DF"/>
+              <w:bottom w:val="single" w:sz="4" w:color="C9D4DF"/>
+              <w:right w:val="single" w:sz="4" w:color="C9D4DF"/>
+            </w:tcBorders>
+          </w:tcPr>
+          <w:p>
+            <w:pPr>
+              <w:spacing w:line="288" w:lineRule="auto" w:before="60" w:after="60"/>
             </w:pPr>
             <w:r>
               <w:rPr>
@@ -3856,34 +3307,23 @@
                 <w:color w:val="000000"/>
                 <w:sz w:val="21"/>
               </w:rPr>
-              <w:t>无私钥计票端</w:t>
-            </w:r>
-          </w:p>
-        </w:tc>
-        <w:tc>
-          <w:tcPr>
-            <w:tcW w:type="dxa" w:w="6633"/>
-            <w:vAlign w:val="center"/>
-            <w:tcBorders>
-              <w:top w:val="single" w:sz="4" w:color="D9D9D9"/>
-              <w:left w:val="single" w:sz="4" w:color="D9D9D9"/>
-              <w:bottom w:val="single" w:sz="4" w:color="D9D9D9"/>
-              <w:right w:val="single" w:sz="4" w:color="D9D9D9"/>
-              <w:top w:val="single" w:sz="4" w:color="D9D9D9"/>
-              <w:left w:val="single" w:sz="4" w:color="D9D9D9"/>
-              <w:bottom w:val="single" w:sz="4" w:color="D9D9D9"/>
-              <w:right w:val="single" w:sz="4" w:color="D9D9D9"/>
-            </w:tcBorders>
-            <w:tcMar>
-              <w:top w:w="75" w:type="dxa"/>
-              <w:left w:w="75" w:type="dxa"/>
-              <w:bottom w:w="75" w:type="dxa"/>
-              <w:right w:w="75" w:type="dxa"/>
-            </w:tcMar>
-          </w:tcPr>
-          <w:p>
-            <w:pPr>
-              <w:spacing w:after="40" w:line="288" w:lineRule="auto" w:before="40"/>
+              <w:t>错误口令、部分汇总、伪造结果</w:t>
+            </w:r>
+          </w:p>
+        </w:tc>
+        <w:tc>
+          <w:tcPr>
+            <w:tcW w:type="dxa" w:w="6009"/>
+            <w:tcBorders>
+              <w:top w:val="single" w:sz="4" w:color="C9D4DF"/>
+              <w:left w:val="single" w:sz="4" w:color="C9D4DF"/>
+              <w:bottom w:val="single" w:sz="4" w:color="C9D4DF"/>
+              <w:right w:val="single" w:sz="4" w:color="C9D4DF"/>
+            </w:tcBorders>
+          </w:tcPr>
+          <w:p>
+            <w:pPr>
+              <w:spacing w:line="288" w:lineRule="auto" w:before="60" w:after="60"/>
             </w:pPr>
             <w:r>
               <w:rPr>
@@ -3892,37 +3332,25 @@
                 <w:color w:val="000000"/>
                 <w:sz w:val="21"/>
               </w:rPr>
-              <w:t>公开包无私钥；独立计票目录可完成同态汇总</w:t>
+              <w:t>被拒绝，不发布错误总票</w:t>
             </w:r>
           </w:p>
         </w:tc>
       </w:tr>
       <w:tr>
-        <w:trPr/>
-        <w:tc>
-          <w:tcPr>
-            <w:tcW w:type="dxa" w:w="2551"/>
-            <w:vAlign w:val="center"/>
-            <w:tcBorders>
-              <w:top w:val="single" w:sz="4" w:color="D9D9D9"/>
-              <w:left w:val="single" w:sz="4" w:color="D9D9D9"/>
-              <w:bottom w:val="single" w:sz="4" w:color="D9D9D9"/>
-              <w:right w:val="single" w:sz="4" w:color="D9D9D9"/>
-              <w:top w:val="single" w:sz="4" w:color="D9D9D9"/>
-              <w:left w:val="single" w:sz="4" w:color="D9D9D9"/>
-              <w:bottom w:val="single" w:sz="4" w:color="D9D9D9"/>
-              <w:right w:val="single" w:sz="4" w:color="D9D9D9"/>
-            </w:tcBorders>
-            <w:tcMar>
-              <w:top w:w="75" w:type="dxa"/>
-              <w:left w:w="75" w:type="dxa"/>
-              <w:bottom w:w="75" w:type="dxa"/>
-              <w:right w:w="75" w:type="dxa"/>
-            </w:tcMar>
-          </w:tcPr>
-          <w:p>
-            <w:pPr>
-              <w:spacing w:after="40" w:line="288" w:lineRule="auto" w:before="40"/>
+        <w:tc>
+          <w:tcPr>
+            <w:tcW w:type="dxa" w:w="2835"/>
+            <w:tcBorders>
+              <w:top w:val="single" w:sz="4" w:color="C9D4DF"/>
+              <w:left w:val="single" w:sz="4" w:color="C9D4DF"/>
+              <w:bottom w:val="single" w:sz="4" w:color="C9D4DF"/>
+              <w:right w:val="single" w:sz="4" w:color="C9D4DF"/>
+            </w:tcBorders>
+          </w:tcPr>
+          <w:p>
+            <w:pPr>
+              <w:spacing w:line="288" w:lineRule="auto" w:before="60" w:after="60"/>
             </w:pPr>
             <w:r>
               <w:rPr>
@@ -3931,34 +3359,23 @@
                 <w:color w:val="000000"/>
                 <w:sz w:val="21"/>
               </w:rPr>
-              <w:t>零票边界</w:t>
-            </w:r>
-          </w:p>
-        </w:tc>
-        <w:tc>
-          <w:tcPr>
-            <w:tcW w:type="dxa" w:w="6633"/>
-            <w:vAlign w:val="center"/>
-            <w:tcBorders>
-              <w:top w:val="single" w:sz="4" w:color="D9D9D9"/>
-              <w:left w:val="single" w:sz="4" w:color="D9D9D9"/>
-              <w:bottom w:val="single" w:sz="4" w:color="D9D9D9"/>
-              <w:right w:val="single" w:sz="4" w:color="D9D9D9"/>
-              <w:top w:val="single" w:sz="4" w:color="D9D9D9"/>
-              <w:left w:val="single" w:sz="4" w:color="D9D9D9"/>
-              <w:bottom w:val="single" w:sz="4" w:color="D9D9D9"/>
-              <w:right w:val="single" w:sz="4" w:color="D9D9D9"/>
-            </w:tcBorders>
-            <w:tcMar>
-              <w:top w:w="75" w:type="dxa"/>
-              <w:left w:w="75" w:type="dxa"/>
-              <w:bottom w:w="75" w:type="dxa"/>
-              <w:right w:w="75" w:type="dxa"/>
-            </w:tcMar>
-          </w:tcPr>
-          <w:p>
-            <w:pPr>
-              <w:spacing w:after="40" w:line="288" w:lineRule="auto" w:before="40"/>
+              <w:t>两窗口实际Qt控件</w:t>
+            </w:r>
+          </w:p>
+        </w:tc>
+        <w:tc>
+          <w:tcPr>
+            <w:tcW w:type="dxa" w:w="6009"/>
+            <w:tcBorders>
+              <w:top w:val="single" w:sz="4" w:color="C9D4DF"/>
+              <w:left w:val="single" w:sz="4" w:color="C9D4DF"/>
+              <w:bottom w:val="single" w:sz="4" w:color="C9D4DF"/>
+              <w:right w:val="single" w:sz="4" w:color="C9D4DF"/>
+            </w:tcBorders>
+          </w:tcPr>
+          <w:p>
+            <w:pPr>
+              <w:spacing w:line="288" w:lineRule="auto" w:before="60" w:after="60"/>
             </w:pPr>
             <w:r>
               <w:rPr>
@@ -3967,37 +3384,25 @@
                 <w:color w:val="000000"/>
                 <w:sz w:val="21"/>
               </w:rPr>
-              <w:t>零票正常输出 [0,0]</w:t>
+              <w:t>6次投票，回执与公开结果验签通过</w:t>
             </w:r>
           </w:p>
         </w:tc>
       </w:tr>
       <w:tr>
-        <w:trPr/>
-        <w:tc>
-          <w:tcPr>
-            <w:tcW w:type="dxa" w:w="2551"/>
-            <w:vAlign w:val="center"/>
-            <w:tcBorders>
-              <w:top w:val="single" w:sz="4" w:color="D9D9D9"/>
-              <w:left w:val="single" w:sz="4" w:color="D9D9D9"/>
-              <w:bottom w:val="single" w:sz="4" w:color="D9D9D9"/>
-              <w:right w:val="single" w:sz="4" w:color="D9D9D9"/>
-              <w:top w:val="single" w:sz="4" w:color="D9D9D9"/>
-              <w:left w:val="single" w:sz="4" w:color="D9D9D9"/>
-              <w:bottom w:val="single" w:sz="4" w:color="D9D9D9"/>
-              <w:right w:val="single" w:sz="4" w:color="D9D9D9"/>
-            </w:tcBorders>
-            <w:tcMar>
-              <w:top w:w="75" w:type="dxa"/>
-              <w:left w:w="75" w:type="dxa"/>
-              <w:bottom w:w="75" w:type="dxa"/>
-              <w:right w:w="75" w:type="dxa"/>
-            </w:tcMar>
-          </w:tcPr>
-          <w:p>
-            <w:pPr>
-              <w:spacing w:after="40" w:line="288" w:lineRule="auto" w:before="40"/>
+        <w:tc>
+          <w:tcPr>
+            <w:tcW w:type="dxa" w:w="2835"/>
+            <w:tcBorders>
+              <w:top w:val="single" w:sz="4" w:color="C9D4DF"/>
+              <w:left w:val="single" w:sz="4" w:color="C9D4DF"/>
+              <w:bottom w:val="single" w:sz="4" w:color="C9D4DF"/>
+              <w:right w:val="single" w:sz="4" w:color="C9D4DF"/>
+            </w:tcBorders>
+          </w:tcPr>
+          <w:p>
+            <w:pPr>
+              <w:spacing w:line="288" w:lineRule="auto" w:before="60" w:after="60"/>
             </w:pPr>
             <w:r>
               <w:rPr>
@@ -4006,34 +3411,23 @@
                 <w:color w:val="000000"/>
                 <w:sz w:val="21"/>
               </w:rPr>
-              <w:t>动态选项数量</w:t>
-            </w:r>
-          </w:p>
-        </w:tc>
-        <w:tc>
-          <w:tcPr>
-            <w:tcW w:type="dxa" w:w="6633"/>
-            <w:vAlign w:val="center"/>
-            <w:tcBorders>
-              <w:top w:val="single" w:sz="4" w:color="D9D9D9"/>
-              <w:left w:val="single" w:sz="4" w:color="D9D9D9"/>
-              <w:bottom w:val="single" w:sz="4" w:color="D9D9D9"/>
-              <w:right w:val="single" w:sz="4" w:color="D9D9D9"/>
-              <w:top w:val="single" w:sz="4" w:color="D9D9D9"/>
-              <w:left w:val="single" w:sz="4" w:color="D9D9D9"/>
-              <w:bottom w:val="single" w:sz="4" w:color="D9D9D9"/>
-              <w:right w:val="single" w:sz="4" w:color="D9D9D9"/>
-            </w:tcBorders>
-            <w:tcMar>
-              <w:top w:w="75" w:type="dxa"/>
-              <w:left w:w="75" w:type="dxa"/>
-              <w:bottom w:w="75" w:type="dxa"/>
-              <w:right w:w="75" w:type="dxa"/>
-            </w:tcMar>
-          </w:tcPr>
-          <w:p>
-            <w:pPr>
-              <w:spacing w:after="40" w:line="288" w:lineRule="auto" w:before="40"/>
+              <w:t>服务重启</w:t>
+            </w:r>
+          </w:p>
+        </w:tc>
+        <w:tc>
+          <w:tcPr>
+            <w:tcW w:type="dxa" w:w="6009"/>
+            <w:tcBorders>
+              <w:top w:val="single" w:sz="4" w:color="C9D4DF"/>
+              <w:left w:val="single" w:sz="4" w:color="C9D4DF"/>
+              <w:bottom w:val="single" w:sz="4" w:color="C9D4DF"/>
+              <w:right w:val="single" w:sz="4" w:color="C9D4DF"/>
+            </w:tcBorders>
+          </w:tcPr>
+          <w:p>
+            <w:pPr>
+              <w:spacing w:line="288" w:lineRule="auto" w:before="60" w:after="60"/>
             </w:pPr>
             <w:r>
               <w:rPr>
@@ -4042,188 +3436,7 @@
                 <w:color w:val="000000"/>
                 <w:sz w:val="21"/>
               </w:rPr>
-              <w:t>动态4选项得到 [1,1,1,1]</w:t>
-            </w:r>
-          </w:p>
-        </w:tc>
-      </w:tr>
-      <w:tr>
-        <w:trPr/>
-        <w:tc>
-          <w:tcPr>
-            <w:tcW w:type="dxa" w:w="2551"/>
-            <w:vAlign w:val="center"/>
-            <w:tcBorders>
-              <w:top w:val="single" w:sz="4" w:color="D9D9D9"/>
-              <w:left w:val="single" w:sz="4" w:color="D9D9D9"/>
-              <w:bottom w:val="single" w:sz="4" w:color="D9D9D9"/>
-              <w:right w:val="single" w:sz="4" w:color="D9D9D9"/>
-              <w:top w:val="single" w:sz="4" w:color="D9D9D9"/>
-              <w:left w:val="single" w:sz="4" w:color="D9D9D9"/>
-              <w:bottom w:val="single" w:sz="4" w:color="D9D9D9"/>
-              <w:right w:val="single" w:sz="4" w:color="D9D9D9"/>
-            </w:tcBorders>
-            <w:tcMar>
-              <w:top w:w="75" w:type="dxa"/>
-              <w:left w:w="75" w:type="dxa"/>
-              <w:bottom w:w="75" w:type="dxa"/>
-              <w:right w:w="75" w:type="dxa"/>
-            </w:tcMar>
-          </w:tcPr>
-          <w:p>
-            <w:pPr>
-              <w:spacing w:after="40" w:line="288" w:lineRule="auto" w:before="40"/>
-            </w:pPr>
-            <w:r>
-              <w:rPr>
-                <w:rFonts w:ascii="Times New Roman" w:hAnsi="Times New Roman" w:eastAsia="宋体"/>
-                <w:b w:val="0"/>
-                <w:color w:val="000000"/>
-                <w:sz w:val="21"/>
-              </w:rPr>
-              <w:t>非法选票总和约束</w:t>
-            </w:r>
-          </w:p>
-        </w:tc>
-        <w:tc>
-          <w:tcPr>
-            <w:tcW w:type="dxa" w:w="6633"/>
-            <w:vAlign w:val="center"/>
-            <w:tcBorders>
-              <w:top w:val="single" w:sz="4" w:color="D9D9D9"/>
-              <w:left w:val="single" w:sz="4" w:color="D9D9D9"/>
-              <w:bottom w:val="single" w:sz="4" w:color="D9D9D9"/>
-              <w:right w:val="single" w:sz="4" w:color="D9D9D9"/>
-              <w:top w:val="single" w:sz="4" w:color="D9D9D9"/>
-              <w:left w:val="single" w:sz="4" w:color="D9D9D9"/>
-              <w:bottom w:val="single" w:sz="4" w:color="D9D9D9"/>
-              <w:right w:val="single" w:sz="4" w:color="D9D9D9"/>
-            </w:tcBorders>
-            <w:tcMar>
-              <w:top w:w="75" w:type="dxa"/>
-              <w:left w:w="75" w:type="dxa"/>
-              <w:bottom w:w="75" w:type="dxa"/>
-              <w:right w:w="75" w:type="dxa"/>
-            </w:tcMar>
-          </w:tcPr>
-          <w:p>
-            <w:pPr>
-              <w:spacing w:after="40" w:line="288" w:lineRule="auto" w:before="40"/>
-            </w:pPr>
-            <w:r>
-              <w:rPr>
-                <w:rFonts w:ascii="Times New Roman" w:hAnsi="Times New Roman" w:eastAsia="宋体"/>
-                <w:b w:val="0"/>
-                <w:color w:val="000000"/>
-                <w:sz w:val="21"/>
-              </w:rPr>
-              <w:t>总票数约束不成立，可能存在非法加密选票</w:t>
-            </w:r>
-          </w:p>
-        </w:tc>
-      </w:tr>
-      <w:tr>
-        <w:trPr/>
-        <w:tc>
-          <w:tcPr>
-            <w:tcW w:type="dxa" w:w="2551"/>
-            <w:tcBorders>
-              <w:top w:val="single" w:sz="4" w:color="D9D9D9"/>
-              <w:left w:val="single" w:sz="4" w:color="D9D9D9"/>
-              <w:bottom w:val="single" w:sz="4" w:color="D9D9D9"/>
-              <w:right w:val="single" w:sz="4" w:color="D9D9D9"/>
-            </w:tcBorders>
-          </w:tcPr>
-          <w:p>
-            <w:pPr>
-              <w:spacing w:line="288" w:lineRule="auto" w:after="40" w:before="40"/>
-            </w:pPr>
-            <w:r>
-              <w:rPr>
-                <w:rFonts w:ascii="Times New Roman" w:hAnsi="Times New Roman" w:eastAsia="宋体"/>
-                <w:b w:val="0"/>
-                <w:color w:val="000000"/>
-                <w:sz w:val="21"/>
-              </w:rPr>
-              <w:t>单人投票隐私局限</w:t>
-            </w:r>
-          </w:p>
-        </w:tc>
-        <w:tc>
-          <w:tcPr>
-            <w:tcW w:type="dxa" w:w="6633"/>
-            <w:tcBorders>
-              <w:top w:val="single" w:sz="4" w:color="D9D9D9"/>
-              <w:left w:val="single" w:sz="4" w:color="D9D9D9"/>
-              <w:bottom w:val="single" w:sz="4" w:color="D9D9D9"/>
-              <w:right w:val="single" w:sz="4" w:color="D9D9D9"/>
-            </w:tcBorders>
-          </w:tcPr>
-          <w:p>
-            <w:pPr>
-              <w:spacing w:line="288" w:lineRule="auto" w:after="40" w:before="40"/>
-            </w:pPr>
-            <w:r>
-              <w:rPr>
-                <w:rFonts w:ascii="Times New Roman" w:hAnsi="Times New Roman" w:eastAsia="宋体"/>
-                <w:b w:val="0"/>
-                <w:color w:val="000000"/>
-                <w:sz w:val="21"/>
-              </w:rPr>
-              <w:t>一人总票[0,1]直接暴露该人的选择</w:t>
-            </w:r>
-          </w:p>
-        </w:tc>
-      </w:tr>
-      <w:tr>
-        <w:trPr/>
-        <w:tc>
-          <w:tcPr>
-            <w:tcW w:type="dxa" w:w="2551"/>
-            <w:tcBorders>
-              <w:top w:val="single" w:sz="4" w:color="D9D9D9"/>
-              <w:left w:val="single" w:sz="4" w:color="D9D9D9"/>
-              <w:bottom w:val="single" w:sz="4" w:color="D9D9D9"/>
-              <w:right w:val="single" w:sz="4" w:color="D9D9D9"/>
-            </w:tcBorders>
-          </w:tcPr>
-          <w:p>
-            <w:pPr>
-              <w:spacing w:line="288" w:lineRule="auto" w:after="40" w:before="40"/>
-            </w:pPr>
-            <w:r>
-              <w:rPr>
-                <w:rFonts w:ascii="Times New Roman" w:hAnsi="Times New Roman" w:eastAsia="宋体"/>
-                <w:b w:val="0"/>
-                <w:color w:val="000000"/>
-                <w:sz w:val="21"/>
-              </w:rPr>
-              <w:t>非法选票组合局限</w:t>
-            </w:r>
-          </w:p>
-        </w:tc>
-        <w:tc>
-          <w:tcPr>
-            <w:tcW w:type="dxa" w:w="6633"/>
-            <w:tcBorders>
-              <w:top w:val="single" w:sz="4" w:color="D9D9D9"/>
-              <w:left w:val="single" w:sz="4" w:color="D9D9D9"/>
-              <w:bottom w:val="single" w:sz="4" w:color="D9D9D9"/>
-              <w:right w:val="single" w:sz="4" w:color="D9D9D9"/>
-            </w:tcBorders>
-          </w:tcPr>
-          <w:p>
-            <w:pPr>
-              <w:spacing w:line="288" w:lineRule="auto" w:after="40" w:before="40"/>
-            </w:pPr>
-            <w:r>
-              <w:rPr>
-                <w:rFonts w:ascii="Times New Roman" w:hAnsi="Times New Roman" w:eastAsia="宋体"/>
-                <w:b w:val="0"/>
-                <w:color w:val="000000"/>
-                <w:sz w:val="21"/>
-              </w:rPr>
-              <w:t>总和约束不能替代逐票独热合法性证明</w:t>
+              <w:t>已关闭状态和已发布结果保持一致</w:t>
             </w:r>
           </w:p>
         </w:tc>
@@ -4231,74 +3444,18 @@
     </w:tbl>
     <w:p>
       <w:pPr>
+        <w:pStyle w:val="ReportBody"/>
+      </w:pPr>
+      <w:r>
+        <w:t>网络与GUI测试均使用虚拟ID和合成选票，原始证据在evidence/2026-10-27-network/。独立进程验收在一台电脑上通过真实TLS完成，不代表跨物理电脑实测；教师私有数据和现场小改仍待实际验收。</w:t>
+      </w:r>
+    </w:p>
+    <w:p>
+      <w:pPr>
         <w:pStyle w:val="ReportH2"/>
       </w:pPr>
       <w:r>
-        <w:rPr>
-          <w:rFonts w:ascii="Times New Roman" w:hAnsi="Times New Roman" w:eastAsia="宋体"/>
-          <w:b/>
-          <w:color w:val="000000"/>
-          <w:sz w:val="24"/>
-        </w:rPr>
-        <w:t>5.2 失败案例与误报分析</w:t>
-      </w:r>
-    </w:p>
-    <w:p>
-      <w:pPr>
-        <w:pStyle w:val="ReportBody"/>
-      </w:pPr>
-      <w:r>
-        <w:rPr>
-          <w:rFonts w:ascii="Times New Roman" w:hAnsi="Times New Roman" w:eastAsia="宋体"/>
-          <w:b w:val="0"/>
-          <w:color w:val="000000"/>
-          <w:sz w:val="24"/>
-        </w:rPr>
-        <w:t>失败与边界：直接接受外部任意密文会把系统变成解密查询接口。本实现对完整汇总复算并比较，实际单票替换实验得到拒绝。开放期间也禁止查询，减少差分推断。</w:t>
-      </w:r>
-    </w:p>
-    <w:p>
-      <w:pPr>
-        <w:pStyle w:val="ReportBody"/>
-      </w:pPr>
-      <w:r>
-        <w:rPr>
-          <w:rFonts w:ascii="Times New Roman" w:hAnsi="Times New Roman" w:eastAsia="宋体"/>
-          <w:b w:val="0"/>
-          <w:color w:val="000000"/>
-          <w:sz w:val="24"/>
-        </w:rPr>
-        <w:t>误报分析：使用过期清单生成的合法汇总请求可能被拒绝；这属于快照不一致。正确操作是重新读取当前关闭状态后生成汇总，不应跳过摘要检查。</w:t>
-      </w:r>
-    </w:p>
-    <w:p>
-      <w:pPr>
-        <w:pStyle w:val="ReportBody"/>
-      </w:pPr>
-      <w:r>
-        <w:rPr>
-          <w:rFonts w:ascii="Times New Roman" w:hAnsi="Times New Roman" w:eastAsia="宋体"/>
-          <w:b w:val="0"/>
-          <w:color w:val="000000"/>
-          <w:sz w:val="24"/>
-        </w:rPr>
-        <w:t>安全局限：一人投票时总票数本身暴露其选择，关闭投票不能解决小群体隐私。总和约束能发现[2,0]形式的异常，但恶意票之间相互抵消时仍可能通过；需要合法性证明才能进一步防护。</w:t>
-      </w:r>
-    </w:p>
-    <w:p>
-      <w:pPr>
-        <w:pStyle w:val="ReportH2"/>
-      </w:pPr>
-      <w:r>
-        <w:t>5.3 性能数据与结果分析</w:t>
-      </w:r>
-    </w:p>
-    <w:p>
-      <w:pPr>
-        <w:pStyle w:val="ReportBody"/>
-      </w:pPr>
-      <w:r>
-        <w:t>对10、100、1000名投票者各做3次三选项实验。合成明文使用种子20261026加重复序号，密码学随机数不固定；每次均核对解密计数与预期。表3取本轮JSON中的算术平均值，单位毫秒。</w:t>
+        <w:t>5.3 加密、汇总和解密耗时</w:t>
       </w:r>
     </w:p>
     <w:p>
@@ -4307,53 +3464,332 @@
         <w:keepNext/>
       </w:pPr>
       <w:r>
-        <w:t>表3 加密 汇总与解密实测均值</w:t>
+        <w:t>表3 本轮六端并发实测（毫秒）</w:t>
       </w:r>
     </w:p>
     <w:tbl>
       <w:tblPr>
         <w:tblW w:type="auto" w:w="0"/>
-        <w:jc w:val="center"/>
         <w:tblLayout w:type="fixed"/>
         <w:tblLook w:firstColumn="1" w:firstRow="1" w:lastColumn="0" w:lastRow="0" w:noHBand="0" w:noVBand="1" w:val="04A0"/>
       </w:tblPr>
       <w:tblGrid>
-        <w:gridCol w:w="1191"/>
-        <w:gridCol w:w="2665"/>
-        <w:gridCol w:w="2665"/>
-        <w:gridCol w:w="2665"/>
+        <w:gridCol w:w="4677"/>
+        <w:gridCol w:w="4677"/>
       </w:tblGrid>
       <w:tr>
         <w:trPr>
           <w:tblHeader/>
+        </w:trPr>
+        <w:tc>
+          <w:tcPr>
+            <w:tcW w:type="dxa" w:w="6520"/>
+            <w:tcBorders>
+              <w:top w:val="single" w:sz="4" w:color="C9D4DF"/>
+              <w:left w:val="single" w:sz="4" w:color="C9D4DF"/>
+              <w:bottom w:val="single" w:sz="4" w:color="C9D4DF"/>
+              <w:right w:val="single" w:sz="4" w:color="C9D4DF"/>
+            </w:tcBorders>
+            <w:shd w:fill="E8EEF3"/>
+          </w:tcPr>
+          <w:p>
+            <w:pPr>
+              <w:spacing w:line="288" w:lineRule="auto" w:before="60" w:after="60"/>
+            </w:pPr>
+            <w:r>
+              <w:rPr>
+                <w:rFonts w:ascii="Times New Roman" w:hAnsi="Times New Roman" w:eastAsia="宋体"/>
+                <w:b/>
+                <w:color w:val="000000"/>
+                <w:sz w:val="21"/>
+              </w:rPr>
+              <w:t>测量范围</w:t>
+            </w:r>
+          </w:p>
+        </w:tc>
+        <w:tc>
+          <w:tcPr>
+            <w:tcW w:type="dxa" w:w="2324"/>
+            <w:tcBorders>
+              <w:top w:val="single" w:sz="4" w:color="C9D4DF"/>
+              <w:left w:val="single" w:sz="4" w:color="C9D4DF"/>
+              <w:bottom w:val="single" w:sz="4" w:color="C9D4DF"/>
+              <w:right w:val="single" w:sz="4" w:color="C9D4DF"/>
+            </w:tcBorders>
+            <w:shd w:fill="E8EEF3"/>
+          </w:tcPr>
+          <w:p>
+            <w:pPr>
+              <w:spacing w:line="288" w:lineRule="auto" w:before="60" w:after="60"/>
+            </w:pPr>
+            <w:r>
+              <w:rPr>
+                <w:rFonts w:ascii="Times New Roman" w:hAnsi="Times New Roman" w:eastAsia="宋体"/>
+                <w:b/>
+                <w:color w:val="000000"/>
+                <w:sz w:val="21"/>
+              </w:rPr>
+              <w:t>数值</w:t>
+            </w:r>
+          </w:p>
+        </w:tc>
+      </w:tr>
+      <w:tr>
+        <w:tc>
+          <w:tcPr>
+            <w:tcW w:type="dxa" w:w="6520"/>
+            <w:tcBorders>
+              <w:top w:val="single" w:sz="4" w:color="C9D4DF"/>
+              <w:left w:val="single" w:sz="4" w:color="C9D4DF"/>
+              <w:bottom w:val="single" w:sz="4" w:color="C9D4DF"/>
+              <w:right w:val="single" w:sz="4" w:color="C9D4DF"/>
+            </w:tcBorders>
+          </w:tcPr>
+          <w:p>
+            <w:pPr>
+              <w:spacing w:line="288" w:lineRule="auto" w:before="60" w:after="60"/>
+            </w:pPr>
+            <w:r>
+              <w:rPr>
+                <w:rFonts w:ascii="Times New Roman" w:hAnsi="Times New Roman" w:eastAsia="宋体"/>
+                <w:b w:val="0"/>
+                <w:color w:val="000000"/>
+                <w:sz w:val="21"/>
+              </w:rPr>
+              <w:t>每端一票的本地加密，六端算术均值</w:t>
+            </w:r>
+          </w:p>
+        </w:tc>
+        <w:tc>
+          <w:tcPr>
+            <w:tcW w:type="dxa" w:w="2324"/>
+            <w:tcBorders>
+              <w:top w:val="single" w:sz="4" w:color="C9D4DF"/>
+              <w:left w:val="single" w:sz="4" w:color="C9D4DF"/>
+              <w:bottom w:val="single" w:sz="4" w:color="C9D4DF"/>
+              <w:right w:val="single" w:sz="4" w:color="C9D4DF"/>
+            </w:tcBorders>
+          </w:tcPr>
+          <w:p>
+            <w:pPr>
+              <w:spacing w:line="288" w:lineRule="auto" w:before="60" w:after="60"/>
+            </w:pPr>
+            <w:r>
+              <w:rPr>
+                <w:rFonts w:ascii="Times New Roman" w:hAnsi="Times New Roman" w:eastAsia="宋体"/>
+                <w:b w:val="0"/>
+                <w:color w:val="000000"/>
+                <w:sz w:val="21"/>
+              </w:rPr>
+              <w:t>19.34</w:t>
+            </w:r>
+          </w:p>
+        </w:tc>
+      </w:tr>
+      <w:tr>
+        <w:tc>
+          <w:tcPr>
+            <w:tcW w:type="dxa" w:w="6520"/>
+            <w:tcBorders>
+              <w:top w:val="single" w:sz="4" w:color="C9D4DF"/>
+              <w:left w:val="single" w:sz="4" w:color="C9D4DF"/>
+              <w:bottom w:val="single" w:sz="4" w:color="C9D4DF"/>
+              <w:right w:val="single" w:sz="4" w:color="C9D4DF"/>
+            </w:tcBorders>
+          </w:tcPr>
+          <w:p>
+            <w:pPr>
+              <w:spacing w:line="288" w:lineRule="auto" w:before="60" w:after="60"/>
+            </w:pPr>
+            <w:r>
+              <w:rPr>
+                <w:rFonts w:ascii="Times New Roman" w:hAnsi="Times New Roman" w:eastAsia="宋体"/>
+                <w:b w:val="0"/>
+                <w:color w:val="000000"/>
+                <w:sz w:val="21"/>
+              </w:rPr>
+              <w:t>提交密文至收到回执，六端均值</w:t>
+            </w:r>
+          </w:p>
+        </w:tc>
+        <w:tc>
+          <w:tcPr>
+            <w:tcW w:type="dxa" w:w="2324"/>
+            <w:tcBorders>
+              <w:top w:val="single" w:sz="4" w:color="C9D4DF"/>
+              <w:left w:val="single" w:sz="4" w:color="C9D4DF"/>
+              <w:bottom w:val="single" w:sz="4" w:color="C9D4DF"/>
+              <w:right w:val="single" w:sz="4" w:color="C9D4DF"/>
+            </w:tcBorders>
+          </w:tcPr>
+          <w:p>
+            <w:pPr>
+              <w:spacing w:line="288" w:lineRule="auto" w:before="60" w:after="60"/>
+            </w:pPr>
+            <w:r>
+              <w:rPr>
+                <w:rFonts w:ascii="Times New Roman" w:hAnsi="Times New Roman" w:eastAsia="宋体"/>
+                <w:b w:val="0"/>
+                <w:color w:val="000000"/>
+                <w:sz w:val="21"/>
+              </w:rPr>
+              <w:t>151.91</w:t>
+            </w:r>
+          </w:p>
+        </w:tc>
+      </w:tr>
+      <w:tr>
+        <w:tc>
+          <w:tcPr>
+            <w:tcW w:type="dxa" w:w="6520"/>
+            <w:tcBorders>
+              <w:top w:val="single" w:sz="4" w:color="C9D4DF"/>
+              <w:left w:val="single" w:sz="4" w:color="C9D4DF"/>
+              <w:bottom w:val="single" w:sz="4" w:color="C9D4DF"/>
+              <w:right w:val="single" w:sz="4" w:color="C9D4DF"/>
+            </w:tcBorders>
+          </w:tcPr>
+          <w:p>
+            <w:pPr>
+              <w:spacing w:line="288" w:lineRule="auto" w:before="60" w:after="60"/>
+            </w:pPr>
+            <w:r>
+              <w:rPr>
+                <w:rFonts w:ascii="Times New Roman" w:hAnsi="Times New Roman" w:eastAsia="宋体"/>
+                <w:b w:val="0"/>
+                <w:color w:val="000000"/>
+                <w:sz w:val="21"/>
+              </w:rPr>
+              <w:t>服务器6票列乘积（不含审计）</w:t>
+            </w:r>
+          </w:p>
+        </w:tc>
+        <w:tc>
+          <w:tcPr>
+            <w:tcW w:type="dxa" w:w="2324"/>
+            <w:tcBorders>
+              <w:top w:val="single" w:sz="4" w:color="C9D4DF"/>
+              <w:left w:val="single" w:sz="4" w:color="C9D4DF"/>
+              <w:bottom w:val="single" w:sz="4" w:color="C9D4DF"/>
+              <w:right w:val="single" w:sz="4" w:color="C9D4DF"/>
+            </w:tcBorders>
+          </w:tcPr>
+          <w:p>
+            <w:pPr>
+              <w:spacing w:line="288" w:lineRule="auto" w:before="60" w:after="60"/>
+            </w:pPr>
+            <w:r>
+              <w:rPr>
+                <w:rFonts w:ascii="Times New Roman" w:hAnsi="Times New Roman" w:eastAsia="宋体"/>
+                <w:b w:val="0"/>
+                <w:color w:val="000000"/>
+                <w:sz w:val="21"/>
+              </w:rPr>
+              <w:t>0.59</w:t>
+            </w:r>
+          </w:p>
+        </w:tc>
+      </w:tr>
+      <w:tr>
+        <w:tc>
+          <w:tcPr>
+            <w:tcW w:type="dxa" w:w="6520"/>
+            <w:tcBorders>
+              <w:top w:val="single" w:sz="4" w:color="C9D4DF"/>
+              <w:left w:val="single" w:sz="4" w:color="C9D4DF"/>
+              <w:bottom w:val="single" w:sz="4" w:color="C9D4DF"/>
+              <w:right w:val="single" w:sz="4" w:color="C9D4DF"/>
+            </w:tcBorders>
+          </w:tcPr>
+          <w:p>
+            <w:pPr>
+              <w:spacing w:line="288" w:lineRule="auto" w:before="60" w:after="60"/>
+            </w:pPr>
+            <w:r>
+              <w:rPr>
+                <w:rFonts w:ascii="Times New Roman" w:hAnsi="Times New Roman" w:eastAsia="宋体"/>
+                <w:b w:val="0"/>
+                <w:color w:val="000000"/>
+                <w:sz w:val="21"/>
+              </w:rPr>
+              <w:t>保管端3列总票解密</w:t>
+            </w:r>
+          </w:p>
+        </w:tc>
+        <w:tc>
+          <w:tcPr>
+            <w:tcW w:type="dxa" w:w="2324"/>
+            <w:tcBorders>
+              <w:top w:val="single" w:sz="4" w:color="C9D4DF"/>
+              <w:left w:val="single" w:sz="4" w:color="C9D4DF"/>
+              <w:bottom w:val="single" w:sz="4" w:color="C9D4DF"/>
+              <w:right w:val="single" w:sz="4" w:color="C9D4DF"/>
+            </w:tcBorders>
+          </w:tcPr>
+          <w:p>
+            <w:pPr>
+              <w:spacing w:line="288" w:lineRule="auto" w:before="60" w:after="60"/>
+            </w:pPr>
+            <w:r>
+              <w:rPr>
+                <w:rFonts w:ascii="Times New Roman" w:hAnsi="Times New Roman" w:eastAsia="宋体"/>
+                <w:b w:val="0"/>
+                <w:color w:val="000000"/>
+                <w:sz w:val="21"/>
+              </w:rPr>
+              <w:t>5.16</w:t>
+            </w:r>
+          </w:p>
+        </w:tc>
+      </w:tr>
+    </w:tbl>
+    <w:p>
+      <w:pPr>
+        <w:pStyle w:val="ReportBody"/>
+      </w:pPr>
+      <w:r>
+        <w:t>加密计时包含独热向量构造与三分量随机加密，提交往返包含TLS、服务器事务和响应；汇总与解密计时只覆盖各自运算。六端在同一机器并发，包含CPU竞争；不能把一次运行当作网络部署性能保证。逐端原始值、进程耗时与源码哈希均保存在network-processes.json。</w:t>
+      </w:r>
+    </w:p>
+    <w:p>
+      <w:pPr>
+        <w:pStyle w:val="ReportCaption"/>
+        <w:keepNext/>
+      </w:pPr>
+      <w:r>
+        <w:t>表4 历史原语性能对照（各三次均值，毫秒）</w:t>
+      </w:r>
+    </w:p>
+    <w:tbl>
+      <w:tblPr>
+        <w:tblW w:type="auto" w:w="0"/>
+        <w:tblLayout w:type="fixed"/>
+        <w:tblLook w:firstColumn="1" w:firstRow="1" w:lastColumn="0" w:lastRow="0" w:noHBand="0" w:noVBand="1" w:val="04A0"/>
+      </w:tblPr>
+      <w:tblGrid>
+        <w:gridCol w:w="2338"/>
+        <w:gridCol w:w="2338"/>
+        <w:gridCol w:w="2338"/>
+        <w:gridCol w:w="2338"/>
+      </w:tblGrid>
+      <w:tr>
+        <w:trPr>
           <w:tblHeader/>
         </w:trPr>
         <w:tc>
           <w:tcPr>
-            <w:tcW w:type="dxa" w:w="1191"/>
-            <w:vAlign w:val="center"/>
-            <w:tcBorders>
-              <w:top w:val="single" w:sz="4" w:color="D9D9D9"/>
-              <w:left w:val="single" w:sz="4" w:color="D9D9D9"/>
-              <w:bottom w:val="single" w:sz="4" w:color="D9D9D9"/>
-              <w:right w:val="single" w:sz="4" w:color="D9D9D9"/>
-              <w:top w:val="single" w:sz="4" w:color="D9D9D9"/>
-              <w:left w:val="single" w:sz="4" w:color="D9D9D9"/>
-              <w:bottom w:val="single" w:sz="4" w:color="D9D9D9"/>
-              <w:right w:val="single" w:sz="4" w:color="D9D9D9"/>
-            </w:tcBorders>
-            <w:tcMar>
-              <w:top w:w="75" w:type="dxa"/>
-              <w:left w:w="75" w:type="dxa"/>
-              <w:bottom w:w="75" w:type="dxa"/>
-              <w:right w:w="75" w:type="dxa"/>
-            </w:tcMar>
-            <w:shd w:fill="E8EDF1"/>
-          </w:tcPr>
-          <w:p>
-            <w:pPr>
-              <w:keepNext/>
-              <w:spacing w:after="40" w:line="288" w:lineRule="auto" w:before="40"/>
+            <w:tcW w:type="dxa" w:w="1361"/>
+            <w:tcBorders>
+              <w:top w:val="single" w:sz="4" w:color="C9D4DF"/>
+              <w:left w:val="single" w:sz="4" w:color="C9D4DF"/>
+              <w:bottom w:val="single" w:sz="4" w:color="C9D4DF"/>
+              <w:right w:val="single" w:sz="4" w:color="C9D4DF"/>
+            </w:tcBorders>
+            <w:shd w:fill="E8EEF3"/>
+          </w:tcPr>
+          <w:p>
+            <w:pPr>
+              <w:spacing w:line="288" w:lineRule="auto" w:before="60" w:after="60"/>
             </w:pPr>
             <w:r>
               <w:rPr>
@@ -4368,146 +3804,97 @@
         </w:tc>
         <w:tc>
           <w:tcPr>
-            <w:tcW w:type="dxa" w:w="2665"/>
-            <w:vAlign w:val="center"/>
-            <w:tcBorders>
-              <w:top w:val="single" w:sz="4" w:color="D9D9D9"/>
-              <w:left w:val="single" w:sz="4" w:color="D9D9D9"/>
-              <w:bottom w:val="single" w:sz="4" w:color="D9D9D9"/>
-              <w:right w:val="single" w:sz="4" w:color="D9D9D9"/>
-              <w:top w:val="single" w:sz="4" w:color="D9D9D9"/>
-              <w:left w:val="single" w:sz="4" w:color="D9D9D9"/>
-              <w:bottom w:val="single" w:sz="4" w:color="D9D9D9"/>
-              <w:right w:val="single" w:sz="4" w:color="D9D9D9"/>
-            </w:tcBorders>
-            <w:tcMar>
-              <w:top w:w="75" w:type="dxa"/>
-              <w:left w:w="75" w:type="dxa"/>
-              <w:bottom w:w="75" w:type="dxa"/>
-              <w:right w:w="75" w:type="dxa"/>
-            </w:tcMar>
-            <w:shd w:fill="E8EDF1"/>
-          </w:tcPr>
-          <w:p>
-            <w:pPr>
-              <w:keepNext/>
-              <w:spacing w:after="40" w:line="288" w:lineRule="auto" w:before="40"/>
-            </w:pPr>
-            <w:r>
-              <w:rPr>
-                <w:rFonts w:ascii="Times New Roman" w:hAnsi="Times New Roman" w:eastAsia="宋体"/>
-                <w:b/>
-                <w:color w:val="000000"/>
-                <w:sz w:val="21"/>
-              </w:rPr>
-              <w:t>加密均值 ms</w:t>
-            </w:r>
-          </w:p>
-        </w:tc>
-        <w:tc>
-          <w:tcPr>
-            <w:tcW w:type="dxa" w:w="2665"/>
-            <w:vAlign w:val="center"/>
-            <w:tcBorders>
-              <w:top w:val="single" w:sz="4" w:color="D9D9D9"/>
-              <w:left w:val="single" w:sz="4" w:color="D9D9D9"/>
-              <w:bottom w:val="single" w:sz="4" w:color="D9D9D9"/>
-              <w:right w:val="single" w:sz="4" w:color="D9D9D9"/>
-              <w:top w:val="single" w:sz="4" w:color="D9D9D9"/>
-              <w:left w:val="single" w:sz="4" w:color="D9D9D9"/>
-              <w:bottom w:val="single" w:sz="4" w:color="D9D9D9"/>
-              <w:right w:val="single" w:sz="4" w:color="D9D9D9"/>
-            </w:tcBorders>
-            <w:tcMar>
-              <w:top w:w="75" w:type="dxa"/>
-              <w:left w:w="75" w:type="dxa"/>
-              <w:bottom w:w="75" w:type="dxa"/>
-              <w:right w:w="75" w:type="dxa"/>
-            </w:tcMar>
-            <w:shd w:fill="E8EDF1"/>
-          </w:tcPr>
-          <w:p>
-            <w:pPr>
-              <w:keepNext/>
-              <w:spacing w:after="40" w:line="288" w:lineRule="auto" w:before="40"/>
-            </w:pPr>
-            <w:r>
-              <w:rPr>
-                <w:rFonts w:ascii="Times New Roman" w:hAnsi="Times New Roman" w:eastAsia="宋体"/>
-                <w:b/>
-                <w:color w:val="000000"/>
-                <w:sz w:val="21"/>
-              </w:rPr>
-              <w:t>汇总均值 ms</w:t>
-            </w:r>
-          </w:p>
-        </w:tc>
-        <w:tc>
-          <w:tcPr>
-            <w:tcW w:type="dxa" w:w="2665"/>
-            <w:vAlign w:val="center"/>
-            <w:tcBorders>
-              <w:top w:val="single" w:sz="4" w:color="D9D9D9"/>
-              <w:left w:val="single" w:sz="4" w:color="D9D9D9"/>
-              <w:bottom w:val="single" w:sz="4" w:color="D9D9D9"/>
-              <w:right w:val="single" w:sz="4" w:color="D9D9D9"/>
-              <w:top w:val="single" w:sz="4" w:color="D9D9D9"/>
-              <w:left w:val="single" w:sz="4" w:color="D9D9D9"/>
-              <w:bottom w:val="single" w:sz="4" w:color="D9D9D9"/>
-              <w:right w:val="single" w:sz="4" w:color="D9D9D9"/>
-            </w:tcBorders>
-            <w:tcMar>
-              <w:top w:w="75" w:type="dxa"/>
-              <w:left w:w="75" w:type="dxa"/>
-              <w:bottom w:w="75" w:type="dxa"/>
-              <w:right w:w="75" w:type="dxa"/>
-            </w:tcMar>
-            <w:shd w:fill="E8EDF1"/>
-          </w:tcPr>
-          <w:p>
-            <w:pPr>
-              <w:keepNext/>
-              <w:spacing w:after="40" w:line="288" w:lineRule="auto" w:before="40"/>
-            </w:pPr>
-            <w:r>
-              <w:rPr>
-                <w:rFonts w:ascii="Times New Roman" w:hAnsi="Times New Roman" w:eastAsia="宋体"/>
-                <w:b/>
-                <w:color w:val="000000"/>
-                <w:sz w:val="21"/>
-              </w:rPr>
-              <w:t>解密均值 ms</w:t>
+            <w:tcW w:type="dxa" w:w="2494"/>
+            <w:tcBorders>
+              <w:top w:val="single" w:sz="4" w:color="C9D4DF"/>
+              <w:left w:val="single" w:sz="4" w:color="C9D4DF"/>
+              <w:bottom w:val="single" w:sz="4" w:color="C9D4DF"/>
+              <w:right w:val="single" w:sz="4" w:color="C9D4DF"/>
+            </w:tcBorders>
+            <w:shd w:fill="E8EEF3"/>
+          </w:tcPr>
+          <w:p>
+            <w:pPr>
+              <w:spacing w:line="288" w:lineRule="auto" w:before="60" w:after="60"/>
+            </w:pPr>
+            <w:r>
+              <w:rPr>
+                <w:rFonts w:ascii="Times New Roman" w:hAnsi="Times New Roman" w:eastAsia="宋体"/>
+                <w:b/>
+                <w:color w:val="000000"/>
+                <w:sz w:val="21"/>
+              </w:rPr>
+              <w:t>加密</w:t>
+            </w:r>
+          </w:p>
+        </w:tc>
+        <w:tc>
+          <w:tcPr>
+            <w:tcW w:type="dxa" w:w="2494"/>
+            <w:tcBorders>
+              <w:top w:val="single" w:sz="4" w:color="C9D4DF"/>
+              <w:left w:val="single" w:sz="4" w:color="C9D4DF"/>
+              <w:bottom w:val="single" w:sz="4" w:color="C9D4DF"/>
+              <w:right w:val="single" w:sz="4" w:color="C9D4DF"/>
+            </w:tcBorders>
+            <w:shd w:fill="E8EEF3"/>
+          </w:tcPr>
+          <w:p>
+            <w:pPr>
+              <w:spacing w:line="288" w:lineRule="auto" w:before="60" w:after="60"/>
+            </w:pPr>
+            <w:r>
+              <w:rPr>
+                <w:rFonts w:ascii="Times New Roman" w:hAnsi="Times New Roman" w:eastAsia="宋体"/>
+                <w:b/>
+                <w:color w:val="000000"/>
+                <w:sz w:val="21"/>
+              </w:rPr>
+              <w:t>汇总</w:t>
+            </w:r>
+          </w:p>
+        </w:tc>
+        <w:tc>
+          <w:tcPr>
+            <w:tcW w:type="dxa" w:w="2494"/>
+            <w:tcBorders>
+              <w:top w:val="single" w:sz="4" w:color="C9D4DF"/>
+              <w:left w:val="single" w:sz="4" w:color="C9D4DF"/>
+              <w:bottom w:val="single" w:sz="4" w:color="C9D4DF"/>
+              <w:right w:val="single" w:sz="4" w:color="C9D4DF"/>
+            </w:tcBorders>
+            <w:shd w:fill="E8EEF3"/>
+          </w:tcPr>
+          <w:p>
+            <w:pPr>
+              <w:spacing w:line="288" w:lineRule="auto" w:before="60" w:after="60"/>
+            </w:pPr>
+            <w:r>
+              <w:rPr>
+                <w:rFonts w:ascii="Times New Roman" w:hAnsi="Times New Roman" w:eastAsia="宋体"/>
+                <w:b/>
+                <w:color w:val="000000"/>
+                <w:sz w:val="21"/>
+              </w:rPr>
+              <w:t>解密</w:t>
             </w:r>
           </w:p>
         </w:tc>
       </w:tr>
       <w:tr>
-        <w:trPr/>
-        <w:tc>
-          <w:tcPr>
-            <w:tcW w:type="dxa" w:w="1191"/>
-            <w:vAlign w:val="center"/>
-            <w:tcBorders>
-              <w:top w:val="single" w:sz="4" w:color="D9D9D9"/>
-              <w:left w:val="single" w:sz="4" w:color="D9D9D9"/>
-              <w:bottom w:val="single" w:sz="4" w:color="D9D9D9"/>
-              <w:right w:val="single" w:sz="4" w:color="D9D9D9"/>
-              <w:top w:val="single" w:sz="4" w:color="D9D9D9"/>
-              <w:left w:val="single" w:sz="4" w:color="D9D9D9"/>
-              <w:bottom w:val="single" w:sz="4" w:color="D9D9D9"/>
-              <w:right w:val="single" w:sz="4" w:color="D9D9D9"/>
-            </w:tcBorders>
-            <w:tcMar>
-              <w:top w:w="75" w:type="dxa"/>
-              <w:left w:w="75" w:type="dxa"/>
-              <w:bottom w:w="75" w:type="dxa"/>
-              <w:right w:w="75" w:type="dxa"/>
-            </w:tcMar>
-          </w:tcPr>
-          <w:p>
-            <w:pPr>
-              <w:keepNext/>
-              <w:spacing w:line="288" w:lineRule="auto" w:after="40" w:before="40"/>
+        <w:tc>
+          <w:tcPr>
+            <w:tcW w:type="dxa" w:w="1361"/>
+            <w:tcBorders>
+              <w:top w:val="single" w:sz="4" w:color="C9D4DF"/>
+              <w:left w:val="single" w:sz="4" w:color="C9D4DF"/>
+              <w:bottom w:val="single" w:sz="4" w:color="C9D4DF"/>
+              <w:right w:val="single" w:sz="4" w:color="C9D4DF"/>
+            </w:tcBorders>
+          </w:tcPr>
+          <w:p>
+            <w:pPr>
+              <w:spacing w:line="288" w:lineRule="auto" w:before="60" w:after="60"/>
             </w:pPr>
             <w:r>
               <w:rPr>
@@ -4522,29 +3909,17 @@
         </w:tc>
         <w:tc>
           <w:tcPr>
-            <w:tcW w:type="dxa" w:w="2665"/>
-            <w:vAlign w:val="center"/>
-            <w:tcBorders>
-              <w:top w:val="single" w:sz="4" w:color="D9D9D9"/>
-              <w:left w:val="single" w:sz="4" w:color="D9D9D9"/>
-              <w:bottom w:val="single" w:sz="4" w:color="D9D9D9"/>
-              <w:right w:val="single" w:sz="4" w:color="D9D9D9"/>
-              <w:top w:val="single" w:sz="4" w:color="D9D9D9"/>
-              <w:left w:val="single" w:sz="4" w:color="D9D9D9"/>
-              <w:bottom w:val="single" w:sz="4" w:color="D9D9D9"/>
-              <w:right w:val="single" w:sz="4" w:color="D9D9D9"/>
-            </w:tcBorders>
-            <w:tcMar>
-              <w:top w:w="75" w:type="dxa"/>
-              <w:left w:w="75" w:type="dxa"/>
-              <w:bottom w:w="75" w:type="dxa"/>
-              <w:right w:w="75" w:type="dxa"/>
-            </w:tcMar>
-          </w:tcPr>
-          <w:p>
-            <w:pPr>
-              <w:keepNext/>
-              <w:spacing w:line="288" w:lineRule="auto" w:after="40" w:before="40"/>
+            <w:tcW w:type="dxa" w:w="2494"/>
+            <w:tcBorders>
+              <w:top w:val="single" w:sz="4" w:color="C9D4DF"/>
+              <w:left w:val="single" w:sz="4" w:color="C9D4DF"/>
+              <w:bottom w:val="single" w:sz="4" w:color="C9D4DF"/>
+              <w:right w:val="single" w:sz="4" w:color="C9D4DF"/>
+            </w:tcBorders>
+          </w:tcPr>
+          <w:p>
+            <w:pPr>
+              <w:spacing w:line="288" w:lineRule="auto" w:before="60" w:after="60"/>
             </w:pPr>
             <w:r>
               <w:rPr>
@@ -4559,29 +3934,17 @@
         </w:tc>
         <w:tc>
           <w:tcPr>
-            <w:tcW w:type="dxa" w:w="2665"/>
-            <w:vAlign w:val="center"/>
-            <w:tcBorders>
-              <w:top w:val="single" w:sz="4" w:color="D9D9D9"/>
-              <w:left w:val="single" w:sz="4" w:color="D9D9D9"/>
-              <w:bottom w:val="single" w:sz="4" w:color="D9D9D9"/>
-              <w:right w:val="single" w:sz="4" w:color="D9D9D9"/>
-              <w:top w:val="single" w:sz="4" w:color="D9D9D9"/>
-              <w:left w:val="single" w:sz="4" w:color="D9D9D9"/>
-              <w:bottom w:val="single" w:sz="4" w:color="D9D9D9"/>
-              <w:right w:val="single" w:sz="4" w:color="D9D9D9"/>
-            </w:tcBorders>
-            <w:tcMar>
-              <w:top w:w="75" w:type="dxa"/>
-              <w:left w:w="75" w:type="dxa"/>
-              <w:bottom w:w="75" w:type="dxa"/>
-              <w:right w:w="75" w:type="dxa"/>
-            </w:tcMar>
-          </w:tcPr>
-          <w:p>
-            <w:pPr>
-              <w:keepNext/>
-              <w:spacing w:line="288" w:lineRule="auto" w:after="40" w:before="40"/>
+            <w:tcW w:type="dxa" w:w="2494"/>
+            <w:tcBorders>
+              <w:top w:val="single" w:sz="4" w:color="C9D4DF"/>
+              <w:left w:val="single" w:sz="4" w:color="C9D4DF"/>
+              <w:bottom w:val="single" w:sz="4" w:color="C9D4DF"/>
+              <w:right w:val="single" w:sz="4" w:color="C9D4DF"/>
+            </w:tcBorders>
+          </w:tcPr>
+          <w:p>
+            <w:pPr>
+              <w:spacing w:line="288" w:lineRule="auto" w:before="60" w:after="60"/>
             </w:pPr>
             <w:r>
               <w:rPr>
@@ -4596,29 +3959,17 @@
         </w:tc>
         <w:tc>
           <w:tcPr>
-            <w:tcW w:type="dxa" w:w="2665"/>
-            <w:vAlign w:val="center"/>
-            <w:tcBorders>
-              <w:top w:val="single" w:sz="4" w:color="D9D9D9"/>
-              <w:left w:val="single" w:sz="4" w:color="D9D9D9"/>
-              <w:bottom w:val="single" w:sz="4" w:color="D9D9D9"/>
-              <w:right w:val="single" w:sz="4" w:color="D9D9D9"/>
-              <w:top w:val="single" w:sz="4" w:color="D9D9D9"/>
-              <w:left w:val="single" w:sz="4" w:color="D9D9D9"/>
-              <w:bottom w:val="single" w:sz="4" w:color="D9D9D9"/>
-              <w:right w:val="single" w:sz="4" w:color="D9D9D9"/>
-            </w:tcBorders>
-            <w:tcMar>
-              <w:top w:w="75" w:type="dxa"/>
-              <w:left w:w="75" w:type="dxa"/>
-              <w:bottom w:w="75" w:type="dxa"/>
-              <w:right w:w="75" w:type="dxa"/>
-            </w:tcMar>
-          </w:tcPr>
-          <w:p>
-            <w:pPr>
-              <w:keepNext/>
-              <w:spacing w:line="288" w:lineRule="auto" w:after="40" w:before="40"/>
+            <w:tcW w:type="dxa" w:w="2494"/>
+            <w:tcBorders>
+              <w:top w:val="single" w:sz="4" w:color="C9D4DF"/>
+              <w:left w:val="single" w:sz="4" w:color="C9D4DF"/>
+              <w:bottom w:val="single" w:sz="4" w:color="C9D4DF"/>
+              <w:right w:val="single" w:sz="4" w:color="C9D4DF"/>
+            </w:tcBorders>
+          </w:tcPr>
+          <w:p>
+            <w:pPr>
+              <w:spacing w:line="288" w:lineRule="auto" w:before="60" w:after="60"/>
             </w:pPr>
             <w:r>
               <w:rPr>
@@ -4633,32 +3984,19 @@
         </w:tc>
       </w:tr>
       <w:tr>
-        <w:trPr/>
-        <w:tc>
-          <w:tcPr>
-            <w:tcW w:type="dxa" w:w="1191"/>
-            <w:vAlign w:val="center"/>
-            <w:tcBorders>
-              <w:top w:val="single" w:sz="4" w:color="D9D9D9"/>
-              <w:left w:val="single" w:sz="4" w:color="D9D9D9"/>
-              <w:bottom w:val="single" w:sz="4" w:color="D9D9D9"/>
-              <w:right w:val="single" w:sz="4" w:color="D9D9D9"/>
-              <w:top w:val="single" w:sz="4" w:color="D9D9D9"/>
-              <w:left w:val="single" w:sz="4" w:color="D9D9D9"/>
-              <w:bottom w:val="single" w:sz="4" w:color="D9D9D9"/>
-              <w:right w:val="single" w:sz="4" w:color="D9D9D9"/>
-            </w:tcBorders>
-            <w:tcMar>
-              <w:top w:w="75" w:type="dxa"/>
-              <w:left w:w="75" w:type="dxa"/>
-              <w:bottom w:w="75" w:type="dxa"/>
-              <w:right w:w="75" w:type="dxa"/>
-            </w:tcMar>
-          </w:tcPr>
-          <w:p>
-            <w:pPr>
-              <w:keepNext/>
-              <w:spacing w:line="288" w:lineRule="auto" w:after="40" w:before="40"/>
+        <w:tc>
+          <w:tcPr>
+            <w:tcW w:type="dxa" w:w="1361"/>
+            <w:tcBorders>
+              <w:top w:val="single" w:sz="4" w:color="C9D4DF"/>
+              <w:left w:val="single" w:sz="4" w:color="C9D4DF"/>
+              <w:bottom w:val="single" w:sz="4" w:color="C9D4DF"/>
+              <w:right w:val="single" w:sz="4" w:color="C9D4DF"/>
+            </w:tcBorders>
+          </w:tcPr>
+          <w:p>
+            <w:pPr>
+              <w:spacing w:line="288" w:lineRule="auto" w:before="60" w:after="60"/>
             </w:pPr>
             <w:r>
               <w:rPr>
@@ -4673,29 +4011,17 @@
         </w:tc>
         <w:tc>
           <w:tcPr>
-            <w:tcW w:type="dxa" w:w="2665"/>
-            <w:vAlign w:val="center"/>
-            <w:tcBorders>
-              <w:top w:val="single" w:sz="4" w:color="D9D9D9"/>
-              <w:left w:val="single" w:sz="4" w:color="D9D9D9"/>
-              <w:bottom w:val="single" w:sz="4" w:color="D9D9D9"/>
-              <w:right w:val="single" w:sz="4" w:color="D9D9D9"/>
-              <w:top w:val="single" w:sz="4" w:color="D9D9D9"/>
-              <w:left w:val="single" w:sz="4" w:color="D9D9D9"/>
-              <w:bottom w:val="single" w:sz="4" w:color="D9D9D9"/>
-              <w:right w:val="single" w:sz="4" w:color="D9D9D9"/>
-            </w:tcBorders>
-            <w:tcMar>
-              <w:top w:w="75" w:type="dxa"/>
-              <w:left w:w="75" w:type="dxa"/>
-              <w:bottom w:w="75" w:type="dxa"/>
-              <w:right w:w="75" w:type="dxa"/>
-            </w:tcMar>
-          </w:tcPr>
-          <w:p>
-            <w:pPr>
-              <w:keepNext/>
-              <w:spacing w:line="288" w:lineRule="auto" w:after="40" w:before="40"/>
+            <w:tcW w:type="dxa" w:w="2494"/>
+            <w:tcBorders>
+              <w:top w:val="single" w:sz="4" w:color="C9D4DF"/>
+              <w:left w:val="single" w:sz="4" w:color="C9D4DF"/>
+              <w:bottom w:val="single" w:sz="4" w:color="C9D4DF"/>
+              <w:right w:val="single" w:sz="4" w:color="C9D4DF"/>
+            </w:tcBorders>
+          </w:tcPr>
+          <w:p>
+            <w:pPr>
+              <w:spacing w:line="288" w:lineRule="auto" w:before="60" w:after="60"/>
             </w:pPr>
             <w:r>
               <w:rPr>
@@ -4710,29 +4036,17 @@
         </w:tc>
         <w:tc>
           <w:tcPr>
-            <w:tcW w:type="dxa" w:w="2665"/>
-            <w:vAlign w:val="center"/>
-            <w:tcBorders>
-              <w:top w:val="single" w:sz="4" w:color="D9D9D9"/>
-              <w:left w:val="single" w:sz="4" w:color="D9D9D9"/>
-              <w:bottom w:val="single" w:sz="4" w:color="D9D9D9"/>
-              <w:right w:val="single" w:sz="4" w:color="D9D9D9"/>
-              <w:top w:val="single" w:sz="4" w:color="D9D9D9"/>
-              <w:left w:val="single" w:sz="4" w:color="D9D9D9"/>
-              <w:bottom w:val="single" w:sz="4" w:color="D9D9D9"/>
-              <w:right w:val="single" w:sz="4" w:color="D9D9D9"/>
-            </w:tcBorders>
-            <w:tcMar>
-              <w:top w:w="75" w:type="dxa"/>
-              <w:left w:w="75" w:type="dxa"/>
-              <w:bottom w:w="75" w:type="dxa"/>
-              <w:right w:w="75" w:type="dxa"/>
-            </w:tcMar>
-          </w:tcPr>
-          <w:p>
-            <w:pPr>
-              <w:keepNext/>
-              <w:spacing w:line="288" w:lineRule="auto" w:after="40" w:before="40"/>
+            <w:tcW w:type="dxa" w:w="2494"/>
+            <w:tcBorders>
+              <w:top w:val="single" w:sz="4" w:color="C9D4DF"/>
+              <w:left w:val="single" w:sz="4" w:color="C9D4DF"/>
+              <w:bottom w:val="single" w:sz="4" w:color="C9D4DF"/>
+              <w:right w:val="single" w:sz="4" w:color="C9D4DF"/>
+            </w:tcBorders>
+          </w:tcPr>
+          <w:p>
+            <w:pPr>
+              <w:spacing w:line="288" w:lineRule="auto" w:before="60" w:after="60"/>
             </w:pPr>
             <w:r>
               <w:rPr>
@@ -4747,29 +4061,17 @@
         </w:tc>
         <w:tc>
           <w:tcPr>
-            <w:tcW w:type="dxa" w:w="2665"/>
-            <w:vAlign w:val="center"/>
-            <w:tcBorders>
-              <w:top w:val="single" w:sz="4" w:color="D9D9D9"/>
-              <w:left w:val="single" w:sz="4" w:color="D9D9D9"/>
-              <w:bottom w:val="single" w:sz="4" w:color="D9D9D9"/>
-              <w:right w:val="single" w:sz="4" w:color="D9D9D9"/>
-              <w:top w:val="single" w:sz="4" w:color="D9D9D9"/>
-              <w:left w:val="single" w:sz="4" w:color="D9D9D9"/>
-              <w:bottom w:val="single" w:sz="4" w:color="D9D9D9"/>
-              <w:right w:val="single" w:sz="4" w:color="D9D9D9"/>
-            </w:tcBorders>
-            <w:tcMar>
-              <w:top w:w="75" w:type="dxa"/>
-              <w:left w:w="75" w:type="dxa"/>
-              <w:bottom w:w="75" w:type="dxa"/>
-              <w:right w:w="75" w:type="dxa"/>
-            </w:tcMar>
-          </w:tcPr>
-          <w:p>
-            <w:pPr>
-              <w:keepNext/>
-              <w:spacing w:line="288" w:lineRule="auto" w:after="40" w:before="40"/>
+            <w:tcW w:type="dxa" w:w="2494"/>
+            <w:tcBorders>
+              <w:top w:val="single" w:sz="4" w:color="C9D4DF"/>
+              <w:left w:val="single" w:sz="4" w:color="C9D4DF"/>
+              <w:bottom w:val="single" w:sz="4" w:color="C9D4DF"/>
+              <w:right w:val="single" w:sz="4" w:color="C9D4DF"/>
+            </w:tcBorders>
+          </w:tcPr>
+          <w:p>
+            <w:pPr>
+              <w:spacing w:line="288" w:lineRule="auto" w:before="60" w:after="60"/>
             </w:pPr>
             <w:r>
               <w:rPr>
@@ -4784,32 +4086,19 @@
         </w:tc>
       </w:tr>
       <w:tr>
-        <w:trPr/>
-        <w:tc>
-          <w:tcPr>
-            <w:tcW w:type="dxa" w:w="1191"/>
-            <w:vAlign w:val="center"/>
-            <w:tcBorders>
-              <w:top w:val="single" w:sz="4" w:color="D9D9D9"/>
-              <w:left w:val="single" w:sz="4" w:color="D9D9D9"/>
-              <w:bottom w:val="single" w:sz="4" w:color="D9D9D9"/>
-              <w:right w:val="single" w:sz="4" w:color="D9D9D9"/>
-              <w:top w:val="single" w:sz="4" w:color="D9D9D9"/>
-              <w:left w:val="single" w:sz="4" w:color="D9D9D9"/>
-              <w:bottom w:val="single" w:sz="4" w:color="D9D9D9"/>
-              <w:right w:val="single" w:sz="4" w:color="D9D9D9"/>
-            </w:tcBorders>
-            <w:tcMar>
-              <w:top w:w="75" w:type="dxa"/>
-              <w:left w:w="75" w:type="dxa"/>
-              <w:bottom w:w="75" w:type="dxa"/>
-              <w:right w:w="75" w:type="dxa"/>
-            </w:tcMar>
-          </w:tcPr>
-          <w:p>
-            <w:pPr>
-              <w:keepNext w:val="0"/>
-              <w:spacing w:line="288" w:lineRule="auto" w:after="40" w:before="40"/>
+        <w:tc>
+          <w:tcPr>
+            <w:tcW w:type="dxa" w:w="1361"/>
+            <w:tcBorders>
+              <w:top w:val="single" w:sz="4" w:color="C9D4DF"/>
+              <w:left w:val="single" w:sz="4" w:color="C9D4DF"/>
+              <w:bottom w:val="single" w:sz="4" w:color="C9D4DF"/>
+              <w:right w:val="single" w:sz="4" w:color="C9D4DF"/>
+            </w:tcBorders>
+          </w:tcPr>
+          <w:p>
+            <w:pPr>
+              <w:spacing w:line="288" w:lineRule="auto" w:before="60" w:after="60"/>
             </w:pPr>
             <w:r>
               <w:rPr>
@@ -4824,29 +4113,17 @@
         </w:tc>
         <w:tc>
           <w:tcPr>
-            <w:tcW w:type="dxa" w:w="2665"/>
-            <w:vAlign w:val="center"/>
-            <w:tcBorders>
-              <w:top w:val="single" w:sz="4" w:color="D9D9D9"/>
-              <w:left w:val="single" w:sz="4" w:color="D9D9D9"/>
-              <w:bottom w:val="single" w:sz="4" w:color="D9D9D9"/>
-              <w:right w:val="single" w:sz="4" w:color="D9D9D9"/>
-              <w:top w:val="single" w:sz="4" w:color="D9D9D9"/>
-              <w:left w:val="single" w:sz="4" w:color="D9D9D9"/>
-              <w:bottom w:val="single" w:sz="4" w:color="D9D9D9"/>
-              <w:right w:val="single" w:sz="4" w:color="D9D9D9"/>
-            </w:tcBorders>
-            <w:tcMar>
-              <w:top w:w="75" w:type="dxa"/>
-              <w:left w:w="75" w:type="dxa"/>
-              <w:bottom w:w="75" w:type="dxa"/>
-              <w:right w:w="75" w:type="dxa"/>
-            </w:tcMar>
-          </w:tcPr>
-          <w:p>
-            <w:pPr>
-              <w:keepNext w:val="0"/>
-              <w:spacing w:line="288" w:lineRule="auto" w:after="40" w:before="40"/>
+            <w:tcW w:type="dxa" w:w="2494"/>
+            <w:tcBorders>
+              <w:top w:val="single" w:sz="4" w:color="C9D4DF"/>
+              <w:left w:val="single" w:sz="4" w:color="C9D4DF"/>
+              <w:bottom w:val="single" w:sz="4" w:color="C9D4DF"/>
+              <w:right w:val="single" w:sz="4" w:color="C9D4DF"/>
+            </w:tcBorders>
+          </w:tcPr>
+          <w:p>
+            <w:pPr>
+              <w:spacing w:line="288" w:lineRule="auto" w:before="60" w:after="60"/>
             </w:pPr>
             <w:r>
               <w:rPr>
@@ -4861,29 +4138,17 @@
         </w:tc>
         <w:tc>
           <w:tcPr>
-            <w:tcW w:type="dxa" w:w="2665"/>
-            <w:vAlign w:val="center"/>
-            <w:tcBorders>
-              <w:top w:val="single" w:sz="4" w:color="D9D9D9"/>
-              <w:left w:val="single" w:sz="4" w:color="D9D9D9"/>
-              <w:bottom w:val="single" w:sz="4" w:color="D9D9D9"/>
-              <w:right w:val="single" w:sz="4" w:color="D9D9D9"/>
-              <w:top w:val="single" w:sz="4" w:color="D9D9D9"/>
-              <w:left w:val="single" w:sz="4" w:color="D9D9D9"/>
-              <w:bottom w:val="single" w:sz="4" w:color="D9D9D9"/>
-              <w:right w:val="single" w:sz="4" w:color="D9D9D9"/>
-            </w:tcBorders>
-            <w:tcMar>
-              <w:top w:w="75" w:type="dxa"/>
-              <w:left w:w="75" w:type="dxa"/>
-              <w:bottom w:w="75" w:type="dxa"/>
-              <w:right w:w="75" w:type="dxa"/>
-            </w:tcMar>
-          </w:tcPr>
-          <w:p>
-            <w:pPr>
-              <w:keepNext w:val="0"/>
-              <w:spacing w:line="288" w:lineRule="auto" w:after="40" w:before="40"/>
+            <w:tcW w:type="dxa" w:w="2494"/>
+            <w:tcBorders>
+              <w:top w:val="single" w:sz="4" w:color="C9D4DF"/>
+              <w:left w:val="single" w:sz="4" w:color="C9D4DF"/>
+              <w:bottom w:val="single" w:sz="4" w:color="C9D4DF"/>
+              <w:right w:val="single" w:sz="4" w:color="C9D4DF"/>
+            </w:tcBorders>
+          </w:tcPr>
+          <w:p>
+            <w:pPr>
+              <w:spacing w:line="288" w:lineRule="auto" w:before="60" w:after="60"/>
             </w:pPr>
             <w:r>
               <w:rPr>
@@ -4898,29 +4163,17 @@
         </w:tc>
         <w:tc>
           <w:tcPr>
-            <w:tcW w:type="dxa" w:w="2665"/>
-            <w:vAlign w:val="center"/>
-            <w:tcBorders>
-              <w:top w:val="single" w:sz="4" w:color="D9D9D9"/>
-              <w:left w:val="single" w:sz="4" w:color="D9D9D9"/>
-              <w:bottom w:val="single" w:sz="4" w:color="D9D9D9"/>
-              <w:right w:val="single" w:sz="4" w:color="D9D9D9"/>
-              <w:top w:val="single" w:sz="4" w:color="D9D9D9"/>
-              <w:left w:val="single" w:sz="4" w:color="D9D9D9"/>
-              <w:bottom w:val="single" w:sz="4" w:color="D9D9D9"/>
-              <w:right w:val="single" w:sz="4" w:color="D9D9D9"/>
-            </w:tcBorders>
-            <w:tcMar>
-              <w:top w:w="75" w:type="dxa"/>
-              <w:left w:w="75" w:type="dxa"/>
-              <w:bottom w:w="75" w:type="dxa"/>
-              <w:right w:w="75" w:type="dxa"/>
-            </w:tcMar>
-          </w:tcPr>
-          <w:p>
-            <w:pPr>
-              <w:keepNext w:val="0"/>
-              <w:spacing w:line="288" w:lineRule="auto" w:after="40" w:before="40"/>
+            <w:tcW w:type="dxa" w:w="2494"/>
+            <w:tcBorders>
+              <w:top w:val="single" w:sz="4" w:color="C9D4DF"/>
+              <w:left w:val="single" w:sz="4" w:color="C9D4DF"/>
+              <w:bottom w:val="single" w:sz="4" w:color="C9D4DF"/>
+              <w:right w:val="single" w:sz="4" w:color="C9D4DF"/>
+            </w:tcBorders>
+          </w:tcPr>
+          <w:p>
+            <w:pPr>
+              <w:spacing w:line="288" w:lineRule="auto" w:before="60" w:after="60"/>
             </w:pPr>
             <w:r>
               <w:rPr>
@@ -4940,7 +4193,15 @@
         <w:pStyle w:val="ReportBody"/>
       </w:pPr>
       <w:r>
-        <w:t>计时仅覆盖Paillier原语，不包括文件、签名、口令派生、进程及GUI；界面耗时则来自当前轮次的实际审计和解密端复算，二者口径不同。测试期间计算机有其他任务，三次原始记录保存在JSON中，均值不能当作部署保证。</w:t>
+        <w:t>表4来自本次架构修正前保留的完整原语实验evidence/2026-10-27/full/，仅作规模对照。它不包含联网、事务和TLS开销，也不是重新执行的联网千人测试；原始运行环境和哈希在其JSON中保留。</w:t>
+      </w:r>
+    </w:p>
+    <w:p>
+      <w:pPr>
+        <w:pStyle w:val="ReportH2"/>
+      </w:pPr>
+      <w:r>
+        <w:t>5.4 失败、误报与安全局限</w:t>
       </w:r>
     </w:p>
     <w:p>
@@ -4948,13 +4209,31 @@
         <w:pStyle w:val="ReportBody"/>
       </w:pPr>
       <w:r>
-        <w:rPr>
-          <w:rFonts w:ascii="Times New Roman" w:hAnsi="Times New Roman" w:eastAsia="宋体"/>
-          <w:b w:val="0"/>
-          <w:color w:val="000000"/>
-          <w:sz w:val="24"/>
-        </w:rPr>
-        <w:t>固定选项数时，汇总需要人数乘以选项数次模乘，人数增长会增加汇总时间；解密只对最终3个密文执行，因此人数增加时解密工作量基本不变。实测中解密时间有操作系统调度和后台负载波动，不能把单次波动解释为算法复杂度改变。</w:t>
+        <w:t>文件损坏、网络断开、错误凭证与攻击可能出现相似提示，程序只报告可验证的失败原因。数据库内容与签名不一致时拒绝继续；连接中断时通过回执确认是否已接收，而不是直接重新计票。首次打包复测发现Windows重定向输出使用GBK，已统一管道输出UTF-8，再通过实际EXE进程验证。</w:t>
+      </w:r>
+    </w:p>
+    <w:p>
+      <w:pPr>
+        <w:pStyle w:val="ReportBody"/>
+      </w:pPr>
+      <w:r>
+        <w:t>未实现逐票独热零知识证明，[2,0]与[0,0]等非法组合可能仍满足总票数约束。单人结果会暴露选择。一次批准只限制同轮重复解密不同集合；若恶意服务器重新签署删票集合，首次集合是否完整仍需独立回执或外部见证，不能只靠服务器自己的签名。</w:t>
+      </w:r>
+    </w:p>
+    <w:p>
+      <w:pPr>
+        <w:pStyle w:val="ReportH1"/>
+      </w:pPr>
+      <w:r>
+        <w:t>六、总结</w:t>
+      </w:r>
+    </w:p>
+    <w:p>
+      <w:pPr>
+        <w:pStyle w:val="ReportBody"/>
+      </w:pPr>
+      <w:r>
+        <w:t>本模块形成了服务器无私钥计算、保管端独立核验、客户端验证签名结果的完整路径。计算正确性通过已知票数及重算确认；保管者可信、首次集合完整性与单人结果隐私仍是边界。</w:t>
       </w:r>
     </w:p>
     <w:p>
@@ -4962,7 +4241,7 @@
         <w:pStyle w:val="ReportH2"/>
       </w:pPr>
       <w:r>
-        <w:t>5.4 准确性与可重复性</w:t>
+        <w:t>6.1 威胁模型与后续改进</w:t>
       </w:r>
     </w:p>
     <w:p>
@@ -4970,7 +4249,7 @@
         <w:pStyle w:val="ReportBody"/>
       </w:pPr>
       <w:r>
-        <w:t>基准6票序列[0,1,0,2,0,1]得到[3,2,1]；2、4、8选项各投一票均得到全1向量，零票返回全0。原生Qt测试记录在evidence/2026-10-27/ui/，验证6次控件投票、子进程计票和两种审计演示。图2采用本轮实际截图。</w:t>
+        <w:t>主要模型是服务器按协议收票与汇总、但可能试图了解个人选择；在Paillier私钥留在可信保管端、客户端可信的条件下，服务器无法直接解密单票。该模型不覆盖客户端中毒、私钥泄露、组织者错误分发凭证或服务器与保管者串通。后续可增加独热证明、门限解密、独立透明日志、凭证撤销与抗拒绝服务措施。</w:t>
       </w:r>
     </w:p>
     <w:p>
@@ -4978,7 +4257,7 @@
         <w:pStyle w:val="ReportH2"/>
       </w:pPr>
       <w:r>
-        <w:t>5.5 本轮发现的问题与处理</w:t>
+        <w:t>6.2 分工验收与个人复核</w:t>
       </w:r>
     </w:p>
     <w:p>
@@ -4986,21 +4265,7 @@
         <w:pStyle w:val="ReportBody"/>
       </w:pPr>
       <w:r>
-        <w:t>审查时发现，解密端虽然重新计算了完整汇总，却把请求内的audit_ms和aggregate_ms直接写入结果。调用者可传入负值污染性能记录。修复后结果改取expected中的复算耗时；回归测试用-999作为请求耗时，最终票数仍为[1,0]且返回耗时均为非负。</w:t>
-      </w:r>
-    </w:p>
-    <w:p>
-      <w:pPr>
-        <w:pStyle w:val="ReportH1"/>
-      </w:pPr>
-      <w:r>
-        <w:rPr>
-          <w:rFonts w:ascii="Times New Roman" w:hAnsi="Times New Roman" w:eastAsia="宋体"/>
-          <w:b/>
-          <w:color w:val="000000"/>
-          <w:sz w:val="28"/>
-        </w:rPr>
-        <w:t>六、总结</w:t>
+        <w:t>服务器怎样在没有私钥时得到密文总票？为什么聚合初值为1？为什么关闭前不提供阶段总票？一次批准记录能防止什么，为什么仍需要外部回执或见证？</w:t>
       </w:r>
     </w:p>
     <w:p>
@@ -5008,13 +4273,7 @@
         <w:pStyle w:val="ReportBody"/>
       </w:pPr>
       <w:r>
-        <w:rPr>
-          <w:rFonts w:ascii="Times New Roman" w:hAnsi="Times New Roman" w:eastAsia="宋体"/>
-          <w:b w:val="0"/>
-          <w:color w:val="000000"/>
-          <w:sz w:val="24"/>
-        </w:rPr>
-        <w:t>本模块验证了“计票端无私钥、按列汇总、仅返回总票”的操作流程。测量结果支持将较高的公钥加密成本放在投票端、将较轻的乘法汇总放在计票端。工程上的独立进程不是密码学上的门限解密，后续可以研究多方私钥分片。</w:t>
+        <w:t>成员应在自己的电脑复跑相关实验，补全姓名学号、实际贡献与本人修改记录，并现场解释代码、完成教师要求的小改。当前分工是模块划分，不代替个人完成证明。</w:t>
       </w:r>
     </w:p>
     <w:p>
@@ -5022,13 +4281,7 @@
         <w:pStyle w:val="ReportH2"/>
       </w:pPr>
       <w:r>
-        <w:rPr>
-          <w:rFonts w:ascii="Times New Roman" w:hAnsi="Times New Roman" w:eastAsia="宋体"/>
-          <w:b/>
-          <w:color w:val="000000"/>
-          <w:sz w:val="24"/>
-        </w:rPr>
-        <w:t>6.1 安全局限与后续改进</w:t>
+        <w:t>6.3 AI使用声明</w:t>
       </w:r>
     </w:p>
     <w:p>
@@ -5036,13 +4289,7 @@
         <w:pStyle w:val="ReportBody"/>
       </w:pPr>
       <w:r>
-        <w:rPr>
-          <w:rFonts w:ascii="Times New Roman" w:hAnsi="Times New Roman" w:eastAsia="宋体"/>
-          <w:b w:val="0"/>
-          <w:color w:val="000000"/>
-          <w:sz w:val="24"/>
-        </w:rPr>
-        <w:t>系统未实现零知识证明、门限解密、证书认证及完整状态回滚保护。名单ID不是身份认证；私钥持有者能在程序之外解密单票；小群体结果可能暴露个体偏好。签名验证依赖最初可信配置，攻击者若同时替换所有配置、密钥与历史数据，本地应用无法自行建立原始信任。单文件原子写入不等于跨文件事务，当前只支持单机单写入者。</w:t>
+        <w:t>本项目使用OpenAI Codex辅助需求对照、代码与界面实现、联网架构修正、测试执行、报告修订及Git提交。测试数据来自实际运行的合成选票，AI参与范围详见根目录AI使用声明.txt；教师评分、签名和个人复核记录由实际参与者填写。</w:t>
       </w:r>
     </w:p>
     <w:p>
@@ -5050,104 +4297,6 @@
         <w:pStyle w:val="ReportH2"/>
       </w:pPr>
       <w:r>
-        <w:rPr>
-          <w:rFonts w:ascii="Times New Roman" w:hAnsi="Times New Roman" w:eastAsia="宋体"/>
-          <w:b/>
-          <w:color w:val="000000"/>
-          <w:sz w:val="24"/>
-        </w:rPr>
-        <w:t>6.2 分工验收与口试准备</w:t>
-      </w:r>
-    </w:p>
-    <w:p>
-      <w:pPr>
-        <w:pStyle w:val="ReportBody"/>
-      </w:pPr>
-      <w:r>
-        <w:rPr>
-          <w:rFonts w:ascii="Times New Roman" w:hAnsi="Times New Roman" w:eastAsia="宋体"/>
-          <w:b w:val="0"/>
-          <w:color w:val="000000"/>
-          <w:sz w:val="24"/>
-        </w:rPr>
-        <w:t>为什么乘密文得到加票数？g的指数相加，随机因子也相乘。</w:t>
-      </w:r>
-    </w:p>
-    <w:p>
-      <w:pPr>
-        <w:pStyle w:val="ReportBody"/>
-      </w:pPr>
-      <w:r>
-        <w:rPr>
-          <w:rFonts w:ascii="Times New Roman" w:hAnsi="Times New Roman" w:eastAsia="宋体"/>
-          <w:b w:val="0"/>
-          <w:color w:val="000000"/>
-          <w:sz w:val="24"/>
-        </w:rPr>
-        <w:t>零票为什么可以输出0？累积元1解密为0。</w:t>
-      </w:r>
-    </w:p>
-    <w:p>
-      <w:pPr>
-        <w:pStyle w:val="ReportBody"/>
-      </w:pPr>
-      <w:r>
-        <w:rPr>
-          <w:rFonts w:ascii="Times New Roman" w:hAnsi="Times New Roman" w:eastAsia="宋体"/>
-          <w:b w:val="0"/>
-          <w:color w:val="000000"/>
-          <w:sz w:val="24"/>
-        </w:rPr>
-        <w:t>为什么拒绝任意解密请求？防止把私钥端当作单票解密查询服务。</w:t>
-      </w:r>
-    </w:p>
-    <w:p>
-      <w:pPr>
-        <w:pStyle w:val="ReportBody"/>
-      </w:pPr>
-      <w:r>
-        <w:rPr>
-          <w:rFonts w:ascii="Times New Roman" w:hAnsi="Times New Roman" w:eastAsia="宋体"/>
-          <w:b w:val="0"/>
-          <w:color w:val="000000"/>
-          <w:sz w:val="24"/>
-        </w:rPr>
-        <w:t>个人验收建议：在自己电脑上重新运行本模块实验，保存截图和测试记录；现场修改一个参数或校验条件，说明修改影响；根据真实参与情况补全姓名、学号与个人总结。</w:t>
-      </w:r>
-    </w:p>
-    <w:p>
-      <w:pPr>
-        <w:pStyle w:val="ReportH2"/>
-      </w:pPr>
-      <w:r>
-        <w:rPr>
-          <w:rFonts w:ascii="Times New Roman" w:hAnsi="Times New Roman" w:eastAsia="宋体"/>
-          <w:b/>
-          <w:color w:val="000000"/>
-          <w:sz w:val="24"/>
-        </w:rPr>
-        <w:t>6.3 AI使用声明</w:t>
-      </w:r>
-    </w:p>
-    <w:p>
-      <w:pPr>
-        <w:pStyle w:val="ReportBody"/>
-      </w:pPr>
-      <w:r>
-        <w:t>本次使用OpenAI Codex辅助审查代码、修订报告、执行实验和拆分Git提交。初稿与本轮修改均有仓库记录，AI参与范围详见根目录AI使用声明.txt。A/B/C为模块责任标识，学生需据真实贡献补全个人信息和复核记录，并独立解释代码。</w:t>
-      </w:r>
-    </w:p>
-    <w:p>
-      <w:pPr>
-        <w:pStyle w:val="ReportH2"/>
-      </w:pPr>
-      <w:r>
-        <w:rPr>
-          <w:rFonts w:ascii="Times New Roman" w:hAnsi="Times New Roman" w:eastAsia="宋体"/>
-          <w:b/>
-          <w:color w:val="000000"/>
-          <w:sz w:val="24"/>
-        </w:rPr>
         <w:t>参考资料</w:t>
       </w:r>
     </w:p>
@@ -5165,7 +4314,7 @@
           <w:color w:val="000000"/>
           <w:sz w:val="21"/>
         </w:rPr>
-        <w:t>[1] 专业课程设计任务书 B230414 2026—2027第一学期。</w:t>
+        <w:t>[1] 专业课程设计任务书，B230414，2026—2027学年第一学期。</w:t>
       </w:r>
     </w:p>
     <w:p>
@@ -5182,7 +4331,7 @@
           <w:color w:val="000000"/>
           <w:sz w:val="21"/>
         </w:rPr>
-        <w:t>[2] python-paillier API Documentation. https://python-paillier.readthedocs.io/en/stable/phe.html</w:t>
+        <w:t>[2] python-paillier API. https://python-paillier.readthedocs.io/en/stable/phe.html</w:t>
       </w:r>
     </w:p>
     <w:p>
@@ -5199,7 +4348,7 @@
           <w:color w:val="000000"/>
           <w:sz w:val="21"/>
         </w:rPr>
-        <w:t>[3] Cryptography Ed25519 signing. https://cryptography.io/en/latest/hazmat/primitives/asymmetric/ed25519/</w:t>
+        <w:t>[3] Cryptography Ed25519. https://cryptography.io/en/latest/hazmat/primitives/asymmetric/ed25519/</w:t>
       </w:r>
     </w:p>
     <w:p>
@@ -5216,7 +4365,24 @@
           <w:color w:val="000000"/>
           <w:sz w:val="21"/>
         </w:rPr>
-        <w:t>[4] PyInstaller Using PyInstaller. https://pyinstaller.org/en/stable/usage.html</w:t>
+        <w:t>[4] Python sqlite3. https://docs.python.org/3/library/sqlite3.html</w:t>
+      </w:r>
+    </w:p>
+    <w:p>
+      <w:pPr>
+        <w:pStyle w:val="ReportBody"/>
+        <w:spacing w:line="288" w:lineRule="auto"/>
+        <w:ind w:firstLine="0"/>
+        <w:jc w:val="left"/>
+      </w:pPr>
+      <w:r>
+        <w:rPr>
+          <w:rFonts w:ascii="Times New Roman" w:hAnsi="Times New Roman" w:eastAsia="宋体"/>
+          <w:b w:val="0"/>
+          <w:color w:val="000000"/>
+          <w:sz w:val="21"/>
+        </w:rPr>
+        <w:t>[5] Python ssl. https://docs.python.org/3/library/ssl.html</w:t>
       </w:r>
     </w:p>
     <w:sectPr>
@@ -5840,7 +5006,7 @@
       <w:keepLines/>
       <w:widowControl/>
       <w:spacing w:after="0" w:before="0" w:line="240" w:lineRule="auto"/>
-      <w:ind w:firstLine="0" w:left="240"/>
+      <w:ind w:left="240" w:firstLine="0"/>
       <w:jc w:val="left"/>
     </w:pPr>
     <w:rPr>

</xml_diff>